<commit_message>
Fig 2b: label both NV CH bands (2883 cm-1 CH2 lipid shoulder and 2937 cm-1 CH3) with their EV counterparts
Co-Authored-By: Claude Opus 5.5 <noreply@anthropic.com>
Claude-Session: https://claude.ai/code/session_01L8hQ8e5u5KmaH4dD9snyRw
</commit_message>
<xml_diff>
--- a/Acacia_Analysis_Report.docx
+++ b/Acacia_Analysis_Report.docx
@@ -837,7 +837,7 @@
           <wp:inline distT="0" distB="0" distL="0" distR="0">
             <wp:extent cx="5715000" cy="4124325"/>
             <wp:effectExtent t="0" r="0" b="0" l="0"/>
-            <wp:docPr id="1" name="Fig1a_EV_CaF2_vs_AgSiNW" descr="**Figure 1a.** EV Acacia on CaF₂ (grey) and on Ag/SiNWs (red), raw single spectra with band positions and classes." title="Fig1a_EV_CaF2_vs_AgSiNW"/>
+            <wp:docPr id="1" name="Fig1a_EV_CaF2_vs_AgSiNW" descr="Figure 1a. EV Acacia on CaF₂ (grey) and on Ag/SiNWs (red), raw single spectra with band positions and classes." title="Fig1a_EV_CaF2_vs_AgSiNW"/>
             <wp:cNvGraphicFramePr>
               <a:graphicFrameLocks xmlns:a="http://schemas.openxmlformats.org/drawingml/2006/main" noChangeAspect="1"/>
             </wp:cNvGraphicFramePr>
@@ -899,7 +899,7 @@
           <wp:inline distT="0" distB="0" distL="0" distR="0">
             <wp:extent cx="5715000" cy="4124325"/>
             <wp:effectExtent t="0" r="0" b="0" l="0"/>
-            <wp:docPr id="1" name="Fig1b_NV_CaF2_vs_AgSiNW" descr="**Figure 1b.** Nanovesicles Acacia on CaF₂ (grey) and on Ag/SiNWs (red), raw single spectra with band positions and classes." title="Fig1b_NV_CaF2_vs_AgSiNW"/>
+            <wp:docPr id="1" name="Fig1b_NV_CaF2_vs_AgSiNW" descr="Figure 1b. Nanovesicles Acacia on CaF₂ (grey) and on Ag/SiNWs (red), raw single spectra with band positions and classes." title="Fig1b_NV_CaF2_vs_AgSiNW"/>
             <wp:cNvGraphicFramePr>
               <a:graphicFrameLocks xmlns:a="http://schemas.openxmlformats.org/drawingml/2006/main" noChangeAspect="1"/>
             </wp:cNvGraphicFramePr>
@@ -985,7 +985,7 @@
           <wp:inline distT="0" distB="0" distL="0" distR="0">
             <wp:extent cx="5715000" cy="4371975"/>
             <wp:effectExtent t="0" r="0" b="0" l="0"/>
-            <wp:docPr id="1" name="Fig2a_MeanSD_Fingerprint" descr="**Figure 2a.** Mean ± SD SERS spectra of EV Acacia and Nanovesicles Acacia on Ag/SiNWs, 400-1790 cm⁻¹ (n = 120 each). Grey shadows mark peak shifts that are consistent at all sites." title="Fig2a_MeanSD_Fingerprint"/>
+            <wp:docPr id="1" name="Fig2a_MeanSD_Fingerprint" descr="Figure 2a. Mean ± SD SERS spectra of EV Acacia and Nanovesicles Acacia on Ag/SiNWs, 400-1790 cm⁻¹ (n = 120 each). Grey shadows mark peak shifts that are consistent at all sites." title="Fig2a_MeanSD_Fingerprint"/>
             <wp:cNvGraphicFramePr>
               <a:graphicFrameLocks xmlns:a="http://schemas.openxmlformats.org/drawingml/2006/main" noChangeAspect="1"/>
             </wp:cNvGraphicFramePr>
@@ -1047,7 +1047,7 @@
           <wp:inline distT="0" distB="0" distL="0" distR="0">
             <wp:extent cx="4381500" cy="4048125"/>
             <wp:effectExtent t="0" r="0" b="0" l="0"/>
-            <wp:docPr id="1" name="Fig2b_MeanSD_CH" descr="**Figure 2b.** Mean ± SD spectra in the CH-stretching region, 2760-3095 cm⁻¹, with the main band labelled." title="Fig2b_MeanSD_CH"/>
+            <wp:docPr id="1" name="Fig2b_MeanSD_CH" descr="Figure 2b. Mean ± SD spectra in the CH-stretching region, 2760-3095 cm⁻¹. Two bands are labelled: the CH₂ band of lipids (shoulder, located by the 2nd derivative; 2874 cm⁻¹ in EVs, 2883 cm⁻¹ and much stronger in NVs) and the main CH₃ band (2933 vs 2937 cm⁻¹). Both shifts are consistent at all sites (grey shadows)." title="Fig2b_MeanSD_CH"/>
             <wp:cNvGraphicFramePr>
               <a:graphicFrameLocks xmlns:a="http://schemas.openxmlformats.org/drawingml/2006/main" noChangeAspect="1"/>
             </wp:cNvGraphicFramePr>
@@ -1096,7 +1096,7 @@
         <w:t xml:space="preserve">Figure 2b.</w:t>
       </w:r>
       <w:r>
-        <w:t xml:space="preserve"> Mean ± SD spectra in the CH-stretching region, 2760-3095 cm⁻¹, with the main band labelled.</w:t>
+        <w:t xml:space="preserve"> Mean ± SD spectra in the CH-stretching region, 2760-3095 cm⁻¹. Two bands are labelled: the CH₂ band of lipids (shoulder, located by the 2nd derivative; 2874 cm⁻¹ in EVs, 2883 cm⁻¹ and much stronger in NVs) and the main CH₃ band (2933 vs 2937 cm⁻¹). Both shifts are consistent at all sites (grey shadows).</w:t>
       </w:r>
     </w:p>
     <w:p>
@@ -8923,7 +8923,7 @@
           <wp:inline distT="0" distB="0" distL="0" distR="0">
             <wp:extent cx="5715000" cy="4286250"/>
             <wp:effectExtent t="0" r="0" b="0" l="0"/>
-            <wp:docPr id="1" name="Fig4_Loadings_Difference" descr="**Figure 4.** (a, b) PC1 and PC2 loadings; (c, d) difference spectrum NV - EV (site means) with ±2 SE. Positive = relatively stronger in NVs. After SNV, intensities are relative, not absolute amounts." title="Fig4_Loadings_Difference"/>
+            <wp:docPr id="1" name="Fig4_Loadings_Difference" descr="Figure 4. (a, b) PC1 and PC2 loadings; (c, d) difference spectrum NV - EV (site means) with ±2 SE. Positive = relatively stronger in NVs. After SNV, intensities are relative, not absolute amounts." title="Fig4_Loadings_Difference"/>
             <wp:cNvGraphicFramePr>
               <a:graphicFrameLocks xmlns:a="http://schemas.openxmlformats.org/drawingml/2006/main" noChangeAspect="1"/>
             </wp:cNvGraphicFramePr>
@@ -9037,7 +9037,7 @@
           <wp:inline distT="0" distB="0" distL="0" distR="0">
             <wp:extent cx="5715000" cy="5143500"/>
             <wp:effectExtent t="0" r="0" b="0" l="0"/>
-            <wp:docPr id="1" name="Fig3_PCA_LDA" descr="**Figure 3.** (a, c) PCA score plots with 2-SD ellipses; (b, d) canonical variable 1 of PCA-LDA (box: quartiles and median; whiskers: 1.5 × IQR; dots: individual spectra). p: Welch’s t-test on site means (n = 6)." title="Fig3_PCA_LDA"/>
+            <wp:docPr id="1" name="Fig3_PCA_LDA" descr="Figure 3. (a, c) PCA score plots with 2-SD ellipses; (b, d) canonical variable 1 of PCA-LDA (box: quartiles and median; whiskers: 1.5 × IQR; dots: individual spectra). p: Welch’s t-test on site means (n = 6)." title="Fig3_PCA_LDA"/>
             <wp:cNvGraphicFramePr>
               <a:graphicFrameLocks xmlns:a="http://schemas.openxmlformats.org/drawingml/2006/main" noChangeAspect="1"/>
             </wp:cNvGraphicFramePr>
@@ -10971,7 +10971,7 @@
           <wp:inline distT="0" distB="0" distL="0" distR="0">
             <wp:extent cx="4953000" cy="4705350"/>
             <wp:effectExtent t="0" r="0" b="0" l="0"/>
-            <wp:docPr id="1" name="Fig5_ConfusionMatrices" descr="**Figure 5.** Cross-validated confusion matrices (rows: true group; columns: predicted group) for PCA-LDA and PLS-DA in both spectral regions." title="Fig5_ConfusionMatrices"/>
+            <wp:docPr id="1" name="Fig5_ConfusionMatrices" descr="Figure 5. Cross-validated confusion matrices (rows: true group; columns: predicted group) for PCA-LDA and PLS-DA in both spectral regions." title="Fig5_ConfusionMatrices"/>
             <wp:cNvGraphicFramePr>
               <a:graphicFrameLocks xmlns:a="http://schemas.openxmlformats.org/drawingml/2006/main" noChangeAspect="1"/>
             </wp:cNvGraphicFramePr>
@@ -11059,7 +11059,7 @@
           <wp:inline distT="0" distB="0" distL="0" distR="0">
             <wp:extent cx="5143500" cy="4000500"/>
             <wp:effectExtent t="0" r="0" b="0" l="0"/>
-            <wp:docPr id="1" name="FigS1_Permutation" descr="**Figure S1.** Cross-validated accuracies obtained with all 924 site labelings (grey) and the real accuracy (orange line)." title="FigS1_Permutation"/>
+            <wp:docPr id="1" name="FigS1_Permutation" descr="Figure S1. Cross-validated accuracies obtained with all 924 site labelings (grey) and the real accuracy (orange line)." title="FigS1_Permutation"/>
             <wp:cNvGraphicFramePr>
               <a:graphicFrameLocks xmlns:a="http://schemas.openxmlformats.org/drawingml/2006/main" noChangeAspect="1"/>
             </wp:cNvGraphicFramePr>

</xml_diff>

<commit_message>
CH band fitting (Fig S2, Table S6: Gaussian, GL sum, Lorentzian); Fig 2b labels the 2883 cm-1 CH2 band for NVs only
Co-Authored-By: Claude Opus 5.5 <noreply@anthropic.com>
Claude-Session: https://claude.ai/code/session_01L8hQ8e5u5KmaH4dD9snyRw
</commit_message>
<xml_diff>
--- a/Acacia_Analysis_Report.docx
+++ b/Acacia_Analysis_Report.docx
@@ -103,7 +103,7 @@
         <w:spacing w:after="100"/>
       </w:pPr>
       <w:r>
-        <w:t xml:space="preserve">4. Mean spectra, peak shifts and band statistics (Figure 2, Table S1)</w:t>
+        <w:t xml:space="preserve">4. Mean spectra, peak shifts, band statistics and CH band fitting (Figure 2, Table S1, Figure S2)</w:t>
       </w:r>
     </w:p>
     <w:p>
@@ -956,7 +956,7 @@
         <w:pStyle w:val="Heading1"/>
       </w:pPr>
       <w:r>
-        <w:t xml:space="preserve">4. Mean spectra, peak shifts and band statistics (Figure 2, Table S1)</w:t>
+        <w:t xml:space="preserve">4. Mean spectra, peak shifts, band statistics and CH band fitting (Figure 2, Table S1, Figure S2)</w:t>
       </w:r>
     </w:p>
     <w:p>
@@ -1047,7 +1047,7 @@
           <wp:inline distT="0" distB="0" distL="0" distR="0">
             <wp:extent cx="4381500" cy="4048125"/>
             <wp:effectExtent t="0" r="0" b="0" l="0"/>
-            <wp:docPr id="1" name="Fig2b_MeanSD_CH" descr="Figure 2b. Mean ± SD spectra in the CH-stretching region, 2760-3095 cm⁻¹. Two bands are labelled: the CH₂ band of lipids (shoulder, located by the 2nd derivative; 2874 cm⁻¹ in EVs, 2883 cm⁻¹ and much stronger in NVs) and the main CH₃ band (2933 vs 2937 cm⁻¹). Both shifts are consistent at all sites (grey shadows)." title="Fig2b_MeanSD_CH"/>
+            <wp:docPr id="1" name="Fig2b_MeanSD_CH" descr="Figure 2b. Mean ± SD spectra in the CH-stretching region, 2760-3095 cm⁻¹. Main CH₃ band: 2933 (EVs) vs 2937 cm⁻¹ (NVs), shift consistent at all sites (grey shadow). The CH₂ lipid band at 2883 cm⁻¹ (shoulder, located by the second derivative) is labelled for NVs only, where it is a distinct band." title="Fig2b_MeanSD_CH"/>
             <wp:cNvGraphicFramePr>
               <a:graphicFrameLocks xmlns:a="http://schemas.openxmlformats.org/drawingml/2006/main" noChangeAspect="1"/>
             </wp:cNvGraphicFramePr>
@@ -1096,7 +1096,15 @@
         <w:t xml:space="preserve">Figure 2b.</w:t>
       </w:r>
       <w:r>
-        <w:t xml:space="preserve"> Mean ± SD spectra in the CH-stretching region, 2760-3095 cm⁻¹. Two bands are labelled: the CH₂ band of lipids (shoulder, located by the 2nd derivative; 2874 cm⁻¹ in EVs, 2883 cm⁻¹ and much stronger in NVs) and the main CH₃ band (2933 vs 2937 cm⁻¹). Both shifts are consistent at all sites (grey shadows).</w:t>
+        <w:t xml:space="preserve"> Mean ± SD spectra in the CH-stretching region, 2760-3095 cm⁻¹. Main CH₃ band: 2933 (EVs) vs 2937 cm⁻¹ (NVs), shift consistent at all sites (grey shadow). The CH₂ lipid band at 2883 cm⁻¹ (shoulder, located by the second derivative) is labelled for NVs only, where it is a distinct band.</w:t>
+      </w:r>
+    </w:p>
+    <w:p>
+      <w:pPr>
+        <w:spacing w:after="120"/>
+      </w:pPr>
+      <w:r>
+        <w:t xml:space="preserve">The CH₂ band at about 2883 cm⁻¹ is a distinct shoulder in the NV spectrum and is therefore labelled only for NVs. In EVs this region shows only a weak, unresolved wing (second-derivative inflection at 2874 cm⁻¹); see the band fitting in section 4.4.</w:t>
       </w:r>
     </w:p>
     <w:p>
@@ -5669,6 +5677,1544 @@
     </w:p>
     <w:p>
       <w:pPr>
+        <w:pStyle w:val="Heading2"/>
+      </w:pPr>
+      <w:r>
+        <w:t xml:space="preserve">4.4 Band fitting of the CH-stretching region (Figure S2, Table S6)</w:t>
+      </w:r>
+    </w:p>
+    <w:p>
+      <w:pPr>
+        <w:spacing w:after="120"/>
+      </w:pPr>
+      <w:r>
+        <w:rPr>
+          <w:b/>
+          <w:bCs/>
+        </w:rPr>
+        <w:t xml:space="preserve">How it was done.</w:t>
+      </w:r>
+      <w:r>
+        <w:t xml:space="preserve"> The mean spectrum of each group (2780-3095 cm⁻¹, after pre-processing) was described as a straight baseline plus five bands: I (~2850 cm⁻¹, CH₂ symmetric), II (~2880, CH₂ asymmetric, lipids), III (~2935, CH₃ symmetric), IV (~2965, CH₃ asymmetric) and V (~3065, aromatic =C-H). Each band had a free height, a position within ±12 cm⁻¹ and a width (FWHM) between 12 and 60 cm⁻¹; the parameters were found by non-linear least squares. As in published band-fitting work, three line shapes were compared: Gaussian (G), Gaussian-Lorentzian sum (GL, pseudo-Voigt) and Lorentzian (L). The residual (data - fit) is shown above each panel in % of the band height.</w:t>
+      </w:r>
+    </w:p>
+    <w:p>
+      <w:pPr>
+        <w:spacing w:after="120"/>
+      </w:pPr>
+      <w:r>
+        <w:rPr>
+          <w:b/>
+          <w:bCs/>
+        </w:rPr>
+        <w:t xml:space="preserve">Important.</w:t>
+      </w:r>
+      <w:r>
+        <w:t xml:space="preserve"> Overlapping bands have no unique decomposition: the % areas depend on the line shape and the constraints. Conclusions are therefore drawn only from what is the same for all three line shapes.</w:t>
+      </w:r>
+    </w:p>
+    <w:tbl>
+      <w:tblPr>
+        <w:tblW w:type="dxa" w:w="9026"/>
+        <w:tblBorders>
+          <w:top w:val="single" w:color="auto" w:sz="4"/>
+          <w:left w:val="single" w:color="auto" w:sz="4"/>
+          <w:bottom w:val="single" w:color="auto" w:sz="4"/>
+          <w:right w:val="single" w:color="auto" w:sz="4"/>
+          <w:insideH w:val="single" w:color="auto" w:sz="4"/>
+          <w:insideV w:val="single" w:color="auto" w:sz="4"/>
+        </w:tblBorders>
+      </w:tblPr>
+      <w:tblGrid>
+        <w:gridCol w:w="900"/>
+        <w:gridCol w:w="2200"/>
+        <w:gridCol w:w="1300"/>
+        <w:gridCol w:w="1300"/>
+        <w:gridCol w:w="1200"/>
+        <w:gridCol w:w="900"/>
+        <w:gridCol w:w="1226"/>
+      </w:tblGrid>
+      <w:tr>
+        <w:trPr>
+          <w:tblHeader/>
+        </w:trPr>
+        <w:tc>
+          <w:tcPr>
+            <w:tcW w:type="dxa" w:w="900"/>
+            <w:tcBorders>
+              <w:top w:val="single" w:color="BFBFBF" w:sz="4"/>
+              <w:left w:val="single" w:color="BFBFBF" w:sz="4"/>
+              <w:bottom w:val="single" w:color="BFBFBF" w:sz="4"/>
+              <w:right w:val="single" w:color="BFBFBF" w:sz="4"/>
+            </w:tcBorders>
+            <w:shd w:fill="D9E2F3" w:color="auto" w:val="clear"/>
+            <w:tcMar>
+              <w:top w:type="dxa" w:w="60"/>
+              <w:left w:type="dxa" w:w="100"/>
+              <w:bottom w:type="dxa" w:w="60"/>
+              <w:right w:type="dxa" w:w="100"/>
+            </w:tcMar>
+          </w:tcPr>
+          <w:p>
+            <w:r>
+              <w:rPr>
+                <w:b/>
+                <w:bCs/>
+                <w:sz w:val="18"/>
+                <w:szCs w:val="18"/>
+              </w:rPr>
+              <w:t xml:space="preserve">Group</w:t>
+            </w:r>
+          </w:p>
+        </w:tc>
+        <w:tc>
+          <w:tcPr>
+            <w:tcW w:type="dxa" w:w="2200"/>
+            <w:tcBorders>
+              <w:top w:val="single" w:color="BFBFBF" w:sz="4"/>
+              <w:left w:val="single" w:color="BFBFBF" w:sz="4"/>
+              <w:bottom w:val="single" w:color="BFBFBF" w:sz="4"/>
+              <w:right w:val="single" w:color="BFBFBF" w:sz="4"/>
+            </w:tcBorders>
+            <w:shd w:fill="D9E2F3" w:color="auto" w:val="clear"/>
+            <w:tcMar>
+              <w:top w:type="dxa" w:w="60"/>
+              <w:left w:type="dxa" w:w="100"/>
+              <w:bottom w:type="dxa" w:w="60"/>
+              <w:right w:type="dxa" w:w="100"/>
+            </w:tcMar>
+          </w:tcPr>
+          <w:p>
+            <w:r>
+              <w:rPr>
+                <w:b/>
+                <w:bCs/>
+                <w:sz w:val="18"/>
+                <w:szCs w:val="18"/>
+              </w:rPr>
+              <w:t xml:space="preserve">Line shape</w:t>
+            </w:r>
+          </w:p>
+        </w:tc>
+        <w:tc>
+          <w:tcPr>
+            <w:tcW w:type="dxa" w:w="1300"/>
+            <w:tcBorders>
+              <w:top w:val="single" w:color="BFBFBF" w:sz="4"/>
+              <w:left w:val="single" w:color="BFBFBF" w:sz="4"/>
+              <w:bottom w:val="single" w:color="BFBFBF" w:sz="4"/>
+              <w:right w:val="single" w:color="BFBFBF" w:sz="4"/>
+            </w:tcBorders>
+            <w:shd w:fill="D9E2F3" w:color="auto" w:val="clear"/>
+            <w:tcMar>
+              <w:top w:type="dxa" w:w="60"/>
+              <w:left w:type="dxa" w:w="100"/>
+              <w:bottom w:type="dxa" w:w="60"/>
+              <w:right w:type="dxa" w:w="100"/>
+            </w:tcMar>
+          </w:tcPr>
+          <w:p>
+            <w:r>
+              <w:rPr>
+                <w:b/>
+                <w:bCs/>
+                <w:sz w:val="18"/>
+                <w:szCs w:val="18"/>
+              </w:rPr>
+              <w:t xml:space="preserve">Band II position</w:t>
+            </w:r>
+          </w:p>
+        </w:tc>
+        <w:tc>
+          <w:tcPr>
+            <w:tcW w:type="dxa" w:w="1300"/>
+            <w:tcBorders>
+              <w:top w:val="single" w:color="BFBFBF" w:sz="4"/>
+              <w:left w:val="single" w:color="BFBFBF" w:sz="4"/>
+              <w:bottom w:val="single" w:color="BFBFBF" w:sz="4"/>
+              <w:right w:val="single" w:color="BFBFBF" w:sz="4"/>
+            </w:tcBorders>
+            <w:shd w:fill="D9E2F3" w:color="auto" w:val="clear"/>
+            <w:tcMar>
+              <w:top w:type="dxa" w:w="60"/>
+              <w:left w:type="dxa" w:w="100"/>
+              <w:bottom w:type="dxa" w:w="60"/>
+              <w:right w:type="dxa" w:w="100"/>
+            </w:tcMar>
+          </w:tcPr>
+          <w:p>
+            <w:r>
+              <w:rPr>
+                <w:b/>
+                <w:bCs/>
+                <w:sz w:val="18"/>
+                <w:szCs w:val="18"/>
+              </w:rPr>
+              <w:t xml:space="preserve">Band II FWHM</w:t>
+            </w:r>
+          </w:p>
+        </w:tc>
+        <w:tc>
+          <w:tcPr>
+            <w:tcW w:type="dxa" w:w="1200"/>
+            <w:tcBorders>
+              <w:top w:val="single" w:color="BFBFBF" w:sz="4"/>
+              <w:left w:val="single" w:color="BFBFBF" w:sz="4"/>
+              <w:bottom w:val="single" w:color="BFBFBF" w:sz="4"/>
+              <w:right w:val="single" w:color="BFBFBF" w:sz="4"/>
+            </w:tcBorders>
+            <w:shd w:fill="D9E2F3" w:color="auto" w:val="clear"/>
+            <w:tcMar>
+              <w:top w:type="dxa" w:w="60"/>
+              <w:left w:type="dxa" w:w="100"/>
+              <w:bottom w:type="dxa" w:w="60"/>
+              <w:right w:type="dxa" w:w="100"/>
+            </w:tcMar>
+          </w:tcPr>
+          <w:p>
+            <w:r>
+              <w:rPr>
+                <w:b/>
+                <w:bCs/>
+                <w:sz w:val="18"/>
+                <w:szCs w:val="18"/>
+              </w:rPr>
+              <w:t xml:space="preserve">Band II area (%)</w:t>
+            </w:r>
+          </w:p>
+        </w:tc>
+        <w:tc>
+          <w:tcPr>
+            <w:tcW w:type="dxa" w:w="900"/>
+            <w:tcBorders>
+              <w:top w:val="single" w:color="BFBFBF" w:sz="4"/>
+              <w:left w:val="single" w:color="BFBFBF" w:sz="4"/>
+              <w:bottom w:val="single" w:color="BFBFBF" w:sz="4"/>
+              <w:right w:val="single" w:color="BFBFBF" w:sz="4"/>
+            </w:tcBorders>
+            <w:shd w:fill="D9E2F3" w:color="auto" w:val="clear"/>
+            <w:tcMar>
+              <w:top w:type="dxa" w:w="60"/>
+              <w:left w:type="dxa" w:w="100"/>
+              <w:bottom w:type="dxa" w:w="60"/>
+              <w:right w:type="dxa" w:w="100"/>
+            </w:tcMar>
+          </w:tcPr>
+          <w:p>
+            <w:r>
+              <w:rPr>
+                <w:b/>
+                <w:bCs/>
+                <w:sz w:val="18"/>
+                <w:szCs w:val="18"/>
+              </w:rPr>
+              <w:t xml:space="preserve">R²</w:t>
+            </w:r>
+          </w:p>
+        </w:tc>
+        <w:tc>
+          <w:tcPr>
+            <w:tcW w:type="dxa" w:w="1226"/>
+            <w:tcBorders>
+              <w:top w:val="single" w:color="BFBFBF" w:sz="4"/>
+              <w:left w:val="single" w:color="BFBFBF" w:sz="4"/>
+              <w:bottom w:val="single" w:color="BFBFBF" w:sz="4"/>
+              <w:right w:val="single" w:color="BFBFBF" w:sz="4"/>
+            </w:tcBorders>
+            <w:shd w:fill="D9E2F3" w:color="auto" w:val="clear"/>
+            <w:tcMar>
+              <w:top w:type="dxa" w:w="60"/>
+              <w:left w:type="dxa" w:w="100"/>
+              <w:bottom w:type="dxa" w:w="60"/>
+              <w:right w:type="dxa" w:w="100"/>
+            </w:tcMar>
+          </w:tcPr>
+          <w:p>
+            <w:r>
+              <w:rPr>
+                <w:b/>
+                <w:bCs/>
+                <w:sz w:val="18"/>
+                <w:szCs w:val="18"/>
+              </w:rPr>
+              <w:t xml:space="preserve">Max |residual|</w:t>
+            </w:r>
+          </w:p>
+        </w:tc>
+      </w:tr>
+      <w:tr>
+        <w:tc>
+          <w:tcPr>
+            <w:tcW w:type="dxa" w:w="900"/>
+            <w:tcBorders>
+              <w:top w:val="single" w:color="BFBFBF" w:sz="4"/>
+              <w:left w:val="single" w:color="BFBFBF" w:sz="4"/>
+              <w:bottom w:val="single" w:color="BFBFBF" w:sz="4"/>
+              <w:right w:val="single" w:color="BFBFBF" w:sz="4"/>
+            </w:tcBorders>
+            <w:tcMar>
+              <w:top w:type="dxa" w:w="60"/>
+              <w:left w:type="dxa" w:w="100"/>
+              <w:bottom w:type="dxa" w:w="60"/>
+              <w:right w:type="dxa" w:w="100"/>
+            </w:tcMar>
+          </w:tcPr>
+          <w:p>
+            <w:r>
+              <w:rPr>
+                <w:b w:val="false"/>
+                <w:bCs w:val="false"/>
+                <w:sz w:val="18"/>
+                <w:szCs w:val="18"/>
+              </w:rPr>
+              <w:t xml:space="preserve">EVs</w:t>
+            </w:r>
+          </w:p>
+        </w:tc>
+        <w:tc>
+          <w:tcPr>
+            <w:tcW w:type="dxa" w:w="2200"/>
+            <w:tcBorders>
+              <w:top w:val="single" w:color="BFBFBF" w:sz="4"/>
+              <w:left w:val="single" w:color="BFBFBF" w:sz="4"/>
+              <w:bottom w:val="single" w:color="BFBFBF" w:sz="4"/>
+              <w:right w:val="single" w:color="BFBFBF" w:sz="4"/>
+            </w:tcBorders>
+            <w:tcMar>
+              <w:top w:type="dxa" w:w="60"/>
+              <w:left w:type="dxa" w:w="100"/>
+              <w:bottom w:type="dxa" w:w="60"/>
+              <w:right w:type="dxa" w:w="100"/>
+            </w:tcMar>
+          </w:tcPr>
+          <w:p>
+            <w:r>
+              <w:rPr>
+                <w:b w:val="false"/>
+                <w:bCs w:val="false"/>
+                <w:sz w:val="18"/>
+                <w:szCs w:val="18"/>
+              </w:rPr>
+              <w:t xml:space="preserve">Gaussian</w:t>
+            </w:r>
+          </w:p>
+        </w:tc>
+        <w:tc>
+          <w:tcPr>
+            <w:tcW w:type="dxa" w:w="1300"/>
+            <w:tcBorders>
+              <w:top w:val="single" w:color="BFBFBF" w:sz="4"/>
+              <w:left w:val="single" w:color="BFBFBF" w:sz="4"/>
+              <w:bottom w:val="single" w:color="BFBFBF" w:sz="4"/>
+              <w:right w:val="single" w:color="BFBFBF" w:sz="4"/>
+            </w:tcBorders>
+            <w:tcMar>
+              <w:top w:type="dxa" w:w="60"/>
+              <w:left w:type="dxa" w:w="100"/>
+              <w:bottom w:type="dxa" w:w="60"/>
+              <w:right w:type="dxa" w:w="100"/>
+            </w:tcMar>
+          </w:tcPr>
+          <w:p>
+            <w:r>
+              <w:rPr>
+                <w:b w:val="false"/>
+                <w:bCs w:val="false"/>
+                <w:sz w:val="18"/>
+                <w:szCs w:val="18"/>
+              </w:rPr>
+              <w:t xml:space="preserve">2886.9</w:t>
+            </w:r>
+          </w:p>
+        </w:tc>
+        <w:tc>
+          <w:tcPr>
+            <w:tcW w:type="dxa" w:w="1300"/>
+            <w:tcBorders>
+              <w:top w:val="single" w:color="BFBFBF" w:sz="4"/>
+              <w:left w:val="single" w:color="BFBFBF" w:sz="4"/>
+              <w:bottom w:val="single" w:color="BFBFBF" w:sz="4"/>
+              <w:right w:val="single" w:color="BFBFBF" w:sz="4"/>
+            </w:tcBorders>
+            <w:tcMar>
+              <w:top w:type="dxa" w:w="60"/>
+              <w:left w:type="dxa" w:w="100"/>
+              <w:bottom w:type="dxa" w:w="60"/>
+              <w:right w:type="dxa" w:w="100"/>
+            </w:tcMar>
+          </w:tcPr>
+          <w:p>
+            <w:r>
+              <w:rPr>
+                <w:b w:val="false"/>
+                <w:bCs w:val="false"/>
+                <w:sz w:val="18"/>
+                <w:szCs w:val="18"/>
+              </w:rPr>
+              <w:t xml:space="preserve">60.0 (limit)</w:t>
+            </w:r>
+          </w:p>
+        </w:tc>
+        <w:tc>
+          <w:tcPr>
+            <w:tcW w:type="dxa" w:w="1200"/>
+            <w:tcBorders>
+              <w:top w:val="single" w:color="BFBFBF" w:sz="4"/>
+              <w:left w:val="single" w:color="BFBFBF" w:sz="4"/>
+              <w:bottom w:val="single" w:color="BFBFBF" w:sz="4"/>
+              <w:right w:val="single" w:color="BFBFBF" w:sz="4"/>
+            </w:tcBorders>
+            <w:tcMar>
+              <w:top w:type="dxa" w:w="60"/>
+              <w:left w:type="dxa" w:w="100"/>
+              <w:bottom w:type="dxa" w:w="60"/>
+              <w:right w:type="dxa" w:w="100"/>
+            </w:tcMar>
+          </w:tcPr>
+          <w:p>
+            <w:r>
+              <w:rPr>
+                <w:b w:val="false"/>
+                <w:bCs w:val="false"/>
+                <w:sz w:val="18"/>
+                <w:szCs w:val="18"/>
+              </w:rPr>
+              <w:t xml:space="preserve">23.0</w:t>
+            </w:r>
+          </w:p>
+        </w:tc>
+        <w:tc>
+          <w:tcPr>
+            <w:tcW w:type="dxa" w:w="900"/>
+            <w:tcBorders>
+              <w:top w:val="single" w:color="BFBFBF" w:sz="4"/>
+              <w:left w:val="single" w:color="BFBFBF" w:sz="4"/>
+              <w:bottom w:val="single" w:color="BFBFBF" w:sz="4"/>
+              <w:right w:val="single" w:color="BFBFBF" w:sz="4"/>
+            </w:tcBorders>
+            <w:tcMar>
+              <w:top w:type="dxa" w:w="60"/>
+              <w:left w:type="dxa" w:w="100"/>
+              <w:bottom w:type="dxa" w:w="60"/>
+              <w:right w:type="dxa" w:w="100"/>
+            </w:tcMar>
+          </w:tcPr>
+          <w:p>
+            <w:r>
+              <w:rPr>
+                <w:b w:val="false"/>
+                <w:bCs w:val="false"/>
+                <w:sz w:val="18"/>
+                <w:szCs w:val="18"/>
+              </w:rPr>
+              <w:t xml:space="preserve">0.9973</w:t>
+            </w:r>
+          </w:p>
+        </w:tc>
+        <w:tc>
+          <w:tcPr>
+            <w:tcW w:type="dxa" w:w="1226"/>
+            <w:tcBorders>
+              <w:top w:val="single" w:color="BFBFBF" w:sz="4"/>
+              <w:left w:val="single" w:color="BFBFBF" w:sz="4"/>
+              <w:bottom w:val="single" w:color="BFBFBF" w:sz="4"/>
+              <w:right w:val="single" w:color="BFBFBF" w:sz="4"/>
+            </w:tcBorders>
+            <w:tcMar>
+              <w:top w:type="dxa" w:w="60"/>
+              <w:left w:type="dxa" w:w="100"/>
+              <w:bottom w:type="dxa" w:w="60"/>
+              <w:right w:type="dxa" w:w="100"/>
+            </w:tcMar>
+          </w:tcPr>
+          <w:p>
+            <w:r>
+              <w:rPr>
+                <w:b w:val="false"/>
+                <w:bCs w:val="false"/>
+                <w:sz w:val="18"/>
+                <w:szCs w:val="18"/>
+              </w:rPr>
+              <w:t xml:space="preserve">3.8 %</w:t>
+            </w:r>
+          </w:p>
+        </w:tc>
+      </w:tr>
+      <w:tr>
+        <w:tc>
+          <w:tcPr>
+            <w:tcW w:type="dxa" w:w="900"/>
+            <w:tcBorders>
+              <w:top w:val="single" w:color="BFBFBF" w:sz="4"/>
+              <w:left w:val="single" w:color="BFBFBF" w:sz="4"/>
+              <w:bottom w:val="single" w:color="BFBFBF" w:sz="4"/>
+              <w:right w:val="single" w:color="BFBFBF" w:sz="4"/>
+            </w:tcBorders>
+            <w:tcMar>
+              <w:top w:type="dxa" w:w="60"/>
+              <w:left w:type="dxa" w:w="100"/>
+              <w:bottom w:type="dxa" w:w="60"/>
+              <w:right w:type="dxa" w:w="100"/>
+            </w:tcMar>
+          </w:tcPr>
+          <w:p>
+            <w:r>
+              <w:rPr>
+                <w:b w:val="false"/>
+                <w:bCs w:val="false"/>
+                <w:sz w:val="18"/>
+                <w:szCs w:val="18"/>
+              </w:rPr>
+              <w:t xml:space="preserve">EVs</w:t>
+            </w:r>
+          </w:p>
+        </w:tc>
+        <w:tc>
+          <w:tcPr>
+            <w:tcW w:type="dxa" w:w="2200"/>
+            <w:tcBorders>
+              <w:top w:val="single" w:color="BFBFBF" w:sz="4"/>
+              <w:left w:val="single" w:color="BFBFBF" w:sz="4"/>
+              <w:bottom w:val="single" w:color="BFBFBF" w:sz="4"/>
+              <w:right w:val="single" w:color="BFBFBF" w:sz="4"/>
+            </w:tcBorders>
+            <w:tcMar>
+              <w:top w:type="dxa" w:w="60"/>
+              <w:left w:type="dxa" w:w="100"/>
+              <w:bottom w:type="dxa" w:w="60"/>
+              <w:right w:type="dxa" w:w="100"/>
+            </w:tcMar>
+          </w:tcPr>
+          <w:p>
+            <w:r>
+              <w:rPr>
+                <w:b w:val="false"/>
+                <w:bCs w:val="false"/>
+                <w:sz w:val="18"/>
+                <w:szCs w:val="18"/>
+              </w:rPr>
+              <w:t xml:space="preserve">Gaussian-Lorentzian sum</w:t>
+            </w:r>
+          </w:p>
+        </w:tc>
+        <w:tc>
+          <w:tcPr>
+            <w:tcW w:type="dxa" w:w="1300"/>
+            <w:tcBorders>
+              <w:top w:val="single" w:color="BFBFBF" w:sz="4"/>
+              <w:left w:val="single" w:color="BFBFBF" w:sz="4"/>
+              <w:bottom w:val="single" w:color="BFBFBF" w:sz="4"/>
+              <w:right w:val="single" w:color="BFBFBF" w:sz="4"/>
+            </w:tcBorders>
+            <w:tcMar>
+              <w:top w:type="dxa" w:w="60"/>
+              <w:left w:type="dxa" w:w="100"/>
+              <w:bottom w:type="dxa" w:w="60"/>
+              <w:right w:type="dxa" w:w="100"/>
+            </w:tcMar>
+          </w:tcPr>
+          <w:p>
+            <w:r>
+              <w:rPr>
+                <w:b w:val="false"/>
+                <w:bCs w:val="false"/>
+                <w:sz w:val="18"/>
+                <w:szCs w:val="18"/>
+              </w:rPr>
+              <w:t xml:space="preserve">2880.8</w:t>
+            </w:r>
+          </w:p>
+        </w:tc>
+        <w:tc>
+          <w:tcPr>
+            <w:tcW w:type="dxa" w:w="1300"/>
+            <w:tcBorders>
+              <w:top w:val="single" w:color="BFBFBF" w:sz="4"/>
+              <w:left w:val="single" w:color="BFBFBF" w:sz="4"/>
+              <w:bottom w:val="single" w:color="BFBFBF" w:sz="4"/>
+              <w:right w:val="single" w:color="BFBFBF" w:sz="4"/>
+            </w:tcBorders>
+            <w:tcMar>
+              <w:top w:type="dxa" w:w="60"/>
+              <w:left w:type="dxa" w:w="100"/>
+              <w:bottom w:type="dxa" w:w="60"/>
+              <w:right w:type="dxa" w:w="100"/>
+            </w:tcMar>
+          </w:tcPr>
+          <w:p>
+            <w:r>
+              <w:rPr>
+                <w:b w:val="false"/>
+                <w:bCs w:val="false"/>
+                <w:sz w:val="18"/>
+                <w:szCs w:val="18"/>
+              </w:rPr>
+              <w:t xml:space="preserve">60.0 (limit)</w:t>
+            </w:r>
+          </w:p>
+        </w:tc>
+        <w:tc>
+          <w:tcPr>
+            <w:tcW w:type="dxa" w:w="1200"/>
+            <w:tcBorders>
+              <w:top w:val="single" w:color="BFBFBF" w:sz="4"/>
+              <w:left w:val="single" w:color="BFBFBF" w:sz="4"/>
+              <w:bottom w:val="single" w:color="BFBFBF" w:sz="4"/>
+              <w:right w:val="single" w:color="BFBFBF" w:sz="4"/>
+            </w:tcBorders>
+            <w:tcMar>
+              <w:top w:type="dxa" w:w="60"/>
+              <w:left w:type="dxa" w:w="100"/>
+              <w:bottom w:type="dxa" w:w="60"/>
+              <w:right w:type="dxa" w:w="100"/>
+            </w:tcMar>
+          </w:tcPr>
+          <w:p>
+            <w:r>
+              <w:rPr>
+                <w:b w:val="false"/>
+                <w:bCs w:val="false"/>
+                <w:sz w:val="18"/>
+                <w:szCs w:val="18"/>
+              </w:rPr>
+              <w:t xml:space="preserve">15.9</w:t>
+            </w:r>
+          </w:p>
+        </w:tc>
+        <w:tc>
+          <w:tcPr>
+            <w:tcW w:type="dxa" w:w="900"/>
+            <w:tcBorders>
+              <w:top w:val="single" w:color="BFBFBF" w:sz="4"/>
+              <w:left w:val="single" w:color="BFBFBF" w:sz="4"/>
+              <w:bottom w:val="single" w:color="BFBFBF" w:sz="4"/>
+              <w:right w:val="single" w:color="BFBFBF" w:sz="4"/>
+            </w:tcBorders>
+            <w:tcMar>
+              <w:top w:type="dxa" w:w="60"/>
+              <w:left w:type="dxa" w:w="100"/>
+              <w:bottom w:type="dxa" w:w="60"/>
+              <w:right w:type="dxa" w:w="100"/>
+            </w:tcMar>
+          </w:tcPr>
+          <w:p>
+            <w:r>
+              <w:rPr>
+                <w:b w:val="false"/>
+                <w:bCs w:val="false"/>
+                <w:sz w:val="18"/>
+                <w:szCs w:val="18"/>
+              </w:rPr>
+              <w:t xml:space="preserve">0.9978</w:t>
+            </w:r>
+          </w:p>
+        </w:tc>
+        <w:tc>
+          <w:tcPr>
+            <w:tcW w:type="dxa" w:w="1226"/>
+            <w:tcBorders>
+              <w:top w:val="single" w:color="BFBFBF" w:sz="4"/>
+              <w:left w:val="single" w:color="BFBFBF" w:sz="4"/>
+              <w:bottom w:val="single" w:color="BFBFBF" w:sz="4"/>
+              <w:right w:val="single" w:color="BFBFBF" w:sz="4"/>
+            </w:tcBorders>
+            <w:tcMar>
+              <w:top w:type="dxa" w:w="60"/>
+              <w:left w:type="dxa" w:w="100"/>
+              <w:bottom w:type="dxa" w:w="60"/>
+              <w:right w:type="dxa" w:w="100"/>
+            </w:tcMar>
+          </w:tcPr>
+          <w:p>
+            <w:r>
+              <w:rPr>
+                <w:b w:val="false"/>
+                <w:bCs w:val="false"/>
+                <w:sz w:val="18"/>
+                <w:szCs w:val="18"/>
+              </w:rPr>
+              <w:t xml:space="preserve">2.9 %</w:t>
+            </w:r>
+          </w:p>
+        </w:tc>
+      </w:tr>
+      <w:tr>
+        <w:tc>
+          <w:tcPr>
+            <w:tcW w:type="dxa" w:w="900"/>
+            <w:tcBorders>
+              <w:top w:val="single" w:color="BFBFBF" w:sz="4"/>
+              <w:left w:val="single" w:color="BFBFBF" w:sz="4"/>
+              <w:bottom w:val="single" w:color="BFBFBF" w:sz="4"/>
+              <w:right w:val="single" w:color="BFBFBF" w:sz="4"/>
+            </w:tcBorders>
+            <w:tcMar>
+              <w:top w:type="dxa" w:w="60"/>
+              <w:left w:type="dxa" w:w="100"/>
+              <w:bottom w:type="dxa" w:w="60"/>
+              <w:right w:type="dxa" w:w="100"/>
+            </w:tcMar>
+          </w:tcPr>
+          <w:p>
+            <w:r>
+              <w:rPr>
+                <w:b w:val="false"/>
+                <w:bCs w:val="false"/>
+                <w:sz w:val="18"/>
+                <w:szCs w:val="18"/>
+              </w:rPr>
+              <w:t xml:space="preserve">EVs</w:t>
+            </w:r>
+          </w:p>
+        </w:tc>
+        <w:tc>
+          <w:tcPr>
+            <w:tcW w:type="dxa" w:w="2200"/>
+            <w:tcBorders>
+              <w:top w:val="single" w:color="BFBFBF" w:sz="4"/>
+              <w:left w:val="single" w:color="BFBFBF" w:sz="4"/>
+              <w:bottom w:val="single" w:color="BFBFBF" w:sz="4"/>
+              <w:right w:val="single" w:color="BFBFBF" w:sz="4"/>
+            </w:tcBorders>
+            <w:tcMar>
+              <w:top w:type="dxa" w:w="60"/>
+              <w:left w:type="dxa" w:w="100"/>
+              <w:bottom w:type="dxa" w:w="60"/>
+              <w:right w:type="dxa" w:w="100"/>
+            </w:tcMar>
+          </w:tcPr>
+          <w:p>
+            <w:r>
+              <w:rPr>
+                <w:b w:val="false"/>
+                <w:bCs w:val="false"/>
+                <w:sz w:val="18"/>
+                <w:szCs w:val="18"/>
+              </w:rPr>
+              <w:t xml:space="preserve">Lorentzian</w:t>
+            </w:r>
+          </w:p>
+        </w:tc>
+        <w:tc>
+          <w:tcPr>
+            <w:tcW w:type="dxa" w:w="1300"/>
+            <w:tcBorders>
+              <w:top w:val="single" w:color="BFBFBF" w:sz="4"/>
+              <w:left w:val="single" w:color="BFBFBF" w:sz="4"/>
+              <w:bottom w:val="single" w:color="BFBFBF" w:sz="4"/>
+              <w:right w:val="single" w:color="BFBFBF" w:sz="4"/>
+            </w:tcBorders>
+            <w:tcMar>
+              <w:top w:type="dxa" w:w="60"/>
+              <w:left w:type="dxa" w:w="100"/>
+              <w:bottom w:type="dxa" w:w="60"/>
+              <w:right w:type="dxa" w:w="100"/>
+            </w:tcMar>
+          </w:tcPr>
+          <w:p>
+            <w:r>
+              <w:rPr>
+                <w:b w:val="false"/>
+                <w:bCs w:val="false"/>
+                <w:sz w:val="18"/>
+                <w:szCs w:val="18"/>
+              </w:rPr>
+              <w:t xml:space="preserve">2875.2</w:t>
+            </w:r>
+          </w:p>
+        </w:tc>
+        <w:tc>
+          <w:tcPr>
+            <w:tcW w:type="dxa" w:w="1300"/>
+            <w:tcBorders>
+              <w:top w:val="single" w:color="BFBFBF" w:sz="4"/>
+              <w:left w:val="single" w:color="BFBFBF" w:sz="4"/>
+              <w:bottom w:val="single" w:color="BFBFBF" w:sz="4"/>
+              <w:right w:val="single" w:color="BFBFBF" w:sz="4"/>
+            </w:tcBorders>
+            <w:tcMar>
+              <w:top w:type="dxa" w:w="60"/>
+              <w:left w:type="dxa" w:w="100"/>
+              <w:bottom w:type="dxa" w:w="60"/>
+              <w:right w:type="dxa" w:w="100"/>
+            </w:tcMar>
+          </w:tcPr>
+          <w:p>
+            <w:r>
+              <w:rPr>
+                <w:b w:val="false"/>
+                <w:bCs w:val="false"/>
+                <w:sz w:val="18"/>
+                <w:szCs w:val="18"/>
+              </w:rPr>
+              <w:t xml:space="preserve">60.0 (limit)</w:t>
+            </w:r>
+          </w:p>
+        </w:tc>
+        <w:tc>
+          <w:tcPr>
+            <w:tcW w:type="dxa" w:w="1200"/>
+            <w:tcBorders>
+              <w:top w:val="single" w:color="BFBFBF" w:sz="4"/>
+              <w:left w:val="single" w:color="BFBFBF" w:sz="4"/>
+              <w:bottom w:val="single" w:color="BFBFBF" w:sz="4"/>
+              <w:right w:val="single" w:color="BFBFBF" w:sz="4"/>
+            </w:tcBorders>
+            <w:tcMar>
+              <w:top w:type="dxa" w:w="60"/>
+              <w:left w:type="dxa" w:w="100"/>
+              <w:bottom w:type="dxa" w:w="60"/>
+              <w:right w:type="dxa" w:w="100"/>
+            </w:tcMar>
+          </w:tcPr>
+          <w:p>
+            <w:r>
+              <w:rPr>
+                <w:b w:val="false"/>
+                <w:bCs w:val="false"/>
+                <w:sz w:val="18"/>
+                <w:szCs w:val="18"/>
+              </w:rPr>
+              <w:t xml:space="preserve">10.2</w:t>
+            </w:r>
+          </w:p>
+        </w:tc>
+        <w:tc>
+          <w:tcPr>
+            <w:tcW w:type="dxa" w:w="900"/>
+            <w:tcBorders>
+              <w:top w:val="single" w:color="BFBFBF" w:sz="4"/>
+              <w:left w:val="single" w:color="BFBFBF" w:sz="4"/>
+              <w:bottom w:val="single" w:color="BFBFBF" w:sz="4"/>
+              <w:right w:val="single" w:color="BFBFBF" w:sz="4"/>
+            </w:tcBorders>
+            <w:tcMar>
+              <w:top w:type="dxa" w:w="60"/>
+              <w:left w:type="dxa" w:w="100"/>
+              <w:bottom w:type="dxa" w:w="60"/>
+              <w:right w:type="dxa" w:w="100"/>
+            </w:tcMar>
+          </w:tcPr>
+          <w:p>
+            <w:r>
+              <w:rPr>
+                <w:b w:val="false"/>
+                <w:bCs w:val="false"/>
+                <w:sz w:val="18"/>
+                <w:szCs w:val="18"/>
+              </w:rPr>
+              <w:t xml:space="preserve">0.9977</w:t>
+            </w:r>
+          </w:p>
+        </w:tc>
+        <w:tc>
+          <w:tcPr>
+            <w:tcW w:type="dxa" w:w="1226"/>
+            <w:tcBorders>
+              <w:top w:val="single" w:color="BFBFBF" w:sz="4"/>
+              <w:left w:val="single" w:color="BFBFBF" w:sz="4"/>
+              <w:bottom w:val="single" w:color="BFBFBF" w:sz="4"/>
+              <w:right w:val="single" w:color="BFBFBF" w:sz="4"/>
+            </w:tcBorders>
+            <w:tcMar>
+              <w:top w:type="dxa" w:w="60"/>
+              <w:left w:type="dxa" w:w="100"/>
+              <w:bottom w:type="dxa" w:w="60"/>
+              <w:right w:type="dxa" w:w="100"/>
+            </w:tcMar>
+          </w:tcPr>
+          <w:p>
+            <w:r>
+              <w:rPr>
+                <w:b w:val="false"/>
+                <w:bCs w:val="false"/>
+                <w:sz w:val="18"/>
+                <w:szCs w:val="18"/>
+              </w:rPr>
+              <w:t xml:space="preserve">3.0 %</w:t>
+            </w:r>
+          </w:p>
+        </w:tc>
+      </w:tr>
+      <w:tr>
+        <w:tc>
+          <w:tcPr>
+            <w:tcW w:type="dxa" w:w="900"/>
+            <w:tcBorders>
+              <w:top w:val="single" w:color="BFBFBF" w:sz="4"/>
+              <w:left w:val="single" w:color="BFBFBF" w:sz="4"/>
+              <w:bottom w:val="single" w:color="BFBFBF" w:sz="4"/>
+              <w:right w:val="single" w:color="BFBFBF" w:sz="4"/>
+            </w:tcBorders>
+            <w:tcMar>
+              <w:top w:type="dxa" w:w="60"/>
+              <w:left w:type="dxa" w:w="100"/>
+              <w:bottom w:type="dxa" w:w="60"/>
+              <w:right w:type="dxa" w:w="100"/>
+            </w:tcMar>
+          </w:tcPr>
+          <w:p>
+            <w:r>
+              <w:rPr>
+                <w:b w:val="false"/>
+                <w:bCs w:val="false"/>
+                <w:sz w:val="18"/>
+                <w:szCs w:val="18"/>
+              </w:rPr>
+              <w:t xml:space="preserve">NVs</w:t>
+            </w:r>
+          </w:p>
+        </w:tc>
+        <w:tc>
+          <w:tcPr>
+            <w:tcW w:type="dxa" w:w="2200"/>
+            <w:tcBorders>
+              <w:top w:val="single" w:color="BFBFBF" w:sz="4"/>
+              <w:left w:val="single" w:color="BFBFBF" w:sz="4"/>
+              <w:bottom w:val="single" w:color="BFBFBF" w:sz="4"/>
+              <w:right w:val="single" w:color="BFBFBF" w:sz="4"/>
+            </w:tcBorders>
+            <w:tcMar>
+              <w:top w:type="dxa" w:w="60"/>
+              <w:left w:type="dxa" w:w="100"/>
+              <w:bottom w:type="dxa" w:w="60"/>
+              <w:right w:type="dxa" w:w="100"/>
+            </w:tcMar>
+          </w:tcPr>
+          <w:p>
+            <w:r>
+              <w:rPr>
+                <w:b w:val="false"/>
+                <w:bCs w:val="false"/>
+                <w:sz w:val="18"/>
+                <w:szCs w:val="18"/>
+              </w:rPr>
+              <w:t xml:space="preserve">Gaussian</w:t>
+            </w:r>
+          </w:p>
+        </w:tc>
+        <w:tc>
+          <w:tcPr>
+            <w:tcW w:type="dxa" w:w="1300"/>
+            <w:tcBorders>
+              <w:top w:val="single" w:color="BFBFBF" w:sz="4"/>
+              <w:left w:val="single" w:color="BFBFBF" w:sz="4"/>
+              <w:bottom w:val="single" w:color="BFBFBF" w:sz="4"/>
+              <w:right w:val="single" w:color="BFBFBF" w:sz="4"/>
+            </w:tcBorders>
+            <w:tcMar>
+              <w:top w:type="dxa" w:w="60"/>
+              <w:left w:type="dxa" w:w="100"/>
+              <w:bottom w:type="dxa" w:w="60"/>
+              <w:right w:type="dxa" w:w="100"/>
+            </w:tcMar>
+          </w:tcPr>
+          <w:p>
+            <w:r>
+              <w:rPr>
+                <w:b w:val="false"/>
+                <w:bCs w:val="false"/>
+                <w:sz w:val="18"/>
+                <w:szCs w:val="18"/>
+              </w:rPr>
+              <w:t xml:space="preserve">2886.4</w:t>
+            </w:r>
+          </w:p>
+        </w:tc>
+        <w:tc>
+          <w:tcPr>
+            <w:tcW w:type="dxa" w:w="1300"/>
+            <w:tcBorders>
+              <w:top w:val="single" w:color="BFBFBF" w:sz="4"/>
+              <w:left w:val="single" w:color="BFBFBF" w:sz="4"/>
+              <w:bottom w:val="single" w:color="BFBFBF" w:sz="4"/>
+              <w:right w:val="single" w:color="BFBFBF" w:sz="4"/>
+            </w:tcBorders>
+            <w:tcMar>
+              <w:top w:type="dxa" w:w="60"/>
+              <w:left w:type="dxa" w:w="100"/>
+              <w:bottom w:type="dxa" w:w="60"/>
+              <w:right w:type="dxa" w:w="100"/>
+            </w:tcMar>
+          </w:tcPr>
+          <w:p>
+            <w:r>
+              <w:rPr>
+                <w:b w:val="false"/>
+                <w:bCs w:val="false"/>
+                <w:sz w:val="18"/>
+                <w:szCs w:val="18"/>
+              </w:rPr>
+              <w:t xml:space="preserve">43.2</w:t>
+            </w:r>
+          </w:p>
+        </w:tc>
+        <w:tc>
+          <w:tcPr>
+            <w:tcW w:type="dxa" w:w="1200"/>
+            <w:tcBorders>
+              <w:top w:val="single" w:color="BFBFBF" w:sz="4"/>
+              <w:left w:val="single" w:color="BFBFBF" w:sz="4"/>
+              <w:bottom w:val="single" w:color="BFBFBF" w:sz="4"/>
+              <w:right w:val="single" w:color="BFBFBF" w:sz="4"/>
+            </w:tcBorders>
+            <w:tcMar>
+              <w:top w:type="dxa" w:w="60"/>
+              <w:left w:type="dxa" w:w="100"/>
+              <w:bottom w:type="dxa" w:w="60"/>
+              <w:right w:type="dxa" w:w="100"/>
+            </w:tcMar>
+          </w:tcPr>
+          <w:p>
+            <w:r>
+              <w:rPr>
+                <w:b w:val="false"/>
+                <w:bCs w:val="false"/>
+                <w:sz w:val="18"/>
+                <w:szCs w:val="18"/>
+              </w:rPr>
+              <w:t xml:space="preserve">22.5</w:t>
+            </w:r>
+          </w:p>
+        </w:tc>
+        <w:tc>
+          <w:tcPr>
+            <w:tcW w:type="dxa" w:w="900"/>
+            <w:tcBorders>
+              <w:top w:val="single" w:color="BFBFBF" w:sz="4"/>
+              <w:left w:val="single" w:color="BFBFBF" w:sz="4"/>
+              <w:bottom w:val="single" w:color="BFBFBF" w:sz="4"/>
+              <w:right w:val="single" w:color="BFBFBF" w:sz="4"/>
+            </w:tcBorders>
+            <w:tcMar>
+              <w:top w:type="dxa" w:w="60"/>
+              <w:left w:type="dxa" w:w="100"/>
+              <w:bottom w:type="dxa" w:w="60"/>
+              <w:right w:type="dxa" w:w="100"/>
+            </w:tcMar>
+          </w:tcPr>
+          <w:p>
+            <w:r>
+              <w:rPr>
+                <w:b w:val="false"/>
+                <w:bCs w:val="false"/>
+                <w:sz w:val="18"/>
+                <w:szCs w:val="18"/>
+              </w:rPr>
+              <w:t xml:space="preserve">0.9997</w:t>
+            </w:r>
+          </w:p>
+        </w:tc>
+        <w:tc>
+          <w:tcPr>
+            <w:tcW w:type="dxa" w:w="1226"/>
+            <w:tcBorders>
+              <w:top w:val="single" w:color="BFBFBF" w:sz="4"/>
+              <w:left w:val="single" w:color="BFBFBF" w:sz="4"/>
+              <w:bottom w:val="single" w:color="BFBFBF" w:sz="4"/>
+              <w:right w:val="single" w:color="BFBFBF" w:sz="4"/>
+            </w:tcBorders>
+            <w:tcMar>
+              <w:top w:type="dxa" w:w="60"/>
+              <w:left w:type="dxa" w:w="100"/>
+              <w:bottom w:type="dxa" w:w="60"/>
+              <w:right w:type="dxa" w:w="100"/>
+            </w:tcMar>
+          </w:tcPr>
+          <w:p>
+            <w:r>
+              <w:rPr>
+                <w:b w:val="false"/>
+                <w:bCs w:val="false"/>
+                <w:sz w:val="18"/>
+                <w:szCs w:val="18"/>
+              </w:rPr>
+              <w:t xml:space="preserve">2.2 %</w:t>
+            </w:r>
+          </w:p>
+        </w:tc>
+      </w:tr>
+      <w:tr>
+        <w:tc>
+          <w:tcPr>
+            <w:tcW w:type="dxa" w:w="900"/>
+            <w:tcBorders>
+              <w:top w:val="single" w:color="BFBFBF" w:sz="4"/>
+              <w:left w:val="single" w:color="BFBFBF" w:sz="4"/>
+              <w:bottom w:val="single" w:color="BFBFBF" w:sz="4"/>
+              <w:right w:val="single" w:color="BFBFBF" w:sz="4"/>
+            </w:tcBorders>
+            <w:tcMar>
+              <w:top w:type="dxa" w:w="60"/>
+              <w:left w:type="dxa" w:w="100"/>
+              <w:bottom w:type="dxa" w:w="60"/>
+              <w:right w:type="dxa" w:w="100"/>
+            </w:tcMar>
+          </w:tcPr>
+          <w:p>
+            <w:r>
+              <w:rPr>
+                <w:b w:val="false"/>
+                <w:bCs w:val="false"/>
+                <w:sz w:val="18"/>
+                <w:szCs w:val="18"/>
+              </w:rPr>
+              <w:t xml:space="preserve">NVs</w:t>
+            </w:r>
+          </w:p>
+        </w:tc>
+        <w:tc>
+          <w:tcPr>
+            <w:tcW w:type="dxa" w:w="2200"/>
+            <w:tcBorders>
+              <w:top w:val="single" w:color="BFBFBF" w:sz="4"/>
+              <w:left w:val="single" w:color="BFBFBF" w:sz="4"/>
+              <w:bottom w:val="single" w:color="BFBFBF" w:sz="4"/>
+              <w:right w:val="single" w:color="BFBFBF" w:sz="4"/>
+            </w:tcBorders>
+            <w:tcMar>
+              <w:top w:type="dxa" w:w="60"/>
+              <w:left w:type="dxa" w:w="100"/>
+              <w:bottom w:type="dxa" w:w="60"/>
+              <w:right w:type="dxa" w:w="100"/>
+            </w:tcMar>
+          </w:tcPr>
+          <w:p>
+            <w:r>
+              <w:rPr>
+                <w:b w:val="false"/>
+                <w:bCs w:val="false"/>
+                <w:sz w:val="18"/>
+                <w:szCs w:val="18"/>
+              </w:rPr>
+              <w:t xml:space="preserve">Gaussian-Lorentzian sum</w:t>
+            </w:r>
+          </w:p>
+        </w:tc>
+        <w:tc>
+          <w:tcPr>
+            <w:tcW w:type="dxa" w:w="1300"/>
+            <w:tcBorders>
+              <w:top w:val="single" w:color="BFBFBF" w:sz="4"/>
+              <w:left w:val="single" w:color="BFBFBF" w:sz="4"/>
+              <w:bottom w:val="single" w:color="BFBFBF" w:sz="4"/>
+              <w:right w:val="single" w:color="BFBFBF" w:sz="4"/>
+            </w:tcBorders>
+            <w:tcMar>
+              <w:top w:type="dxa" w:w="60"/>
+              <w:left w:type="dxa" w:w="100"/>
+              <w:bottom w:type="dxa" w:w="60"/>
+              <w:right w:type="dxa" w:w="100"/>
+            </w:tcMar>
+          </w:tcPr>
+          <w:p>
+            <w:r>
+              <w:rPr>
+                <w:b w:val="false"/>
+                <w:bCs w:val="false"/>
+                <w:sz w:val="18"/>
+                <w:szCs w:val="18"/>
+              </w:rPr>
+              <w:t xml:space="preserve">2886.4</w:t>
+            </w:r>
+          </w:p>
+        </w:tc>
+        <w:tc>
+          <w:tcPr>
+            <w:tcW w:type="dxa" w:w="1300"/>
+            <w:tcBorders>
+              <w:top w:val="single" w:color="BFBFBF" w:sz="4"/>
+              <w:left w:val="single" w:color="BFBFBF" w:sz="4"/>
+              <w:bottom w:val="single" w:color="BFBFBF" w:sz="4"/>
+              <w:right w:val="single" w:color="BFBFBF" w:sz="4"/>
+            </w:tcBorders>
+            <w:tcMar>
+              <w:top w:type="dxa" w:w="60"/>
+              <w:left w:type="dxa" w:w="100"/>
+              <w:bottom w:type="dxa" w:w="60"/>
+              <w:right w:type="dxa" w:w="100"/>
+            </w:tcMar>
+          </w:tcPr>
+          <w:p>
+            <w:r>
+              <w:rPr>
+                <w:b w:val="false"/>
+                <w:bCs w:val="false"/>
+                <w:sz w:val="18"/>
+                <w:szCs w:val="18"/>
+              </w:rPr>
+              <w:t xml:space="preserve">43.2</w:t>
+            </w:r>
+          </w:p>
+        </w:tc>
+        <w:tc>
+          <w:tcPr>
+            <w:tcW w:type="dxa" w:w="1200"/>
+            <w:tcBorders>
+              <w:top w:val="single" w:color="BFBFBF" w:sz="4"/>
+              <w:left w:val="single" w:color="BFBFBF" w:sz="4"/>
+              <w:bottom w:val="single" w:color="BFBFBF" w:sz="4"/>
+              <w:right w:val="single" w:color="BFBFBF" w:sz="4"/>
+            </w:tcBorders>
+            <w:tcMar>
+              <w:top w:type="dxa" w:w="60"/>
+              <w:left w:type="dxa" w:w="100"/>
+              <w:bottom w:type="dxa" w:w="60"/>
+              <w:right w:type="dxa" w:w="100"/>
+            </w:tcMar>
+          </w:tcPr>
+          <w:p>
+            <w:r>
+              <w:rPr>
+                <w:b w:val="false"/>
+                <w:bCs w:val="false"/>
+                <w:sz w:val="18"/>
+                <w:szCs w:val="18"/>
+              </w:rPr>
+              <w:t xml:space="preserve">22.5</w:t>
+            </w:r>
+          </w:p>
+        </w:tc>
+        <w:tc>
+          <w:tcPr>
+            <w:tcW w:type="dxa" w:w="900"/>
+            <w:tcBorders>
+              <w:top w:val="single" w:color="BFBFBF" w:sz="4"/>
+              <w:left w:val="single" w:color="BFBFBF" w:sz="4"/>
+              <w:bottom w:val="single" w:color="BFBFBF" w:sz="4"/>
+              <w:right w:val="single" w:color="BFBFBF" w:sz="4"/>
+            </w:tcBorders>
+            <w:tcMar>
+              <w:top w:type="dxa" w:w="60"/>
+              <w:left w:type="dxa" w:w="100"/>
+              <w:bottom w:type="dxa" w:w="60"/>
+              <w:right w:type="dxa" w:w="100"/>
+            </w:tcMar>
+          </w:tcPr>
+          <w:p>
+            <w:r>
+              <w:rPr>
+                <w:b w:val="false"/>
+                <w:bCs w:val="false"/>
+                <w:sz w:val="18"/>
+                <w:szCs w:val="18"/>
+              </w:rPr>
+              <w:t xml:space="preserve">0.9997</w:t>
+            </w:r>
+          </w:p>
+        </w:tc>
+        <w:tc>
+          <w:tcPr>
+            <w:tcW w:type="dxa" w:w="1226"/>
+            <w:tcBorders>
+              <w:top w:val="single" w:color="BFBFBF" w:sz="4"/>
+              <w:left w:val="single" w:color="BFBFBF" w:sz="4"/>
+              <w:bottom w:val="single" w:color="BFBFBF" w:sz="4"/>
+              <w:right w:val="single" w:color="BFBFBF" w:sz="4"/>
+            </w:tcBorders>
+            <w:tcMar>
+              <w:top w:type="dxa" w:w="60"/>
+              <w:left w:type="dxa" w:w="100"/>
+              <w:bottom w:type="dxa" w:w="60"/>
+              <w:right w:type="dxa" w:w="100"/>
+            </w:tcMar>
+          </w:tcPr>
+          <w:p>
+            <w:r>
+              <w:rPr>
+                <w:b w:val="false"/>
+                <w:bCs w:val="false"/>
+                <w:sz w:val="18"/>
+                <w:szCs w:val="18"/>
+              </w:rPr>
+              <w:t xml:space="preserve">2.2 %</w:t>
+            </w:r>
+          </w:p>
+        </w:tc>
+      </w:tr>
+      <w:tr>
+        <w:tc>
+          <w:tcPr>
+            <w:tcW w:type="dxa" w:w="900"/>
+            <w:tcBorders>
+              <w:top w:val="single" w:color="BFBFBF" w:sz="4"/>
+              <w:left w:val="single" w:color="BFBFBF" w:sz="4"/>
+              <w:bottom w:val="single" w:color="BFBFBF" w:sz="4"/>
+              <w:right w:val="single" w:color="BFBFBF" w:sz="4"/>
+            </w:tcBorders>
+            <w:tcMar>
+              <w:top w:type="dxa" w:w="60"/>
+              <w:left w:type="dxa" w:w="100"/>
+              <w:bottom w:type="dxa" w:w="60"/>
+              <w:right w:type="dxa" w:w="100"/>
+            </w:tcMar>
+          </w:tcPr>
+          <w:p>
+            <w:r>
+              <w:rPr>
+                <w:b w:val="false"/>
+                <w:bCs w:val="false"/>
+                <w:sz w:val="18"/>
+                <w:szCs w:val="18"/>
+              </w:rPr>
+              <w:t xml:space="preserve">NVs</w:t>
+            </w:r>
+          </w:p>
+        </w:tc>
+        <w:tc>
+          <w:tcPr>
+            <w:tcW w:type="dxa" w:w="2200"/>
+            <w:tcBorders>
+              <w:top w:val="single" w:color="BFBFBF" w:sz="4"/>
+              <w:left w:val="single" w:color="BFBFBF" w:sz="4"/>
+              <w:bottom w:val="single" w:color="BFBFBF" w:sz="4"/>
+              <w:right w:val="single" w:color="BFBFBF" w:sz="4"/>
+            </w:tcBorders>
+            <w:tcMar>
+              <w:top w:type="dxa" w:w="60"/>
+              <w:left w:type="dxa" w:w="100"/>
+              <w:bottom w:type="dxa" w:w="60"/>
+              <w:right w:type="dxa" w:w="100"/>
+            </w:tcMar>
+          </w:tcPr>
+          <w:p>
+            <w:r>
+              <w:rPr>
+                <w:b w:val="false"/>
+                <w:bCs w:val="false"/>
+                <w:sz w:val="18"/>
+                <w:szCs w:val="18"/>
+              </w:rPr>
+              <w:t xml:space="preserve">Lorentzian</w:t>
+            </w:r>
+          </w:p>
+        </w:tc>
+        <w:tc>
+          <w:tcPr>
+            <w:tcW w:type="dxa" w:w="1300"/>
+            <w:tcBorders>
+              <w:top w:val="single" w:color="BFBFBF" w:sz="4"/>
+              <w:left w:val="single" w:color="BFBFBF" w:sz="4"/>
+              <w:bottom w:val="single" w:color="BFBFBF" w:sz="4"/>
+              <w:right w:val="single" w:color="BFBFBF" w:sz="4"/>
+            </w:tcBorders>
+            <w:tcMar>
+              <w:top w:type="dxa" w:w="60"/>
+              <w:left w:type="dxa" w:w="100"/>
+              <w:bottom w:type="dxa" w:w="60"/>
+              <w:right w:type="dxa" w:w="100"/>
+            </w:tcMar>
+          </w:tcPr>
+          <w:p>
+            <w:r>
+              <w:rPr>
+                <w:b w:val="false"/>
+                <w:bCs w:val="false"/>
+                <w:sz w:val="18"/>
+                <w:szCs w:val="18"/>
+              </w:rPr>
+              <w:t xml:space="preserve">2883.7</w:t>
+            </w:r>
+          </w:p>
+        </w:tc>
+        <w:tc>
+          <w:tcPr>
+            <w:tcW w:type="dxa" w:w="1300"/>
+            <w:tcBorders>
+              <w:top w:val="single" w:color="BFBFBF" w:sz="4"/>
+              <w:left w:val="single" w:color="BFBFBF" w:sz="4"/>
+              <w:bottom w:val="single" w:color="BFBFBF" w:sz="4"/>
+              <w:right w:val="single" w:color="BFBFBF" w:sz="4"/>
+            </w:tcBorders>
+            <w:tcMar>
+              <w:top w:type="dxa" w:w="60"/>
+              <w:left w:type="dxa" w:w="100"/>
+              <w:bottom w:type="dxa" w:w="60"/>
+              <w:right w:type="dxa" w:w="100"/>
+            </w:tcMar>
+          </w:tcPr>
+          <w:p>
+            <w:r>
+              <w:rPr>
+                <w:b w:val="false"/>
+                <w:bCs w:val="false"/>
+                <w:sz w:val="18"/>
+                <w:szCs w:val="18"/>
+              </w:rPr>
+              <w:t xml:space="preserve">33.7</w:t>
+            </w:r>
+          </w:p>
+        </w:tc>
+        <w:tc>
+          <w:tcPr>
+            <w:tcW w:type="dxa" w:w="1200"/>
+            <w:tcBorders>
+              <w:top w:val="single" w:color="BFBFBF" w:sz="4"/>
+              <w:left w:val="single" w:color="BFBFBF" w:sz="4"/>
+              <w:bottom w:val="single" w:color="BFBFBF" w:sz="4"/>
+              <w:right w:val="single" w:color="BFBFBF" w:sz="4"/>
+            </w:tcBorders>
+            <w:tcMar>
+              <w:top w:type="dxa" w:w="60"/>
+              <w:left w:type="dxa" w:w="100"/>
+              <w:bottom w:type="dxa" w:w="60"/>
+              <w:right w:type="dxa" w:w="100"/>
+            </w:tcMar>
+          </w:tcPr>
+          <w:p>
+            <w:r>
+              <w:rPr>
+                <w:b w:val="false"/>
+                <w:bCs w:val="false"/>
+                <w:sz w:val="18"/>
+                <w:szCs w:val="18"/>
+              </w:rPr>
+              <w:t xml:space="preserve">10.0</w:t>
+            </w:r>
+          </w:p>
+        </w:tc>
+        <w:tc>
+          <w:tcPr>
+            <w:tcW w:type="dxa" w:w="900"/>
+            <w:tcBorders>
+              <w:top w:val="single" w:color="BFBFBF" w:sz="4"/>
+              <w:left w:val="single" w:color="BFBFBF" w:sz="4"/>
+              <w:bottom w:val="single" w:color="BFBFBF" w:sz="4"/>
+              <w:right w:val="single" w:color="BFBFBF" w:sz="4"/>
+            </w:tcBorders>
+            <w:tcMar>
+              <w:top w:type="dxa" w:w="60"/>
+              <w:left w:type="dxa" w:w="100"/>
+              <w:bottom w:type="dxa" w:w="60"/>
+              <w:right w:type="dxa" w:w="100"/>
+            </w:tcMar>
+          </w:tcPr>
+          <w:p>
+            <w:r>
+              <w:rPr>
+                <w:b w:val="false"/>
+                <w:bCs w:val="false"/>
+                <w:sz w:val="18"/>
+                <w:szCs w:val="18"/>
+              </w:rPr>
+              <w:t xml:space="preserve">0.9983</w:t>
+            </w:r>
+          </w:p>
+        </w:tc>
+        <w:tc>
+          <w:tcPr>
+            <w:tcW w:type="dxa" w:w="1226"/>
+            <w:tcBorders>
+              <w:top w:val="single" w:color="BFBFBF" w:sz="4"/>
+              <w:left w:val="single" w:color="BFBFBF" w:sz="4"/>
+              <w:bottom w:val="single" w:color="BFBFBF" w:sz="4"/>
+              <w:right w:val="single" w:color="BFBFBF" w:sz="4"/>
+            </w:tcBorders>
+            <w:tcMar>
+              <w:top w:type="dxa" w:w="60"/>
+              <w:left w:type="dxa" w:w="100"/>
+              <w:bottom w:type="dxa" w:w="60"/>
+              <w:right w:type="dxa" w:w="100"/>
+            </w:tcMar>
+          </w:tcPr>
+          <w:p>
+            <w:r>
+              <w:rPr>
+                <w:b w:val="false"/>
+                <w:bCs w:val="false"/>
+                <w:sz w:val="18"/>
+                <w:szCs w:val="18"/>
+              </w:rPr>
+              <w:t xml:space="preserve">3.5 %</w:t>
+            </w:r>
+          </w:p>
+        </w:tc>
+      </w:tr>
+    </w:tbl>
+    <w:p>
+      <w:pPr>
+        <w:spacing w:after="120"/>
+      </w:pPr>
+    </w:p>
+    <w:p>
+      <w:pPr>
+        <w:spacing w:after="120"/>
+      </w:pPr>
+      <w:r>
+        <w:rPr>
+          <w:b/>
+          <w:bCs/>
+        </w:rPr>
+        <w:t xml:space="preserve">Result.</w:t>
+      </w:r>
+      <w:r>
+        <w:t xml:space="preserve"> In NVs, band II is a well-defined band at 2884-2886 cm⁻¹ with a width of 34-43 cm⁻¹ in all three fits, and the fits are excellent (R² ≥ 0.998, residuals ≤ 3.5 %). In EVs, the fit also needs some intensity between 2870 and 2890 cm⁻¹, but only as a very broad component whose width runs to the upper limit (60 cm⁻¹) for every line shape, i.e. a weak, unresolved wing of the main band rather than a distinct band. This supports labelling the 2883 cm⁻¹ band for NVs only; in the text it should be described as “a distinct CH₂ band in NVs, only a weak unresolved shoulder in EVs”, not as completely absent in EVs.</w:t>
+      </w:r>
+    </w:p>
+    <w:p>
+      <w:pPr>
+        <w:spacing w:before="120"/>
+        <w:jc w:val="center"/>
+      </w:pPr>
+      <w:r>
+        <w:drawing>
+          <wp:inline distT="0" distB="0" distL="0" distR="0">
+            <wp:extent cx="5715000" cy="3343275"/>
+            <wp:effectExtent t="0" r="0" b="0" l="0"/>
+            <wp:docPr id="1" name="FigS2_PeakFit_CH" descr="Figure S2. Band fitting of the mean CH-stretching spectra of EV Acacia (a-c) and Nanovesicles Acacia (d-f) with Gaussian, Gaussian-Lorentzian sum and Lorentzian line shapes. Thick black: data; grey: fit; thin: bands I-V; top: residuals in % of the band height." title="FigS2_PeakFit_CH"/>
+            <wp:cNvGraphicFramePr>
+              <a:graphicFrameLocks xmlns:a="http://schemas.openxmlformats.org/drawingml/2006/main" noChangeAspect="1"/>
+            </wp:cNvGraphicFramePr>
+            <a:graphic xmlns:a="http://schemas.openxmlformats.org/drawingml/2006/main">
+              <a:graphicData uri="http://schemas.openxmlformats.org/drawingml/2006/picture">
+                <pic:pic xmlns:pic="http://schemas.openxmlformats.org/drawingml/2006/picture">
+                  <pic:nvPicPr>
+                    <pic:cNvPr id="0" name="" descr=""/>
+                    <pic:cNvPicPr>
+                      <a:picLocks noChangeAspect="1" noChangeArrowheads="1"/>
+                    </pic:cNvPicPr>
+                  </pic:nvPicPr>
+                  <pic:blipFill>
+                    <a:blip r:embed="rId12" cstate="none"/>
+                    <a:srcRect/>
+                    <a:stretch>
+                      <a:fillRect/>
+                    </a:stretch>
+                  </pic:blipFill>
+                  <pic:spPr bwMode="auto">
+                    <a:xfrm>
+                      <a:off x="0" y="0"/>
+                      <a:ext cx="5715000" cy="3343275"/>
+                    </a:xfrm>
+                    <a:prstGeom prst="rect">
+                      <a:avLst/>
+                    </a:prstGeom>
+                  </pic:spPr>
+                </pic:pic>
+              </a:graphicData>
+            </a:graphic>
+          </wp:inline>
+        </w:drawing>
+      </w:r>
+    </w:p>
+    <w:p>
+      <w:pPr>
+        <w:pStyle w:val="Caption"/>
+        <w:spacing w:after="240" w:before="60"/>
+      </w:pPr>
+      <w:r>
+        <w:rPr>
+          <w:b/>
+          <w:bCs/>
+        </w:rPr>
+        <w:t xml:space="preserve">Figure S2.</w:t>
+      </w:r>
+      <w:r>
+        <w:t xml:space="preserve"> Band fitting of the mean CH-stretching spectra of EV Acacia (a-c) and Nanovesicles Acacia (d-f) with Gaussian, Gaussian-Lorentzian sum and Lorentzian line shapes. Thick black: data; grey: fit; thin: bands I-V; top: residuals in % of the band height.</w:t>
+      </w:r>
+    </w:p>
+    <w:p>
+      <w:pPr>
         <w:pStyle w:val="Heading1"/>
       </w:pPr>
       <w:r>
@@ -8937,7 +10483,7 @@
                     </pic:cNvPicPr>
                   </pic:nvPicPr>
                   <pic:blipFill>
-                    <a:blip r:embed="rId12" cstate="none"/>
+                    <a:blip r:embed="rId13" cstate="none"/>
                     <a:srcRect/>
                     <a:stretch>
                       <a:fillRect/>
@@ -9051,7 +10597,7 @@
                     </pic:cNvPicPr>
                   </pic:nvPicPr>
                   <pic:blipFill>
-                    <a:blip r:embed="rId13" cstate="none"/>
+                    <a:blip r:embed="rId14" cstate="none"/>
                     <a:srcRect/>
                     <a:stretch>
                       <a:fillRect/>
@@ -10985,7 +12531,7 @@
                     </pic:cNvPicPr>
                   </pic:nvPicPr>
                   <pic:blipFill>
-                    <a:blip r:embed="rId14" cstate="none"/>
+                    <a:blip r:embed="rId15" cstate="none"/>
                     <a:srcRect/>
                     <a:stretch>
                       <a:fillRect/>
@@ -11073,7 +12619,7 @@
                     </pic:cNvPicPr>
                   </pic:nvPicPr>
                   <pic:blipFill>
-                    <a:blip r:embed="rId15" cstate="none"/>
+                    <a:blip r:embed="rId16" cstate="none"/>
                     <a:srcRect/>
                     <a:stretch>
                       <a:fillRect/>
@@ -12024,6 +13570,64 @@
                 <w:szCs w:val="18"/>
               </w:rPr>
               <w:t xml:space="preserve">Main loading and difference bands</w:t>
+            </w:r>
+          </w:p>
+        </w:tc>
+      </w:tr>
+      <w:tr>
+        <w:tc>
+          <w:tcPr>
+            <w:tcW w:type="dxa" w:w="3600"/>
+            <w:tcBorders>
+              <w:top w:val="single" w:color="BFBFBF" w:sz="4"/>
+              <w:left w:val="single" w:color="BFBFBF" w:sz="4"/>
+              <w:bottom w:val="single" w:color="BFBFBF" w:sz="4"/>
+              <w:right w:val="single" w:color="BFBFBF" w:sz="4"/>
+            </w:tcBorders>
+            <w:tcMar>
+              <w:top w:type="dxa" w:w="60"/>
+              <w:left w:type="dxa" w:w="100"/>
+              <w:bottom w:type="dxa" w:w="60"/>
+              <w:right w:type="dxa" w:w="100"/>
+            </w:tcMar>
+          </w:tcPr>
+          <w:p>
+            <w:r>
+              <w:rPr>
+                <w:b w:val="false"/>
+                <w:bCs w:val="false"/>
+                <w:sz w:val="18"/>
+                <w:szCs w:val="18"/>
+              </w:rPr>
+              <w:t xml:space="preserve">FigS2_PeakFit_CH, TableS6_PeakFit_CH.csv</w:t>
+            </w:r>
+          </w:p>
+        </w:tc>
+        <w:tc>
+          <w:tcPr>
+            <w:tcW w:type="dxa" w:w="5426"/>
+            <w:tcBorders>
+              <w:top w:val="single" w:color="BFBFBF" w:sz="4"/>
+              <w:left w:val="single" w:color="BFBFBF" w:sz="4"/>
+              <w:bottom w:val="single" w:color="BFBFBF" w:sz="4"/>
+              <w:right w:val="single" w:color="BFBFBF" w:sz="4"/>
+            </w:tcBorders>
+            <w:tcMar>
+              <w:top w:type="dxa" w:w="60"/>
+              <w:left w:type="dxa" w:w="100"/>
+              <w:bottom w:type="dxa" w:w="60"/>
+              <w:right w:type="dxa" w:w="100"/>
+            </w:tcMar>
+          </w:tcPr>
+          <w:p>
+            <w:r>
+              <w:rPr>
+                <w:b w:val="false"/>
+                <w:bCs w:val="false"/>
+                <w:sz w:val="18"/>
+                <w:szCs w:val="18"/>
+              </w:rPr>
+              <w:t xml:space="preserve">CH band fitting (3 line shapes) and fitted parameters</w:t>
             </w:r>
           </w:p>
         </w:tc>

</xml_diff>

<commit_message>
Fig 2c: CH band fitting with the Gaussian-Lorentzian sum only (best fit by AIC/BIC); AIC/BIC added to Table S6
Co-Authored-By: Claude Opus 5.5 <noreply@anthropic.com>
Claude-Session: https://claude.ai/code/session_01L8hQ8e5u5KmaH4dD9snyRw
</commit_message>
<xml_diff>
--- a/Acacia_Analysis_Report.docx
+++ b/Acacia_Analysis_Report.docx
@@ -103,7 +103,7 @@
         <w:spacing w:after="100"/>
       </w:pPr>
       <w:r>
-        <w:t xml:space="preserve">4. Mean spectra, peak shifts, band statistics and CH band fitting (Figure 2, Table S1, Figure S2)</w:t>
+        <w:t xml:space="preserve">4. Mean spectra, peak shifts, band statistics and CH band fitting (Figure 2a-c, Table S1, Figure S2)</w:t>
       </w:r>
     </w:p>
     <w:p>
@@ -956,7 +956,7 @@
         <w:pStyle w:val="Heading1"/>
       </w:pPr>
       <w:r>
-        <w:t xml:space="preserve">4. Mean spectra, peak shifts, band statistics and CH band fitting (Figure 2, Table S1, Figure S2)</w:t>
+        <w:t xml:space="preserve">4. Mean spectra, peak shifts, band statistics and CH band fitting (Figure 2a-c, Table S1, Figure S2)</w:t>
       </w:r>
     </w:p>
     <w:p>
@@ -5680,7 +5680,7 @@
         <w:pStyle w:val="Heading2"/>
       </w:pPr>
       <w:r>
-        <w:t xml:space="preserve">4.4 Band fitting of the CH-stretching region (Figure S2, Table S6)</w:t>
+        <w:t xml:space="preserve">4.4 Band fitting of the CH-stretching region (Figure 2c, Figure S2, Table S6)</w:t>
       </w:r>
     </w:p>
     <w:p>
@@ -5695,7 +5695,7 @@
         <w:t xml:space="preserve">How it was done.</w:t>
       </w:r>
       <w:r>
-        <w:t xml:space="preserve"> The mean spectrum of each group (2780-3095 cm⁻¹, after pre-processing) was described as a straight baseline plus five bands: I (~2850 cm⁻¹, CH₂ symmetric), II (~2880, CH₂ asymmetric, lipids), III (~2935, CH₃ symmetric), IV (~2965, CH₃ asymmetric) and V (~3065, aromatic =C-H). Each band had a free height, a position within ±12 cm⁻¹ and a width (FWHM) between 12 and 60 cm⁻¹; the parameters were found by non-linear least squares. As in published band-fitting work, three line shapes were compared: Gaussian (G), Gaussian-Lorentzian sum (GL, pseudo-Voigt) and Lorentzian (L). The residual (data - fit) is shown above each panel in % of the band height.</w:t>
+        <w:t xml:space="preserve"> The mean spectrum of each group (2780-3095 cm⁻¹, after pre-processing) was described as a straight baseline plus five bands: I (~2850 cm⁻¹, CH₂ symmetric), II (~2880, CH₂ asymmetric, lipids), III (~2935, CH₃ symmetric), IV (~2965, CH₃ asymmetric) and V (~3065, aromatic =C-H). Each band had a free height, a position within ±12 cm⁻¹ and a width (FWHM) between 12 and 60 cm⁻¹; the parameters were found by non-linear least squares. The residual (data - fit) is shown above each panel in % of the band height.</w:t>
       </w:r>
     </w:p>
     <w:p>
@@ -5707,10 +5707,10 @@
           <w:b/>
           <w:bCs/>
         </w:rPr>
-        <w:t xml:space="preserve">Important.</w:t>
-      </w:r>
-      <w:r>
-        <w:t xml:space="preserve"> Overlapping bands have no unique decomposition: the % areas depend on the line shape and the constraints. Conclusions are therefore drawn only from what is the same for all three line shapes.</w:t>
+        <w:t xml:space="preserve">Choice of line shape.</w:t>
+      </w:r>
+      <w:r>
+        <w:t xml:space="preserve"> Three line shapes were compared: Gaussian (G), Gaussian-Lorentzian sum (GL, pseudo-Voigt, one Lorentzian fraction fitted per spectrum) and Lorentzian (L). The comparison used the residual error and the Akaike and Bayesian information criteria (AIC, BIC; lower is better, and they penalise the extra parameter of GL):</w:t>
       </w:r>
     </w:p>
     <w:tbl>
@@ -5727,12 +5727,12 @@
       </w:tblPr>
       <w:tblGrid>
         <w:gridCol w:w="900"/>
-        <w:gridCol w:w="2200"/>
+        <w:gridCol w:w="2300"/>
+        <w:gridCol w:w="1000"/>
         <w:gridCol w:w="1300"/>
-        <w:gridCol w:w="1300"/>
-        <w:gridCol w:w="1200"/>
-        <w:gridCol w:w="900"/>
-        <w:gridCol w:w="1226"/>
+        <w:gridCol w:w="1100"/>
+        <w:gridCol w:w="1100"/>
+        <w:gridCol w:w="1326"/>
       </w:tblGrid>
       <w:tr>
         <w:trPr>
@@ -5769,7 +5769,7 @@
         </w:tc>
         <w:tc>
           <w:tcPr>
-            <w:tcW w:type="dxa" w:w="2200"/>
+            <w:tcW w:type="dxa" w:w="2300"/>
             <w:tcBorders>
               <w:top w:val="single" w:color="BFBFBF" w:sz="4"/>
               <w:left w:val="single" w:color="BFBFBF" w:sz="4"/>
@@ -5798,7 +5798,7 @@
         </w:tc>
         <w:tc>
           <w:tcPr>
-            <w:tcW w:type="dxa" w:w="1300"/>
+            <w:tcW w:type="dxa" w:w="1000"/>
             <w:tcBorders>
               <w:top w:val="single" w:color="BFBFBF" w:sz="4"/>
               <w:left w:val="single" w:color="BFBFBF" w:sz="4"/>
@@ -5821,7 +5821,7 @@
                 <w:sz w:val="18"/>
                 <w:szCs w:val="18"/>
               </w:rPr>
-              <w:t xml:space="preserve">Band II position</w:t>
+              <w:t xml:space="preserve">R²</w:t>
             </w:r>
           </w:p>
         </w:tc>
@@ -5850,13 +5850,13 @@
                 <w:sz w:val="18"/>
                 <w:szCs w:val="18"/>
               </w:rPr>
-              <w:t xml:space="preserve">Band II FWHM</w:t>
-            </w:r>
-          </w:p>
-        </w:tc>
-        <w:tc>
-          <w:tcPr>
-            <w:tcW w:type="dxa" w:w="1200"/>
+              <w:t xml:space="preserve">Max |residual|</w:t>
+            </w:r>
+          </w:p>
+        </w:tc>
+        <w:tc>
+          <w:tcPr>
+            <w:tcW w:type="dxa" w:w="1100"/>
             <w:tcBorders>
               <w:top w:val="single" w:color="BFBFBF" w:sz="4"/>
               <w:left w:val="single" w:color="BFBFBF" w:sz="4"/>
@@ -5879,13 +5879,13 @@
                 <w:sz w:val="18"/>
                 <w:szCs w:val="18"/>
               </w:rPr>
-              <w:t xml:space="preserve">Band II area (%)</w:t>
-            </w:r>
-          </w:p>
-        </w:tc>
-        <w:tc>
-          <w:tcPr>
-            <w:tcW w:type="dxa" w:w="900"/>
+              <w:t xml:space="preserve">AIC</w:t>
+            </w:r>
+          </w:p>
+        </w:tc>
+        <w:tc>
+          <w:tcPr>
+            <w:tcW w:type="dxa" w:w="1100"/>
             <w:tcBorders>
               <w:top w:val="single" w:color="BFBFBF" w:sz="4"/>
               <w:left w:val="single" w:color="BFBFBF" w:sz="4"/>
@@ -5908,13 +5908,13 @@
                 <w:sz w:val="18"/>
                 <w:szCs w:val="18"/>
               </w:rPr>
-              <w:t xml:space="preserve">R²</w:t>
-            </w:r>
-          </w:p>
-        </w:tc>
-        <w:tc>
-          <w:tcPr>
-            <w:tcW w:type="dxa" w:w="1226"/>
+              <w:t xml:space="preserve">BIC</w:t>
+            </w:r>
+          </w:p>
+        </w:tc>
+        <w:tc>
+          <w:tcPr>
+            <w:tcW w:type="dxa" w:w="1326"/>
             <w:tcBorders>
               <w:top w:val="single" w:color="BFBFBF" w:sz="4"/>
               <w:left w:val="single" w:color="BFBFBF" w:sz="4"/>
@@ -5937,7 +5937,7 @@
                 <w:sz w:val="18"/>
                 <w:szCs w:val="18"/>
               </w:rPr>
-              <w:t xml:space="preserve">Max |residual|</w:t>
+              <w:t xml:space="preserve">Lorentzian fraction</w:t>
             </w:r>
           </w:p>
         </w:tc>
@@ -5973,7 +5973,7 @@
         </w:tc>
         <w:tc>
           <w:tcPr>
-            <w:tcW w:type="dxa" w:w="2200"/>
+            <w:tcW w:type="dxa" w:w="2300"/>
             <w:tcBorders>
               <w:top w:val="single" w:color="BFBFBF" w:sz="4"/>
               <w:left w:val="single" w:color="BFBFBF" w:sz="4"/>
@@ -6001,6 +6001,34 @@
         </w:tc>
         <w:tc>
           <w:tcPr>
+            <w:tcW w:type="dxa" w:w="1000"/>
+            <w:tcBorders>
+              <w:top w:val="single" w:color="BFBFBF" w:sz="4"/>
+              <w:left w:val="single" w:color="BFBFBF" w:sz="4"/>
+              <w:bottom w:val="single" w:color="BFBFBF" w:sz="4"/>
+              <w:right w:val="single" w:color="BFBFBF" w:sz="4"/>
+            </w:tcBorders>
+            <w:tcMar>
+              <w:top w:type="dxa" w:w="60"/>
+              <w:left w:type="dxa" w:w="100"/>
+              <w:bottom w:type="dxa" w:w="60"/>
+              <w:right w:type="dxa" w:w="100"/>
+            </w:tcMar>
+          </w:tcPr>
+          <w:p>
+            <w:r>
+              <w:rPr>
+                <w:b w:val="false"/>
+                <w:bCs w:val="false"/>
+                <w:sz w:val="18"/>
+                <w:szCs w:val="18"/>
+              </w:rPr>
+              <w:t xml:space="preserve">0.9973</w:t>
+            </w:r>
+          </w:p>
+        </w:tc>
+        <w:tc>
+          <w:tcPr>
             <w:tcW w:type="dxa" w:w="1300"/>
             <w:tcBorders>
               <w:top w:val="single" w:color="BFBFBF" w:sz="4"/>
@@ -6023,119 +6051,91 @@
                 <w:sz w:val="18"/>
                 <w:szCs w:val="18"/>
               </w:rPr>
-              <w:t xml:space="preserve">2886.9</w:t>
-            </w:r>
-          </w:p>
-        </w:tc>
-        <w:tc>
-          <w:tcPr>
-            <w:tcW w:type="dxa" w:w="1300"/>
-            <w:tcBorders>
-              <w:top w:val="single" w:color="BFBFBF" w:sz="4"/>
-              <w:left w:val="single" w:color="BFBFBF" w:sz="4"/>
-              <w:bottom w:val="single" w:color="BFBFBF" w:sz="4"/>
-              <w:right w:val="single" w:color="BFBFBF" w:sz="4"/>
-            </w:tcBorders>
-            <w:tcMar>
-              <w:top w:type="dxa" w:w="60"/>
-              <w:left w:type="dxa" w:w="100"/>
-              <w:bottom w:type="dxa" w:w="60"/>
-              <w:right w:type="dxa" w:w="100"/>
-            </w:tcMar>
-          </w:tcPr>
-          <w:p>
-            <w:r>
-              <w:rPr>
-                <w:b w:val="false"/>
-                <w:bCs w:val="false"/>
-                <w:sz w:val="18"/>
-                <w:szCs w:val="18"/>
-              </w:rPr>
-              <w:t xml:space="preserve">60.0 (limit)</w:t>
-            </w:r>
-          </w:p>
-        </w:tc>
-        <w:tc>
-          <w:tcPr>
-            <w:tcW w:type="dxa" w:w="1200"/>
-            <w:tcBorders>
-              <w:top w:val="single" w:color="BFBFBF" w:sz="4"/>
-              <w:left w:val="single" w:color="BFBFBF" w:sz="4"/>
-              <w:bottom w:val="single" w:color="BFBFBF" w:sz="4"/>
-              <w:right w:val="single" w:color="BFBFBF" w:sz="4"/>
-            </w:tcBorders>
-            <w:tcMar>
-              <w:top w:type="dxa" w:w="60"/>
-              <w:left w:type="dxa" w:w="100"/>
-              <w:bottom w:type="dxa" w:w="60"/>
-              <w:right w:type="dxa" w:w="100"/>
-            </w:tcMar>
-          </w:tcPr>
-          <w:p>
-            <w:r>
-              <w:rPr>
-                <w:b w:val="false"/>
-                <w:bCs w:val="false"/>
-                <w:sz w:val="18"/>
-                <w:szCs w:val="18"/>
-              </w:rPr>
-              <w:t xml:space="preserve">23.0</w:t>
-            </w:r>
-          </w:p>
-        </w:tc>
-        <w:tc>
-          <w:tcPr>
-            <w:tcW w:type="dxa" w:w="900"/>
-            <w:tcBorders>
-              <w:top w:val="single" w:color="BFBFBF" w:sz="4"/>
-              <w:left w:val="single" w:color="BFBFBF" w:sz="4"/>
-              <w:bottom w:val="single" w:color="BFBFBF" w:sz="4"/>
-              <w:right w:val="single" w:color="BFBFBF" w:sz="4"/>
-            </w:tcBorders>
-            <w:tcMar>
-              <w:top w:type="dxa" w:w="60"/>
-              <w:left w:type="dxa" w:w="100"/>
-              <w:bottom w:type="dxa" w:w="60"/>
-              <w:right w:type="dxa" w:w="100"/>
-            </w:tcMar>
-          </w:tcPr>
-          <w:p>
-            <w:r>
-              <w:rPr>
-                <w:b w:val="false"/>
-                <w:bCs w:val="false"/>
-                <w:sz w:val="18"/>
-                <w:szCs w:val="18"/>
-              </w:rPr>
-              <w:t xml:space="preserve">0.9973</w:t>
-            </w:r>
-          </w:p>
-        </w:tc>
-        <w:tc>
-          <w:tcPr>
-            <w:tcW w:type="dxa" w:w="1226"/>
-            <w:tcBorders>
-              <w:top w:val="single" w:color="BFBFBF" w:sz="4"/>
-              <w:left w:val="single" w:color="BFBFBF" w:sz="4"/>
-              <w:bottom w:val="single" w:color="BFBFBF" w:sz="4"/>
-              <w:right w:val="single" w:color="BFBFBF" w:sz="4"/>
-            </w:tcBorders>
-            <w:tcMar>
-              <w:top w:type="dxa" w:w="60"/>
-              <w:left w:type="dxa" w:w="100"/>
-              <w:bottom w:type="dxa" w:w="60"/>
-              <w:right w:type="dxa" w:w="100"/>
-            </w:tcMar>
-          </w:tcPr>
-          <w:p>
-            <w:r>
-              <w:rPr>
-                <w:b w:val="false"/>
-                <w:bCs w:val="false"/>
-                <w:sz w:val="18"/>
-                <w:szCs w:val="18"/>
-              </w:rPr>
               <w:t xml:space="preserve">3.8 %</w:t>
+            </w:r>
+          </w:p>
+        </w:tc>
+        <w:tc>
+          <w:tcPr>
+            <w:tcW w:type="dxa" w:w="1100"/>
+            <w:tcBorders>
+              <w:top w:val="single" w:color="BFBFBF" w:sz="4"/>
+              <w:left w:val="single" w:color="BFBFBF" w:sz="4"/>
+              <w:bottom w:val="single" w:color="BFBFBF" w:sz="4"/>
+              <w:right w:val="single" w:color="BFBFBF" w:sz="4"/>
+            </w:tcBorders>
+            <w:tcMar>
+              <w:top w:type="dxa" w:w="60"/>
+              <w:left w:type="dxa" w:w="100"/>
+              <w:bottom w:type="dxa" w:w="60"/>
+              <w:right w:type="dxa" w:w="100"/>
+            </w:tcMar>
+          </w:tcPr>
+          <w:p>
+            <w:r>
+              <w:rPr>
+                <w:b w:val="false"/>
+                <w:bCs w:val="false"/>
+                <w:sz w:val="18"/>
+                <w:szCs w:val="18"/>
+              </w:rPr>
+              <w:t xml:space="preserve">-896.6</w:t>
+            </w:r>
+          </w:p>
+        </w:tc>
+        <w:tc>
+          <w:tcPr>
+            <w:tcW w:type="dxa" w:w="1100"/>
+            <w:tcBorders>
+              <w:top w:val="single" w:color="BFBFBF" w:sz="4"/>
+              <w:left w:val="single" w:color="BFBFBF" w:sz="4"/>
+              <w:bottom w:val="single" w:color="BFBFBF" w:sz="4"/>
+              <w:right w:val="single" w:color="BFBFBF" w:sz="4"/>
+            </w:tcBorders>
+            <w:tcMar>
+              <w:top w:type="dxa" w:w="60"/>
+              <w:left w:type="dxa" w:w="100"/>
+              <w:bottom w:type="dxa" w:w="60"/>
+              <w:right w:type="dxa" w:w="100"/>
+            </w:tcMar>
+          </w:tcPr>
+          <w:p>
+            <w:r>
+              <w:rPr>
+                <w:b w:val="false"/>
+                <w:bCs w:val="false"/>
+                <w:sz w:val="18"/>
+                <w:szCs w:val="18"/>
+              </w:rPr>
+              <w:t xml:space="preserve">-844.5</w:t>
+            </w:r>
+          </w:p>
+        </w:tc>
+        <w:tc>
+          <w:tcPr>
+            <w:tcW w:type="dxa" w:w="1326"/>
+            <w:tcBorders>
+              <w:top w:val="single" w:color="BFBFBF" w:sz="4"/>
+              <w:left w:val="single" w:color="BFBFBF" w:sz="4"/>
+              <w:bottom w:val="single" w:color="BFBFBF" w:sz="4"/>
+              <w:right w:val="single" w:color="BFBFBF" w:sz="4"/>
+            </w:tcBorders>
+            <w:tcMar>
+              <w:top w:type="dxa" w:w="60"/>
+              <w:left w:type="dxa" w:w="100"/>
+              <w:bottom w:type="dxa" w:w="60"/>
+              <w:right w:type="dxa" w:w="100"/>
+            </w:tcMar>
+          </w:tcPr>
+          <w:p>
+            <w:r>
+              <w:rPr>
+                <w:b w:val="false"/>
+                <w:bCs w:val="false"/>
+                <w:sz w:val="18"/>
+                <w:szCs w:val="18"/>
+              </w:rPr>
+              <w:t xml:space="preserve">0.0</w:t>
             </w:r>
           </w:p>
         </w:tc>
@@ -6171,7 +6171,7 @@
         </w:tc>
         <w:tc>
           <w:tcPr>
-            <w:tcW w:type="dxa" w:w="2200"/>
+            <w:tcW w:type="dxa" w:w="2300"/>
             <w:tcBorders>
               <w:top w:val="single" w:color="BFBFBF" w:sz="4"/>
               <w:left w:val="single" w:color="BFBFBF" w:sz="4"/>
@@ -6199,6 +6199,34 @@
         </w:tc>
         <w:tc>
           <w:tcPr>
+            <w:tcW w:type="dxa" w:w="1000"/>
+            <w:tcBorders>
+              <w:top w:val="single" w:color="BFBFBF" w:sz="4"/>
+              <w:left w:val="single" w:color="BFBFBF" w:sz="4"/>
+              <w:bottom w:val="single" w:color="BFBFBF" w:sz="4"/>
+              <w:right w:val="single" w:color="BFBFBF" w:sz="4"/>
+            </w:tcBorders>
+            <w:tcMar>
+              <w:top w:type="dxa" w:w="60"/>
+              <w:left w:type="dxa" w:w="100"/>
+              <w:bottom w:type="dxa" w:w="60"/>
+              <w:right w:type="dxa" w:w="100"/>
+            </w:tcMar>
+          </w:tcPr>
+          <w:p>
+            <w:r>
+              <w:rPr>
+                <w:b w:val="false"/>
+                <w:bCs w:val="false"/>
+                <w:sz w:val="18"/>
+                <w:szCs w:val="18"/>
+              </w:rPr>
+              <w:t xml:space="preserve">0.9978</w:t>
+            </w:r>
+          </w:p>
+        </w:tc>
+        <w:tc>
+          <w:tcPr>
             <w:tcW w:type="dxa" w:w="1300"/>
             <w:tcBorders>
               <w:top w:val="single" w:color="BFBFBF" w:sz="4"/>
@@ -6221,119 +6249,91 @@
                 <w:sz w:val="18"/>
                 <w:szCs w:val="18"/>
               </w:rPr>
-              <w:t xml:space="preserve">2880.8</w:t>
-            </w:r>
-          </w:p>
-        </w:tc>
-        <w:tc>
-          <w:tcPr>
-            <w:tcW w:type="dxa" w:w="1300"/>
-            <w:tcBorders>
-              <w:top w:val="single" w:color="BFBFBF" w:sz="4"/>
-              <w:left w:val="single" w:color="BFBFBF" w:sz="4"/>
-              <w:bottom w:val="single" w:color="BFBFBF" w:sz="4"/>
-              <w:right w:val="single" w:color="BFBFBF" w:sz="4"/>
-            </w:tcBorders>
-            <w:tcMar>
-              <w:top w:type="dxa" w:w="60"/>
-              <w:left w:type="dxa" w:w="100"/>
-              <w:bottom w:type="dxa" w:w="60"/>
-              <w:right w:type="dxa" w:w="100"/>
-            </w:tcMar>
-          </w:tcPr>
-          <w:p>
-            <w:r>
-              <w:rPr>
-                <w:b w:val="false"/>
-                <w:bCs w:val="false"/>
-                <w:sz w:val="18"/>
-                <w:szCs w:val="18"/>
-              </w:rPr>
-              <w:t xml:space="preserve">60.0 (limit)</w:t>
-            </w:r>
-          </w:p>
-        </w:tc>
-        <w:tc>
-          <w:tcPr>
-            <w:tcW w:type="dxa" w:w="1200"/>
-            <w:tcBorders>
-              <w:top w:val="single" w:color="BFBFBF" w:sz="4"/>
-              <w:left w:val="single" w:color="BFBFBF" w:sz="4"/>
-              <w:bottom w:val="single" w:color="BFBFBF" w:sz="4"/>
-              <w:right w:val="single" w:color="BFBFBF" w:sz="4"/>
-            </w:tcBorders>
-            <w:tcMar>
-              <w:top w:type="dxa" w:w="60"/>
-              <w:left w:type="dxa" w:w="100"/>
-              <w:bottom w:type="dxa" w:w="60"/>
-              <w:right w:type="dxa" w:w="100"/>
-            </w:tcMar>
-          </w:tcPr>
-          <w:p>
-            <w:r>
-              <w:rPr>
-                <w:b w:val="false"/>
-                <w:bCs w:val="false"/>
-                <w:sz w:val="18"/>
-                <w:szCs w:val="18"/>
-              </w:rPr>
-              <w:t xml:space="preserve">15.9</w:t>
-            </w:r>
-          </w:p>
-        </w:tc>
-        <w:tc>
-          <w:tcPr>
-            <w:tcW w:type="dxa" w:w="900"/>
-            <w:tcBorders>
-              <w:top w:val="single" w:color="BFBFBF" w:sz="4"/>
-              <w:left w:val="single" w:color="BFBFBF" w:sz="4"/>
-              <w:bottom w:val="single" w:color="BFBFBF" w:sz="4"/>
-              <w:right w:val="single" w:color="BFBFBF" w:sz="4"/>
-            </w:tcBorders>
-            <w:tcMar>
-              <w:top w:type="dxa" w:w="60"/>
-              <w:left w:type="dxa" w:w="100"/>
-              <w:bottom w:type="dxa" w:w="60"/>
-              <w:right w:type="dxa" w:w="100"/>
-            </w:tcMar>
-          </w:tcPr>
-          <w:p>
-            <w:r>
-              <w:rPr>
-                <w:b w:val="false"/>
-                <w:bCs w:val="false"/>
-                <w:sz w:val="18"/>
-                <w:szCs w:val="18"/>
-              </w:rPr>
-              <w:t xml:space="preserve">0.9978</w:t>
-            </w:r>
-          </w:p>
-        </w:tc>
-        <w:tc>
-          <w:tcPr>
-            <w:tcW w:type="dxa" w:w="1226"/>
-            <w:tcBorders>
-              <w:top w:val="single" w:color="BFBFBF" w:sz="4"/>
-              <w:left w:val="single" w:color="BFBFBF" w:sz="4"/>
-              <w:bottom w:val="single" w:color="BFBFBF" w:sz="4"/>
-              <w:right w:val="single" w:color="BFBFBF" w:sz="4"/>
-            </w:tcBorders>
-            <w:tcMar>
-              <w:top w:type="dxa" w:w="60"/>
-              <w:left w:type="dxa" w:w="100"/>
-              <w:bottom w:type="dxa" w:w="60"/>
-              <w:right w:type="dxa" w:w="100"/>
-            </w:tcMar>
-          </w:tcPr>
-          <w:p>
-            <w:r>
-              <w:rPr>
-                <w:b w:val="false"/>
-                <w:bCs w:val="false"/>
-                <w:sz w:val="18"/>
-                <w:szCs w:val="18"/>
-              </w:rPr>
               <w:t xml:space="preserve">2.9 %</w:t>
+            </w:r>
+          </w:p>
+        </w:tc>
+        <w:tc>
+          <w:tcPr>
+            <w:tcW w:type="dxa" w:w="1100"/>
+            <w:tcBorders>
+              <w:top w:val="single" w:color="BFBFBF" w:sz="4"/>
+              <w:left w:val="single" w:color="BFBFBF" w:sz="4"/>
+              <w:bottom w:val="single" w:color="BFBFBF" w:sz="4"/>
+              <w:right w:val="single" w:color="BFBFBF" w:sz="4"/>
+            </w:tcBorders>
+            <w:tcMar>
+              <w:top w:type="dxa" w:w="60"/>
+              <w:left w:type="dxa" w:w="100"/>
+              <w:bottom w:type="dxa" w:w="60"/>
+              <w:right w:type="dxa" w:w="100"/>
+            </w:tcMar>
+          </w:tcPr>
+          <w:p>
+            <w:r>
+              <w:rPr>
+                <w:b w:val="false"/>
+                <w:bCs w:val="false"/>
+                <w:sz w:val="18"/>
+                <w:szCs w:val="18"/>
+              </w:rPr>
+              <w:t xml:space="preserve">-925.5</w:t>
+            </w:r>
+          </w:p>
+        </w:tc>
+        <w:tc>
+          <w:tcPr>
+            <w:tcW w:type="dxa" w:w="1100"/>
+            <w:tcBorders>
+              <w:top w:val="single" w:color="BFBFBF" w:sz="4"/>
+              <w:left w:val="single" w:color="BFBFBF" w:sz="4"/>
+              <w:bottom w:val="single" w:color="BFBFBF" w:sz="4"/>
+              <w:right w:val="single" w:color="BFBFBF" w:sz="4"/>
+            </w:tcBorders>
+            <w:tcMar>
+              <w:top w:type="dxa" w:w="60"/>
+              <w:left w:type="dxa" w:w="100"/>
+              <w:bottom w:type="dxa" w:w="60"/>
+              <w:right w:type="dxa" w:w="100"/>
+            </w:tcMar>
+          </w:tcPr>
+          <w:p>
+            <w:r>
+              <w:rPr>
+                <w:b w:val="false"/>
+                <w:bCs w:val="false"/>
+                <w:sz w:val="18"/>
+                <w:szCs w:val="18"/>
+              </w:rPr>
+              <w:t xml:space="preserve">-870.3</w:t>
+            </w:r>
+          </w:p>
+        </w:tc>
+        <w:tc>
+          <w:tcPr>
+            <w:tcW w:type="dxa" w:w="1326"/>
+            <w:tcBorders>
+              <w:top w:val="single" w:color="BFBFBF" w:sz="4"/>
+              <w:left w:val="single" w:color="BFBFBF" w:sz="4"/>
+              <w:bottom w:val="single" w:color="BFBFBF" w:sz="4"/>
+              <w:right w:val="single" w:color="BFBFBF" w:sz="4"/>
+            </w:tcBorders>
+            <w:tcMar>
+              <w:top w:type="dxa" w:w="60"/>
+              <w:left w:type="dxa" w:w="100"/>
+              <w:bottom w:type="dxa" w:w="60"/>
+              <w:right w:type="dxa" w:w="100"/>
+            </w:tcMar>
+          </w:tcPr>
+          <w:p>
+            <w:r>
+              <w:rPr>
+                <w:b w:val="false"/>
+                <w:bCs w:val="false"/>
+                <w:sz w:val="18"/>
+                <w:szCs w:val="18"/>
+              </w:rPr>
+              <w:t xml:space="preserve">0.59</w:t>
             </w:r>
           </w:p>
         </w:tc>
@@ -6369,7 +6369,7 @@
         </w:tc>
         <w:tc>
           <w:tcPr>
-            <w:tcW w:type="dxa" w:w="2200"/>
+            <w:tcW w:type="dxa" w:w="2300"/>
             <w:tcBorders>
               <w:top w:val="single" w:color="BFBFBF" w:sz="4"/>
               <w:left w:val="single" w:color="BFBFBF" w:sz="4"/>
@@ -6397,6 +6397,34 @@
         </w:tc>
         <w:tc>
           <w:tcPr>
+            <w:tcW w:type="dxa" w:w="1000"/>
+            <w:tcBorders>
+              <w:top w:val="single" w:color="BFBFBF" w:sz="4"/>
+              <w:left w:val="single" w:color="BFBFBF" w:sz="4"/>
+              <w:bottom w:val="single" w:color="BFBFBF" w:sz="4"/>
+              <w:right w:val="single" w:color="BFBFBF" w:sz="4"/>
+            </w:tcBorders>
+            <w:tcMar>
+              <w:top w:type="dxa" w:w="60"/>
+              <w:left w:type="dxa" w:w="100"/>
+              <w:bottom w:type="dxa" w:w="60"/>
+              <w:right w:type="dxa" w:w="100"/>
+            </w:tcMar>
+          </w:tcPr>
+          <w:p>
+            <w:r>
+              <w:rPr>
+                <w:b w:val="false"/>
+                <w:bCs w:val="false"/>
+                <w:sz w:val="18"/>
+                <w:szCs w:val="18"/>
+              </w:rPr>
+              <w:t xml:space="preserve">0.9977</w:t>
+            </w:r>
+          </w:p>
+        </w:tc>
+        <w:tc>
+          <w:tcPr>
             <w:tcW w:type="dxa" w:w="1300"/>
             <w:tcBorders>
               <w:top w:val="single" w:color="BFBFBF" w:sz="4"/>
@@ -6419,119 +6447,91 @@
                 <w:sz w:val="18"/>
                 <w:szCs w:val="18"/>
               </w:rPr>
-              <w:t xml:space="preserve">2875.2</w:t>
-            </w:r>
-          </w:p>
-        </w:tc>
-        <w:tc>
-          <w:tcPr>
-            <w:tcW w:type="dxa" w:w="1300"/>
-            <w:tcBorders>
-              <w:top w:val="single" w:color="BFBFBF" w:sz="4"/>
-              <w:left w:val="single" w:color="BFBFBF" w:sz="4"/>
-              <w:bottom w:val="single" w:color="BFBFBF" w:sz="4"/>
-              <w:right w:val="single" w:color="BFBFBF" w:sz="4"/>
-            </w:tcBorders>
-            <w:tcMar>
-              <w:top w:type="dxa" w:w="60"/>
-              <w:left w:type="dxa" w:w="100"/>
-              <w:bottom w:type="dxa" w:w="60"/>
-              <w:right w:type="dxa" w:w="100"/>
-            </w:tcMar>
-          </w:tcPr>
-          <w:p>
-            <w:r>
-              <w:rPr>
-                <w:b w:val="false"/>
-                <w:bCs w:val="false"/>
-                <w:sz w:val="18"/>
-                <w:szCs w:val="18"/>
-              </w:rPr>
-              <w:t xml:space="preserve">60.0 (limit)</w:t>
-            </w:r>
-          </w:p>
-        </w:tc>
-        <w:tc>
-          <w:tcPr>
-            <w:tcW w:type="dxa" w:w="1200"/>
-            <w:tcBorders>
-              <w:top w:val="single" w:color="BFBFBF" w:sz="4"/>
-              <w:left w:val="single" w:color="BFBFBF" w:sz="4"/>
-              <w:bottom w:val="single" w:color="BFBFBF" w:sz="4"/>
-              <w:right w:val="single" w:color="BFBFBF" w:sz="4"/>
-            </w:tcBorders>
-            <w:tcMar>
-              <w:top w:type="dxa" w:w="60"/>
-              <w:left w:type="dxa" w:w="100"/>
-              <w:bottom w:type="dxa" w:w="60"/>
-              <w:right w:type="dxa" w:w="100"/>
-            </w:tcMar>
-          </w:tcPr>
-          <w:p>
-            <w:r>
-              <w:rPr>
-                <w:b w:val="false"/>
-                <w:bCs w:val="false"/>
-                <w:sz w:val="18"/>
-                <w:szCs w:val="18"/>
-              </w:rPr>
-              <w:t xml:space="preserve">10.2</w:t>
-            </w:r>
-          </w:p>
-        </w:tc>
-        <w:tc>
-          <w:tcPr>
-            <w:tcW w:type="dxa" w:w="900"/>
-            <w:tcBorders>
-              <w:top w:val="single" w:color="BFBFBF" w:sz="4"/>
-              <w:left w:val="single" w:color="BFBFBF" w:sz="4"/>
-              <w:bottom w:val="single" w:color="BFBFBF" w:sz="4"/>
-              <w:right w:val="single" w:color="BFBFBF" w:sz="4"/>
-            </w:tcBorders>
-            <w:tcMar>
-              <w:top w:type="dxa" w:w="60"/>
-              <w:left w:type="dxa" w:w="100"/>
-              <w:bottom w:type="dxa" w:w="60"/>
-              <w:right w:type="dxa" w:w="100"/>
-            </w:tcMar>
-          </w:tcPr>
-          <w:p>
-            <w:r>
-              <w:rPr>
-                <w:b w:val="false"/>
-                <w:bCs w:val="false"/>
-                <w:sz w:val="18"/>
-                <w:szCs w:val="18"/>
-              </w:rPr>
-              <w:t xml:space="preserve">0.9977</w:t>
-            </w:r>
-          </w:p>
-        </w:tc>
-        <w:tc>
-          <w:tcPr>
-            <w:tcW w:type="dxa" w:w="1226"/>
-            <w:tcBorders>
-              <w:top w:val="single" w:color="BFBFBF" w:sz="4"/>
-              <w:left w:val="single" w:color="BFBFBF" w:sz="4"/>
-              <w:bottom w:val="single" w:color="BFBFBF" w:sz="4"/>
-              <w:right w:val="single" w:color="BFBFBF" w:sz="4"/>
-            </w:tcBorders>
-            <w:tcMar>
-              <w:top w:type="dxa" w:w="60"/>
-              <w:left w:type="dxa" w:w="100"/>
-              <w:bottom w:type="dxa" w:w="60"/>
-              <w:right w:type="dxa" w:w="100"/>
-            </w:tcMar>
-          </w:tcPr>
-          <w:p>
-            <w:r>
-              <w:rPr>
-                <w:b w:val="false"/>
-                <w:bCs w:val="false"/>
-                <w:sz w:val="18"/>
-                <w:szCs w:val="18"/>
-              </w:rPr>
               <w:t xml:space="preserve">3.0 %</w:t>
+            </w:r>
+          </w:p>
+        </w:tc>
+        <w:tc>
+          <w:tcPr>
+            <w:tcW w:type="dxa" w:w="1100"/>
+            <w:tcBorders>
+              <w:top w:val="single" w:color="BFBFBF" w:sz="4"/>
+              <w:left w:val="single" w:color="BFBFBF" w:sz="4"/>
+              <w:bottom w:val="single" w:color="BFBFBF" w:sz="4"/>
+              <w:right w:val="single" w:color="BFBFBF" w:sz="4"/>
+            </w:tcBorders>
+            <w:tcMar>
+              <w:top w:type="dxa" w:w="60"/>
+              <w:left w:type="dxa" w:w="100"/>
+              <w:bottom w:type="dxa" w:w="60"/>
+              <w:right w:type="dxa" w:w="100"/>
+            </w:tcMar>
+          </w:tcPr>
+          <w:p>
+            <w:r>
+              <w:rPr>
+                <w:b w:val="false"/>
+                <w:bCs w:val="false"/>
+                <w:sz w:val="18"/>
+                <w:szCs w:val="18"/>
+              </w:rPr>
+              <w:t xml:space="preserve">-920.7</w:t>
+            </w:r>
+          </w:p>
+        </w:tc>
+        <w:tc>
+          <w:tcPr>
+            <w:tcW w:type="dxa" w:w="1100"/>
+            <w:tcBorders>
+              <w:top w:val="single" w:color="BFBFBF" w:sz="4"/>
+              <w:left w:val="single" w:color="BFBFBF" w:sz="4"/>
+              <w:bottom w:val="single" w:color="BFBFBF" w:sz="4"/>
+              <w:right w:val="single" w:color="BFBFBF" w:sz="4"/>
+            </w:tcBorders>
+            <w:tcMar>
+              <w:top w:type="dxa" w:w="60"/>
+              <w:left w:type="dxa" w:w="100"/>
+              <w:bottom w:type="dxa" w:w="60"/>
+              <w:right w:type="dxa" w:w="100"/>
+            </w:tcMar>
+          </w:tcPr>
+          <w:p>
+            <w:r>
+              <w:rPr>
+                <w:b w:val="false"/>
+                <w:bCs w:val="false"/>
+                <w:sz w:val="18"/>
+                <w:szCs w:val="18"/>
+              </w:rPr>
+              <w:t xml:space="preserve">-868.7</w:t>
+            </w:r>
+          </w:p>
+        </w:tc>
+        <w:tc>
+          <w:tcPr>
+            <w:tcW w:type="dxa" w:w="1326"/>
+            <w:tcBorders>
+              <w:top w:val="single" w:color="BFBFBF" w:sz="4"/>
+              <w:left w:val="single" w:color="BFBFBF" w:sz="4"/>
+              <w:bottom w:val="single" w:color="BFBFBF" w:sz="4"/>
+              <w:right w:val="single" w:color="BFBFBF" w:sz="4"/>
+            </w:tcBorders>
+            <w:tcMar>
+              <w:top w:type="dxa" w:w="60"/>
+              <w:left w:type="dxa" w:w="100"/>
+              <w:bottom w:type="dxa" w:w="60"/>
+              <w:right w:type="dxa" w:w="100"/>
+            </w:tcMar>
+          </w:tcPr>
+          <w:p>
+            <w:r>
+              <w:rPr>
+                <w:b w:val="false"/>
+                <w:bCs w:val="false"/>
+                <w:sz w:val="18"/>
+                <w:szCs w:val="18"/>
+              </w:rPr>
+              <w:t xml:space="preserve">1.0</w:t>
             </w:r>
           </w:p>
         </w:tc>
@@ -6567,7 +6567,7 @@
         </w:tc>
         <w:tc>
           <w:tcPr>
-            <w:tcW w:type="dxa" w:w="2200"/>
+            <w:tcW w:type="dxa" w:w="2300"/>
             <w:tcBorders>
               <w:top w:val="single" w:color="BFBFBF" w:sz="4"/>
               <w:left w:val="single" w:color="BFBFBF" w:sz="4"/>
@@ -6595,6 +6595,34 @@
         </w:tc>
         <w:tc>
           <w:tcPr>
+            <w:tcW w:type="dxa" w:w="1000"/>
+            <w:tcBorders>
+              <w:top w:val="single" w:color="BFBFBF" w:sz="4"/>
+              <w:left w:val="single" w:color="BFBFBF" w:sz="4"/>
+              <w:bottom w:val="single" w:color="BFBFBF" w:sz="4"/>
+              <w:right w:val="single" w:color="BFBFBF" w:sz="4"/>
+            </w:tcBorders>
+            <w:tcMar>
+              <w:top w:type="dxa" w:w="60"/>
+              <w:left w:type="dxa" w:w="100"/>
+              <w:bottom w:type="dxa" w:w="60"/>
+              <w:right w:type="dxa" w:w="100"/>
+            </w:tcMar>
+          </w:tcPr>
+          <w:p>
+            <w:r>
+              <w:rPr>
+                <w:b w:val="false"/>
+                <w:bCs w:val="false"/>
+                <w:sz w:val="18"/>
+                <w:szCs w:val="18"/>
+              </w:rPr>
+              <w:t xml:space="preserve">0.9997</w:t>
+            </w:r>
+          </w:p>
+        </w:tc>
+        <w:tc>
+          <w:tcPr>
             <w:tcW w:type="dxa" w:w="1300"/>
             <w:tcBorders>
               <w:top w:val="single" w:color="BFBFBF" w:sz="4"/>
@@ -6617,119 +6645,91 @@
                 <w:sz w:val="18"/>
                 <w:szCs w:val="18"/>
               </w:rPr>
-              <w:t xml:space="preserve">2886.4</w:t>
-            </w:r>
-          </w:p>
-        </w:tc>
-        <w:tc>
-          <w:tcPr>
-            <w:tcW w:type="dxa" w:w="1300"/>
-            <w:tcBorders>
-              <w:top w:val="single" w:color="BFBFBF" w:sz="4"/>
-              <w:left w:val="single" w:color="BFBFBF" w:sz="4"/>
-              <w:bottom w:val="single" w:color="BFBFBF" w:sz="4"/>
-              <w:right w:val="single" w:color="BFBFBF" w:sz="4"/>
-            </w:tcBorders>
-            <w:tcMar>
-              <w:top w:type="dxa" w:w="60"/>
-              <w:left w:type="dxa" w:w="100"/>
-              <w:bottom w:type="dxa" w:w="60"/>
-              <w:right w:type="dxa" w:w="100"/>
-            </w:tcMar>
-          </w:tcPr>
-          <w:p>
-            <w:r>
-              <w:rPr>
-                <w:b w:val="false"/>
-                <w:bCs w:val="false"/>
-                <w:sz w:val="18"/>
-                <w:szCs w:val="18"/>
-              </w:rPr>
-              <w:t xml:space="preserve">43.2</w:t>
-            </w:r>
-          </w:p>
-        </w:tc>
-        <w:tc>
-          <w:tcPr>
-            <w:tcW w:type="dxa" w:w="1200"/>
-            <w:tcBorders>
-              <w:top w:val="single" w:color="BFBFBF" w:sz="4"/>
-              <w:left w:val="single" w:color="BFBFBF" w:sz="4"/>
-              <w:bottom w:val="single" w:color="BFBFBF" w:sz="4"/>
-              <w:right w:val="single" w:color="BFBFBF" w:sz="4"/>
-            </w:tcBorders>
-            <w:tcMar>
-              <w:top w:type="dxa" w:w="60"/>
-              <w:left w:type="dxa" w:w="100"/>
-              <w:bottom w:type="dxa" w:w="60"/>
-              <w:right w:type="dxa" w:w="100"/>
-            </w:tcMar>
-          </w:tcPr>
-          <w:p>
-            <w:r>
-              <w:rPr>
-                <w:b w:val="false"/>
-                <w:bCs w:val="false"/>
-                <w:sz w:val="18"/>
-                <w:szCs w:val="18"/>
-              </w:rPr>
-              <w:t xml:space="preserve">22.5</w:t>
-            </w:r>
-          </w:p>
-        </w:tc>
-        <w:tc>
-          <w:tcPr>
-            <w:tcW w:type="dxa" w:w="900"/>
-            <w:tcBorders>
-              <w:top w:val="single" w:color="BFBFBF" w:sz="4"/>
-              <w:left w:val="single" w:color="BFBFBF" w:sz="4"/>
-              <w:bottom w:val="single" w:color="BFBFBF" w:sz="4"/>
-              <w:right w:val="single" w:color="BFBFBF" w:sz="4"/>
-            </w:tcBorders>
-            <w:tcMar>
-              <w:top w:type="dxa" w:w="60"/>
-              <w:left w:type="dxa" w:w="100"/>
-              <w:bottom w:type="dxa" w:w="60"/>
-              <w:right w:type="dxa" w:w="100"/>
-            </w:tcMar>
-          </w:tcPr>
-          <w:p>
-            <w:r>
-              <w:rPr>
-                <w:b w:val="false"/>
-                <w:bCs w:val="false"/>
-                <w:sz w:val="18"/>
-                <w:szCs w:val="18"/>
-              </w:rPr>
-              <w:t xml:space="preserve">0.9997</w:t>
-            </w:r>
-          </w:p>
-        </w:tc>
-        <w:tc>
-          <w:tcPr>
-            <w:tcW w:type="dxa" w:w="1226"/>
-            <w:tcBorders>
-              <w:top w:val="single" w:color="BFBFBF" w:sz="4"/>
-              <w:left w:val="single" w:color="BFBFBF" w:sz="4"/>
-              <w:bottom w:val="single" w:color="BFBFBF" w:sz="4"/>
-              <w:right w:val="single" w:color="BFBFBF" w:sz="4"/>
-            </w:tcBorders>
-            <w:tcMar>
-              <w:top w:type="dxa" w:w="60"/>
-              <w:left w:type="dxa" w:w="100"/>
-              <w:bottom w:type="dxa" w:w="60"/>
-              <w:right w:type="dxa" w:w="100"/>
-            </w:tcMar>
-          </w:tcPr>
-          <w:p>
-            <w:r>
-              <w:rPr>
-                <w:b w:val="false"/>
-                <w:bCs w:val="false"/>
-                <w:sz w:val="18"/>
-                <w:szCs w:val="18"/>
-              </w:rPr>
               <w:t xml:space="preserve">2.2 %</w:t>
+            </w:r>
+          </w:p>
+        </w:tc>
+        <w:tc>
+          <w:tcPr>
+            <w:tcW w:type="dxa" w:w="1100"/>
+            <w:tcBorders>
+              <w:top w:val="single" w:color="BFBFBF" w:sz="4"/>
+              <w:left w:val="single" w:color="BFBFBF" w:sz="4"/>
+              <w:bottom w:val="single" w:color="BFBFBF" w:sz="4"/>
+              <w:right w:val="single" w:color="BFBFBF" w:sz="4"/>
+            </w:tcBorders>
+            <w:tcMar>
+              <w:top w:type="dxa" w:w="60"/>
+              <w:left w:type="dxa" w:w="100"/>
+              <w:bottom w:type="dxa" w:w="60"/>
+              <w:right w:type="dxa" w:w="100"/>
+            </w:tcMar>
+          </w:tcPr>
+          <w:p>
+            <w:r>
+              <w:rPr>
+                <w:b w:val="false"/>
+                <w:bCs w:val="false"/>
+                <w:sz w:val="18"/>
+                <w:szCs w:val="18"/>
+              </w:rPr>
+              <w:t xml:space="preserve">-1208.7</w:t>
+            </w:r>
+          </w:p>
+        </w:tc>
+        <w:tc>
+          <w:tcPr>
+            <w:tcW w:type="dxa" w:w="1100"/>
+            <w:tcBorders>
+              <w:top w:val="single" w:color="BFBFBF" w:sz="4"/>
+              <w:left w:val="single" w:color="BFBFBF" w:sz="4"/>
+              <w:bottom w:val="single" w:color="BFBFBF" w:sz="4"/>
+              <w:right w:val="single" w:color="BFBFBF" w:sz="4"/>
+            </w:tcBorders>
+            <w:tcMar>
+              <w:top w:type="dxa" w:w="60"/>
+              <w:left w:type="dxa" w:w="100"/>
+              <w:bottom w:type="dxa" w:w="60"/>
+              <w:right w:type="dxa" w:w="100"/>
+            </w:tcMar>
+          </w:tcPr>
+          <w:p>
+            <w:r>
+              <w:rPr>
+                <w:b w:val="false"/>
+                <w:bCs w:val="false"/>
+                <w:sz w:val="18"/>
+                <w:szCs w:val="18"/>
+              </w:rPr>
+              <w:t xml:space="preserve">-1156.6</w:t>
+            </w:r>
+          </w:p>
+        </w:tc>
+        <w:tc>
+          <w:tcPr>
+            <w:tcW w:type="dxa" w:w="1326"/>
+            <w:tcBorders>
+              <w:top w:val="single" w:color="BFBFBF" w:sz="4"/>
+              <w:left w:val="single" w:color="BFBFBF" w:sz="4"/>
+              <w:bottom w:val="single" w:color="BFBFBF" w:sz="4"/>
+              <w:right w:val="single" w:color="BFBFBF" w:sz="4"/>
+            </w:tcBorders>
+            <w:tcMar>
+              <w:top w:type="dxa" w:w="60"/>
+              <w:left w:type="dxa" w:w="100"/>
+              <w:bottom w:type="dxa" w:w="60"/>
+              <w:right w:type="dxa" w:w="100"/>
+            </w:tcMar>
+          </w:tcPr>
+          <w:p>
+            <w:r>
+              <w:rPr>
+                <w:b w:val="false"/>
+                <w:bCs w:val="false"/>
+                <w:sz w:val="18"/>
+                <w:szCs w:val="18"/>
+              </w:rPr>
+              <w:t xml:space="preserve">0.0</w:t>
             </w:r>
           </w:p>
         </w:tc>
@@ -6765,7 +6765,7 @@
         </w:tc>
         <w:tc>
           <w:tcPr>
-            <w:tcW w:type="dxa" w:w="2200"/>
+            <w:tcW w:type="dxa" w:w="2300"/>
             <w:tcBorders>
               <w:top w:val="single" w:color="BFBFBF" w:sz="4"/>
               <w:left w:val="single" w:color="BFBFBF" w:sz="4"/>
@@ -6793,6 +6793,34 @@
         </w:tc>
         <w:tc>
           <w:tcPr>
+            <w:tcW w:type="dxa" w:w="1000"/>
+            <w:tcBorders>
+              <w:top w:val="single" w:color="BFBFBF" w:sz="4"/>
+              <w:left w:val="single" w:color="BFBFBF" w:sz="4"/>
+              <w:bottom w:val="single" w:color="BFBFBF" w:sz="4"/>
+              <w:right w:val="single" w:color="BFBFBF" w:sz="4"/>
+            </w:tcBorders>
+            <w:tcMar>
+              <w:top w:type="dxa" w:w="60"/>
+              <w:left w:type="dxa" w:w="100"/>
+              <w:bottom w:type="dxa" w:w="60"/>
+              <w:right w:type="dxa" w:w="100"/>
+            </w:tcMar>
+          </w:tcPr>
+          <w:p>
+            <w:r>
+              <w:rPr>
+                <w:b w:val="false"/>
+                <w:bCs w:val="false"/>
+                <w:sz w:val="18"/>
+                <w:szCs w:val="18"/>
+              </w:rPr>
+              <w:t xml:space="preserve">0.9997</w:t>
+            </w:r>
+          </w:p>
+        </w:tc>
+        <w:tc>
+          <w:tcPr>
             <w:tcW w:type="dxa" w:w="1300"/>
             <w:tcBorders>
               <w:top w:val="single" w:color="BFBFBF" w:sz="4"/>
@@ -6815,119 +6843,91 @@
                 <w:sz w:val="18"/>
                 <w:szCs w:val="18"/>
               </w:rPr>
-              <w:t xml:space="preserve">2886.4</w:t>
-            </w:r>
-          </w:p>
-        </w:tc>
-        <w:tc>
-          <w:tcPr>
-            <w:tcW w:type="dxa" w:w="1300"/>
-            <w:tcBorders>
-              <w:top w:val="single" w:color="BFBFBF" w:sz="4"/>
-              <w:left w:val="single" w:color="BFBFBF" w:sz="4"/>
-              <w:bottom w:val="single" w:color="BFBFBF" w:sz="4"/>
-              <w:right w:val="single" w:color="BFBFBF" w:sz="4"/>
-            </w:tcBorders>
-            <w:tcMar>
-              <w:top w:type="dxa" w:w="60"/>
-              <w:left w:type="dxa" w:w="100"/>
-              <w:bottom w:type="dxa" w:w="60"/>
-              <w:right w:type="dxa" w:w="100"/>
-            </w:tcMar>
-          </w:tcPr>
-          <w:p>
-            <w:r>
-              <w:rPr>
-                <w:b w:val="false"/>
-                <w:bCs w:val="false"/>
-                <w:sz w:val="18"/>
-                <w:szCs w:val="18"/>
-              </w:rPr>
-              <w:t xml:space="preserve">43.2</w:t>
-            </w:r>
-          </w:p>
-        </w:tc>
-        <w:tc>
-          <w:tcPr>
-            <w:tcW w:type="dxa" w:w="1200"/>
-            <w:tcBorders>
-              <w:top w:val="single" w:color="BFBFBF" w:sz="4"/>
-              <w:left w:val="single" w:color="BFBFBF" w:sz="4"/>
-              <w:bottom w:val="single" w:color="BFBFBF" w:sz="4"/>
-              <w:right w:val="single" w:color="BFBFBF" w:sz="4"/>
-            </w:tcBorders>
-            <w:tcMar>
-              <w:top w:type="dxa" w:w="60"/>
-              <w:left w:type="dxa" w:w="100"/>
-              <w:bottom w:type="dxa" w:w="60"/>
-              <w:right w:type="dxa" w:w="100"/>
-            </w:tcMar>
-          </w:tcPr>
-          <w:p>
-            <w:r>
-              <w:rPr>
-                <w:b w:val="false"/>
-                <w:bCs w:val="false"/>
-                <w:sz w:val="18"/>
-                <w:szCs w:val="18"/>
-              </w:rPr>
-              <w:t xml:space="preserve">22.5</w:t>
-            </w:r>
-          </w:p>
-        </w:tc>
-        <w:tc>
-          <w:tcPr>
-            <w:tcW w:type="dxa" w:w="900"/>
-            <w:tcBorders>
-              <w:top w:val="single" w:color="BFBFBF" w:sz="4"/>
-              <w:left w:val="single" w:color="BFBFBF" w:sz="4"/>
-              <w:bottom w:val="single" w:color="BFBFBF" w:sz="4"/>
-              <w:right w:val="single" w:color="BFBFBF" w:sz="4"/>
-            </w:tcBorders>
-            <w:tcMar>
-              <w:top w:type="dxa" w:w="60"/>
-              <w:left w:type="dxa" w:w="100"/>
-              <w:bottom w:type="dxa" w:w="60"/>
-              <w:right w:type="dxa" w:w="100"/>
-            </w:tcMar>
-          </w:tcPr>
-          <w:p>
-            <w:r>
-              <w:rPr>
-                <w:b w:val="false"/>
-                <w:bCs w:val="false"/>
-                <w:sz w:val="18"/>
-                <w:szCs w:val="18"/>
-              </w:rPr>
-              <w:t xml:space="preserve">0.9997</w:t>
-            </w:r>
-          </w:p>
-        </w:tc>
-        <w:tc>
-          <w:tcPr>
-            <w:tcW w:type="dxa" w:w="1226"/>
-            <w:tcBorders>
-              <w:top w:val="single" w:color="BFBFBF" w:sz="4"/>
-              <w:left w:val="single" w:color="BFBFBF" w:sz="4"/>
-              <w:bottom w:val="single" w:color="BFBFBF" w:sz="4"/>
-              <w:right w:val="single" w:color="BFBFBF" w:sz="4"/>
-            </w:tcBorders>
-            <w:tcMar>
-              <w:top w:type="dxa" w:w="60"/>
-              <w:left w:type="dxa" w:w="100"/>
-              <w:bottom w:type="dxa" w:w="60"/>
-              <w:right w:type="dxa" w:w="100"/>
-            </w:tcMar>
-          </w:tcPr>
-          <w:p>
-            <w:r>
-              <w:rPr>
-                <w:b w:val="false"/>
-                <w:bCs w:val="false"/>
-                <w:sz w:val="18"/>
-                <w:szCs w:val="18"/>
-              </w:rPr>
               <w:t xml:space="preserve">2.2 %</w:t>
+            </w:r>
+          </w:p>
+        </w:tc>
+        <w:tc>
+          <w:tcPr>
+            <w:tcW w:type="dxa" w:w="1100"/>
+            <w:tcBorders>
+              <w:top w:val="single" w:color="BFBFBF" w:sz="4"/>
+              <w:left w:val="single" w:color="BFBFBF" w:sz="4"/>
+              <w:bottom w:val="single" w:color="BFBFBF" w:sz="4"/>
+              <w:right w:val="single" w:color="BFBFBF" w:sz="4"/>
+            </w:tcBorders>
+            <w:tcMar>
+              <w:top w:type="dxa" w:w="60"/>
+              <w:left w:type="dxa" w:w="100"/>
+              <w:bottom w:type="dxa" w:w="60"/>
+              <w:right w:type="dxa" w:w="100"/>
+            </w:tcMar>
+          </w:tcPr>
+          <w:p>
+            <w:r>
+              <w:rPr>
+                <w:b w:val="false"/>
+                <w:bCs w:val="false"/>
+                <w:sz w:val="18"/>
+                <w:szCs w:val="18"/>
+              </w:rPr>
+              <w:t xml:space="preserve">-1206.7</w:t>
+            </w:r>
+          </w:p>
+        </w:tc>
+        <w:tc>
+          <w:tcPr>
+            <w:tcW w:type="dxa" w:w="1100"/>
+            <w:tcBorders>
+              <w:top w:val="single" w:color="BFBFBF" w:sz="4"/>
+              <w:left w:val="single" w:color="BFBFBF" w:sz="4"/>
+              <w:bottom w:val="single" w:color="BFBFBF" w:sz="4"/>
+              <w:right w:val="single" w:color="BFBFBF" w:sz="4"/>
+            </w:tcBorders>
+            <w:tcMar>
+              <w:top w:type="dxa" w:w="60"/>
+              <w:left w:type="dxa" w:w="100"/>
+              <w:bottom w:type="dxa" w:w="60"/>
+              <w:right w:type="dxa" w:w="100"/>
+            </w:tcMar>
+          </w:tcPr>
+          <w:p>
+            <w:r>
+              <w:rPr>
+                <w:b w:val="false"/>
+                <w:bCs w:val="false"/>
+                <w:sz w:val="18"/>
+                <w:szCs w:val="18"/>
+              </w:rPr>
+              <w:t xml:space="preserve">-1151.6</w:t>
+            </w:r>
+          </w:p>
+        </w:tc>
+        <w:tc>
+          <w:tcPr>
+            <w:tcW w:type="dxa" w:w="1326"/>
+            <w:tcBorders>
+              <w:top w:val="single" w:color="BFBFBF" w:sz="4"/>
+              <w:left w:val="single" w:color="BFBFBF" w:sz="4"/>
+              <w:bottom w:val="single" w:color="BFBFBF" w:sz="4"/>
+              <w:right w:val="single" w:color="BFBFBF" w:sz="4"/>
+            </w:tcBorders>
+            <w:tcMar>
+              <w:top w:type="dxa" w:w="60"/>
+              <w:left w:type="dxa" w:w="100"/>
+              <w:bottom w:type="dxa" w:w="60"/>
+              <w:right w:type="dxa" w:w="100"/>
+            </w:tcMar>
+          </w:tcPr>
+          <w:p>
+            <w:r>
+              <w:rPr>
+                <w:b w:val="false"/>
+                <w:bCs w:val="false"/>
+                <w:sz w:val="18"/>
+                <w:szCs w:val="18"/>
+              </w:rPr>
+              <w:t xml:space="preserve">0.0</w:t>
             </w:r>
           </w:p>
         </w:tc>
@@ -6963,7 +6963,7 @@
         </w:tc>
         <w:tc>
           <w:tcPr>
-            <w:tcW w:type="dxa" w:w="2200"/>
+            <w:tcW w:type="dxa" w:w="2300"/>
             <w:tcBorders>
               <w:top w:val="single" w:color="BFBFBF" w:sz="4"/>
               <w:left w:val="single" w:color="BFBFBF" w:sz="4"/>
@@ -6991,6 +6991,34 @@
         </w:tc>
         <w:tc>
           <w:tcPr>
+            <w:tcW w:type="dxa" w:w="1000"/>
+            <w:tcBorders>
+              <w:top w:val="single" w:color="BFBFBF" w:sz="4"/>
+              <w:left w:val="single" w:color="BFBFBF" w:sz="4"/>
+              <w:bottom w:val="single" w:color="BFBFBF" w:sz="4"/>
+              <w:right w:val="single" w:color="BFBFBF" w:sz="4"/>
+            </w:tcBorders>
+            <w:tcMar>
+              <w:top w:type="dxa" w:w="60"/>
+              <w:left w:type="dxa" w:w="100"/>
+              <w:bottom w:type="dxa" w:w="60"/>
+              <w:right w:type="dxa" w:w="100"/>
+            </w:tcMar>
+          </w:tcPr>
+          <w:p>
+            <w:r>
+              <w:rPr>
+                <w:b w:val="false"/>
+                <w:bCs w:val="false"/>
+                <w:sz w:val="18"/>
+                <w:szCs w:val="18"/>
+              </w:rPr>
+              <w:t xml:space="preserve">0.9983</w:t>
+            </w:r>
+          </w:p>
+        </w:tc>
+        <w:tc>
+          <w:tcPr>
             <w:tcW w:type="dxa" w:w="1300"/>
             <w:tcBorders>
               <w:top w:val="single" w:color="BFBFBF" w:sz="4"/>
@@ -7013,119 +7041,91 @@
                 <w:sz w:val="18"/>
                 <w:szCs w:val="18"/>
               </w:rPr>
-              <w:t xml:space="preserve">2883.7</w:t>
-            </w:r>
-          </w:p>
-        </w:tc>
-        <w:tc>
-          <w:tcPr>
-            <w:tcW w:type="dxa" w:w="1300"/>
-            <w:tcBorders>
-              <w:top w:val="single" w:color="BFBFBF" w:sz="4"/>
-              <w:left w:val="single" w:color="BFBFBF" w:sz="4"/>
-              <w:bottom w:val="single" w:color="BFBFBF" w:sz="4"/>
-              <w:right w:val="single" w:color="BFBFBF" w:sz="4"/>
-            </w:tcBorders>
-            <w:tcMar>
-              <w:top w:type="dxa" w:w="60"/>
-              <w:left w:type="dxa" w:w="100"/>
-              <w:bottom w:type="dxa" w:w="60"/>
-              <w:right w:type="dxa" w:w="100"/>
-            </w:tcMar>
-          </w:tcPr>
-          <w:p>
-            <w:r>
-              <w:rPr>
-                <w:b w:val="false"/>
-                <w:bCs w:val="false"/>
-                <w:sz w:val="18"/>
-                <w:szCs w:val="18"/>
-              </w:rPr>
-              <w:t xml:space="preserve">33.7</w:t>
-            </w:r>
-          </w:p>
-        </w:tc>
-        <w:tc>
-          <w:tcPr>
-            <w:tcW w:type="dxa" w:w="1200"/>
-            <w:tcBorders>
-              <w:top w:val="single" w:color="BFBFBF" w:sz="4"/>
-              <w:left w:val="single" w:color="BFBFBF" w:sz="4"/>
-              <w:bottom w:val="single" w:color="BFBFBF" w:sz="4"/>
-              <w:right w:val="single" w:color="BFBFBF" w:sz="4"/>
-            </w:tcBorders>
-            <w:tcMar>
-              <w:top w:type="dxa" w:w="60"/>
-              <w:left w:type="dxa" w:w="100"/>
-              <w:bottom w:type="dxa" w:w="60"/>
-              <w:right w:type="dxa" w:w="100"/>
-            </w:tcMar>
-          </w:tcPr>
-          <w:p>
-            <w:r>
-              <w:rPr>
-                <w:b w:val="false"/>
-                <w:bCs w:val="false"/>
-                <w:sz w:val="18"/>
-                <w:szCs w:val="18"/>
-              </w:rPr>
-              <w:t xml:space="preserve">10.0</w:t>
-            </w:r>
-          </w:p>
-        </w:tc>
-        <w:tc>
-          <w:tcPr>
-            <w:tcW w:type="dxa" w:w="900"/>
-            <w:tcBorders>
-              <w:top w:val="single" w:color="BFBFBF" w:sz="4"/>
-              <w:left w:val="single" w:color="BFBFBF" w:sz="4"/>
-              <w:bottom w:val="single" w:color="BFBFBF" w:sz="4"/>
-              <w:right w:val="single" w:color="BFBFBF" w:sz="4"/>
-            </w:tcBorders>
-            <w:tcMar>
-              <w:top w:type="dxa" w:w="60"/>
-              <w:left w:type="dxa" w:w="100"/>
-              <w:bottom w:type="dxa" w:w="60"/>
-              <w:right w:type="dxa" w:w="100"/>
-            </w:tcMar>
-          </w:tcPr>
-          <w:p>
-            <w:r>
-              <w:rPr>
-                <w:b w:val="false"/>
-                <w:bCs w:val="false"/>
-                <w:sz w:val="18"/>
-                <w:szCs w:val="18"/>
-              </w:rPr>
-              <w:t xml:space="preserve">0.9983</w:t>
-            </w:r>
-          </w:p>
-        </w:tc>
-        <w:tc>
-          <w:tcPr>
-            <w:tcW w:type="dxa" w:w="1226"/>
-            <w:tcBorders>
-              <w:top w:val="single" w:color="BFBFBF" w:sz="4"/>
-              <w:left w:val="single" w:color="BFBFBF" w:sz="4"/>
-              <w:bottom w:val="single" w:color="BFBFBF" w:sz="4"/>
-              <w:right w:val="single" w:color="BFBFBF" w:sz="4"/>
-            </w:tcBorders>
-            <w:tcMar>
-              <w:top w:type="dxa" w:w="60"/>
-              <w:left w:type="dxa" w:w="100"/>
-              <w:bottom w:type="dxa" w:w="60"/>
-              <w:right w:type="dxa" w:w="100"/>
-            </w:tcMar>
-          </w:tcPr>
-          <w:p>
-            <w:r>
-              <w:rPr>
-                <w:b w:val="false"/>
-                <w:bCs w:val="false"/>
-                <w:sz w:val="18"/>
-                <w:szCs w:val="18"/>
-              </w:rPr>
               <w:t xml:space="preserve">3.5 %</w:t>
+            </w:r>
+          </w:p>
+        </w:tc>
+        <w:tc>
+          <w:tcPr>
+            <w:tcW w:type="dxa" w:w="1100"/>
+            <w:tcBorders>
+              <w:top w:val="single" w:color="BFBFBF" w:sz="4"/>
+              <w:left w:val="single" w:color="BFBFBF" w:sz="4"/>
+              <w:bottom w:val="single" w:color="BFBFBF" w:sz="4"/>
+              <w:right w:val="single" w:color="BFBFBF" w:sz="4"/>
+            </w:tcBorders>
+            <w:tcMar>
+              <w:top w:type="dxa" w:w="60"/>
+              <w:left w:type="dxa" w:w="100"/>
+              <w:bottom w:type="dxa" w:w="60"/>
+              <w:right w:type="dxa" w:w="100"/>
+            </w:tcMar>
+          </w:tcPr>
+          <w:p>
+            <w:r>
+              <w:rPr>
+                <w:b w:val="false"/>
+                <w:bCs w:val="false"/>
+                <w:sz w:val="18"/>
+                <w:szCs w:val="18"/>
+              </w:rPr>
+              <w:t xml:space="preserve">-959.1</w:t>
+            </w:r>
+          </w:p>
+        </w:tc>
+        <w:tc>
+          <w:tcPr>
+            <w:tcW w:type="dxa" w:w="1100"/>
+            <w:tcBorders>
+              <w:top w:val="single" w:color="BFBFBF" w:sz="4"/>
+              <w:left w:val="single" w:color="BFBFBF" w:sz="4"/>
+              <w:bottom w:val="single" w:color="BFBFBF" w:sz="4"/>
+              <w:right w:val="single" w:color="BFBFBF" w:sz="4"/>
+            </w:tcBorders>
+            <w:tcMar>
+              <w:top w:type="dxa" w:w="60"/>
+              <w:left w:type="dxa" w:w="100"/>
+              <w:bottom w:type="dxa" w:w="60"/>
+              <w:right w:type="dxa" w:w="100"/>
+            </w:tcMar>
+          </w:tcPr>
+          <w:p>
+            <w:r>
+              <w:rPr>
+                <w:b w:val="false"/>
+                <w:bCs w:val="false"/>
+                <w:sz w:val="18"/>
+                <w:szCs w:val="18"/>
+              </w:rPr>
+              <w:t xml:space="preserve">-907.1</w:t>
+            </w:r>
+          </w:p>
+        </w:tc>
+        <w:tc>
+          <w:tcPr>
+            <w:tcW w:type="dxa" w:w="1326"/>
+            <w:tcBorders>
+              <w:top w:val="single" w:color="BFBFBF" w:sz="4"/>
+              <w:left w:val="single" w:color="BFBFBF" w:sz="4"/>
+              <w:bottom w:val="single" w:color="BFBFBF" w:sz="4"/>
+              <w:right w:val="single" w:color="BFBFBF" w:sz="4"/>
+            </w:tcBorders>
+            <w:tcMar>
+              <w:top w:type="dxa" w:w="60"/>
+              <w:left w:type="dxa" w:w="100"/>
+              <w:bottom w:type="dxa" w:w="60"/>
+              <w:right w:type="dxa" w:w="100"/>
+            </w:tcMar>
+          </w:tcPr>
+          <w:p>
+            <w:r>
+              <w:rPr>
+                <w:b w:val="false"/>
+                <w:bCs w:val="false"/>
+                <w:sz w:val="18"/>
+                <w:szCs w:val="18"/>
+              </w:rPr>
+              <w:t xml:space="preserve">1.0</w:t>
             </w:r>
           </w:p>
         </w:tc>
@@ -7141,6 +7141,1041 @@
         <w:spacing w:after="120"/>
       </w:pPr>
       <w:r>
+        <w:t xml:space="preserve">The GL sum gives the best fit for EVs (AIC 29 lower than Gaussian, 5 lower than Lorentzian; Lorentzian fraction 0.59). For NVs the GL fit chooses a Lorentzian fraction of 0, i.e. it is identical to the Gaussian fit, which is the best fit for NVs (the Lorentzian fit is much worse, ΔAIC ≈ 150). Because GL contains both shapes and selects the mixture from the data, it is never worse than the better of the two and was used for the figure (Figure 2c); the comparison of all three line shapes is shown in Figure S2. Overlapping bands have no unique decomposition, so conclusions rest on what is the same for all line shapes.</w:t>
+      </w:r>
+    </w:p>
+    <w:tbl>
+      <w:tblPr>
+        <w:tblW w:type="dxa" w:w="9026"/>
+        <w:tblBorders>
+          <w:top w:val="single" w:color="auto" w:sz="4"/>
+          <w:left w:val="single" w:color="auto" w:sz="4"/>
+          <w:bottom w:val="single" w:color="auto" w:sz="4"/>
+          <w:right w:val="single" w:color="auto" w:sz="4"/>
+          <w:insideH w:val="single" w:color="auto" w:sz="4"/>
+          <w:insideV w:val="single" w:color="auto" w:sz="4"/>
+        </w:tblBorders>
+      </w:tblPr>
+      <w:tblGrid>
+        <w:gridCol w:w="1100"/>
+        <w:gridCol w:w="2900"/>
+        <w:gridCol w:w="1700"/>
+        <w:gridCol w:w="1700"/>
+        <w:gridCol w:w="1626"/>
+      </w:tblGrid>
+      <w:tr>
+        <w:trPr>
+          <w:tblHeader/>
+        </w:trPr>
+        <w:tc>
+          <w:tcPr>
+            <w:tcW w:type="dxa" w:w="1100"/>
+            <w:tcBorders>
+              <w:top w:val="single" w:color="BFBFBF" w:sz="4"/>
+              <w:left w:val="single" w:color="BFBFBF" w:sz="4"/>
+              <w:bottom w:val="single" w:color="BFBFBF" w:sz="4"/>
+              <w:right w:val="single" w:color="BFBFBF" w:sz="4"/>
+            </w:tcBorders>
+            <w:shd w:fill="D9E2F3" w:color="auto" w:val="clear"/>
+            <w:tcMar>
+              <w:top w:type="dxa" w:w="60"/>
+              <w:left w:type="dxa" w:w="100"/>
+              <w:bottom w:type="dxa" w:w="60"/>
+              <w:right w:type="dxa" w:w="100"/>
+            </w:tcMar>
+          </w:tcPr>
+          <w:p>
+            <w:r>
+              <w:rPr>
+                <w:b/>
+                <w:bCs/>
+                <w:sz w:val="18"/>
+                <w:szCs w:val="18"/>
+              </w:rPr>
+              <w:t xml:space="preserve">Group</w:t>
+            </w:r>
+          </w:p>
+        </w:tc>
+        <w:tc>
+          <w:tcPr>
+            <w:tcW w:type="dxa" w:w="2900"/>
+            <w:tcBorders>
+              <w:top w:val="single" w:color="BFBFBF" w:sz="4"/>
+              <w:left w:val="single" w:color="BFBFBF" w:sz="4"/>
+              <w:bottom w:val="single" w:color="BFBFBF" w:sz="4"/>
+              <w:right w:val="single" w:color="BFBFBF" w:sz="4"/>
+            </w:tcBorders>
+            <w:shd w:fill="D9E2F3" w:color="auto" w:val="clear"/>
+            <w:tcMar>
+              <w:top w:type="dxa" w:w="60"/>
+              <w:left w:type="dxa" w:w="100"/>
+              <w:bottom w:type="dxa" w:w="60"/>
+              <w:right w:type="dxa" w:w="100"/>
+            </w:tcMar>
+          </w:tcPr>
+          <w:p>
+            <w:r>
+              <w:rPr>
+                <w:b/>
+                <w:bCs/>
+                <w:sz w:val="18"/>
+                <w:szCs w:val="18"/>
+              </w:rPr>
+              <w:t xml:space="preserve">Line shape</w:t>
+            </w:r>
+          </w:p>
+        </w:tc>
+        <w:tc>
+          <w:tcPr>
+            <w:tcW w:type="dxa" w:w="1700"/>
+            <w:tcBorders>
+              <w:top w:val="single" w:color="BFBFBF" w:sz="4"/>
+              <w:left w:val="single" w:color="BFBFBF" w:sz="4"/>
+              <w:bottom w:val="single" w:color="BFBFBF" w:sz="4"/>
+              <w:right w:val="single" w:color="BFBFBF" w:sz="4"/>
+            </w:tcBorders>
+            <w:shd w:fill="D9E2F3" w:color="auto" w:val="clear"/>
+            <w:tcMar>
+              <w:top w:type="dxa" w:w="60"/>
+              <w:left w:type="dxa" w:w="100"/>
+              <w:bottom w:type="dxa" w:w="60"/>
+              <w:right w:type="dxa" w:w="100"/>
+            </w:tcMar>
+          </w:tcPr>
+          <w:p>
+            <w:r>
+              <w:rPr>
+                <w:b/>
+                <w:bCs/>
+                <w:sz w:val="18"/>
+                <w:szCs w:val="18"/>
+              </w:rPr>
+              <w:t xml:space="preserve">Band II position</w:t>
+            </w:r>
+          </w:p>
+        </w:tc>
+        <w:tc>
+          <w:tcPr>
+            <w:tcW w:type="dxa" w:w="1700"/>
+            <w:tcBorders>
+              <w:top w:val="single" w:color="BFBFBF" w:sz="4"/>
+              <w:left w:val="single" w:color="BFBFBF" w:sz="4"/>
+              <w:bottom w:val="single" w:color="BFBFBF" w:sz="4"/>
+              <w:right w:val="single" w:color="BFBFBF" w:sz="4"/>
+            </w:tcBorders>
+            <w:shd w:fill="D9E2F3" w:color="auto" w:val="clear"/>
+            <w:tcMar>
+              <w:top w:type="dxa" w:w="60"/>
+              <w:left w:type="dxa" w:w="100"/>
+              <w:bottom w:type="dxa" w:w="60"/>
+              <w:right w:type="dxa" w:w="100"/>
+            </w:tcMar>
+          </w:tcPr>
+          <w:p>
+            <w:r>
+              <w:rPr>
+                <w:b/>
+                <w:bCs/>
+                <w:sz w:val="18"/>
+                <w:szCs w:val="18"/>
+              </w:rPr>
+              <w:t xml:space="preserve">Band II FWHM</w:t>
+            </w:r>
+          </w:p>
+        </w:tc>
+        <w:tc>
+          <w:tcPr>
+            <w:tcW w:type="dxa" w:w="1626"/>
+            <w:tcBorders>
+              <w:top w:val="single" w:color="BFBFBF" w:sz="4"/>
+              <w:left w:val="single" w:color="BFBFBF" w:sz="4"/>
+              <w:bottom w:val="single" w:color="BFBFBF" w:sz="4"/>
+              <w:right w:val="single" w:color="BFBFBF" w:sz="4"/>
+            </w:tcBorders>
+            <w:shd w:fill="D9E2F3" w:color="auto" w:val="clear"/>
+            <w:tcMar>
+              <w:top w:type="dxa" w:w="60"/>
+              <w:left w:type="dxa" w:w="100"/>
+              <w:bottom w:type="dxa" w:w="60"/>
+              <w:right w:type="dxa" w:w="100"/>
+            </w:tcMar>
+          </w:tcPr>
+          <w:p>
+            <w:r>
+              <w:rPr>
+                <w:b/>
+                <w:bCs/>
+                <w:sz w:val="18"/>
+                <w:szCs w:val="18"/>
+              </w:rPr>
+              <w:t xml:space="preserve">Band II area (%)</w:t>
+            </w:r>
+          </w:p>
+        </w:tc>
+      </w:tr>
+      <w:tr>
+        <w:tc>
+          <w:tcPr>
+            <w:tcW w:type="dxa" w:w="1100"/>
+            <w:tcBorders>
+              <w:top w:val="single" w:color="BFBFBF" w:sz="4"/>
+              <w:left w:val="single" w:color="BFBFBF" w:sz="4"/>
+              <w:bottom w:val="single" w:color="BFBFBF" w:sz="4"/>
+              <w:right w:val="single" w:color="BFBFBF" w:sz="4"/>
+            </w:tcBorders>
+            <w:tcMar>
+              <w:top w:type="dxa" w:w="60"/>
+              <w:left w:type="dxa" w:w="100"/>
+              <w:bottom w:type="dxa" w:w="60"/>
+              <w:right w:type="dxa" w:w="100"/>
+            </w:tcMar>
+          </w:tcPr>
+          <w:p>
+            <w:r>
+              <w:rPr>
+                <w:b w:val="false"/>
+                <w:bCs w:val="false"/>
+                <w:sz w:val="18"/>
+                <w:szCs w:val="18"/>
+              </w:rPr>
+              <w:t xml:space="preserve">EVs</w:t>
+            </w:r>
+          </w:p>
+        </w:tc>
+        <w:tc>
+          <w:tcPr>
+            <w:tcW w:type="dxa" w:w="2900"/>
+            <w:tcBorders>
+              <w:top w:val="single" w:color="BFBFBF" w:sz="4"/>
+              <w:left w:val="single" w:color="BFBFBF" w:sz="4"/>
+              <w:bottom w:val="single" w:color="BFBFBF" w:sz="4"/>
+              <w:right w:val="single" w:color="BFBFBF" w:sz="4"/>
+            </w:tcBorders>
+            <w:tcMar>
+              <w:top w:type="dxa" w:w="60"/>
+              <w:left w:type="dxa" w:w="100"/>
+              <w:bottom w:type="dxa" w:w="60"/>
+              <w:right w:type="dxa" w:w="100"/>
+            </w:tcMar>
+          </w:tcPr>
+          <w:p>
+            <w:r>
+              <w:rPr>
+                <w:b w:val="false"/>
+                <w:bCs w:val="false"/>
+                <w:sz w:val="18"/>
+                <w:szCs w:val="18"/>
+              </w:rPr>
+              <w:t xml:space="preserve">Gaussian</w:t>
+            </w:r>
+          </w:p>
+        </w:tc>
+        <w:tc>
+          <w:tcPr>
+            <w:tcW w:type="dxa" w:w="1700"/>
+            <w:tcBorders>
+              <w:top w:val="single" w:color="BFBFBF" w:sz="4"/>
+              <w:left w:val="single" w:color="BFBFBF" w:sz="4"/>
+              <w:bottom w:val="single" w:color="BFBFBF" w:sz="4"/>
+              <w:right w:val="single" w:color="BFBFBF" w:sz="4"/>
+            </w:tcBorders>
+            <w:tcMar>
+              <w:top w:type="dxa" w:w="60"/>
+              <w:left w:type="dxa" w:w="100"/>
+              <w:bottom w:type="dxa" w:w="60"/>
+              <w:right w:type="dxa" w:w="100"/>
+            </w:tcMar>
+          </w:tcPr>
+          <w:p>
+            <w:r>
+              <w:rPr>
+                <w:b w:val="false"/>
+                <w:bCs w:val="false"/>
+                <w:sz w:val="18"/>
+                <w:szCs w:val="18"/>
+              </w:rPr>
+              <w:t xml:space="preserve">2886.9</w:t>
+            </w:r>
+          </w:p>
+        </w:tc>
+        <w:tc>
+          <w:tcPr>
+            <w:tcW w:type="dxa" w:w="1700"/>
+            <w:tcBorders>
+              <w:top w:val="single" w:color="BFBFBF" w:sz="4"/>
+              <w:left w:val="single" w:color="BFBFBF" w:sz="4"/>
+              <w:bottom w:val="single" w:color="BFBFBF" w:sz="4"/>
+              <w:right w:val="single" w:color="BFBFBF" w:sz="4"/>
+            </w:tcBorders>
+            <w:tcMar>
+              <w:top w:type="dxa" w:w="60"/>
+              <w:left w:type="dxa" w:w="100"/>
+              <w:bottom w:type="dxa" w:w="60"/>
+              <w:right w:type="dxa" w:w="100"/>
+            </w:tcMar>
+          </w:tcPr>
+          <w:p>
+            <w:r>
+              <w:rPr>
+                <w:b w:val="false"/>
+                <w:bCs w:val="false"/>
+                <w:sz w:val="18"/>
+                <w:szCs w:val="18"/>
+              </w:rPr>
+              <w:t xml:space="preserve">60.0 (limit)</w:t>
+            </w:r>
+          </w:p>
+        </w:tc>
+        <w:tc>
+          <w:tcPr>
+            <w:tcW w:type="dxa" w:w="1626"/>
+            <w:tcBorders>
+              <w:top w:val="single" w:color="BFBFBF" w:sz="4"/>
+              <w:left w:val="single" w:color="BFBFBF" w:sz="4"/>
+              <w:bottom w:val="single" w:color="BFBFBF" w:sz="4"/>
+              <w:right w:val="single" w:color="BFBFBF" w:sz="4"/>
+            </w:tcBorders>
+            <w:tcMar>
+              <w:top w:type="dxa" w:w="60"/>
+              <w:left w:type="dxa" w:w="100"/>
+              <w:bottom w:type="dxa" w:w="60"/>
+              <w:right w:type="dxa" w:w="100"/>
+            </w:tcMar>
+          </w:tcPr>
+          <w:p>
+            <w:r>
+              <w:rPr>
+                <w:b w:val="false"/>
+                <w:bCs w:val="false"/>
+                <w:sz w:val="18"/>
+                <w:szCs w:val="18"/>
+              </w:rPr>
+              <w:t xml:space="preserve">23.0</w:t>
+            </w:r>
+          </w:p>
+        </w:tc>
+      </w:tr>
+      <w:tr>
+        <w:tc>
+          <w:tcPr>
+            <w:tcW w:type="dxa" w:w="1100"/>
+            <w:tcBorders>
+              <w:top w:val="single" w:color="BFBFBF" w:sz="4"/>
+              <w:left w:val="single" w:color="BFBFBF" w:sz="4"/>
+              <w:bottom w:val="single" w:color="BFBFBF" w:sz="4"/>
+              <w:right w:val="single" w:color="BFBFBF" w:sz="4"/>
+            </w:tcBorders>
+            <w:tcMar>
+              <w:top w:type="dxa" w:w="60"/>
+              <w:left w:type="dxa" w:w="100"/>
+              <w:bottom w:type="dxa" w:w="60"/>
+              <w:right w:type="dxa" w:w="100"/>
+            </w:tcMar>
+          </w:tcPr>
+          <w:p>
+            <w:r>
+              <w:rPr>
+                <w:b w:val="false"/>
+                <w:bCs w:val="false"/>
+                <w:sz w:val="18"/>
+                <w:szCs w:val="18"/>
+              </w:rPr>
+              <w:t xml:space="preserve">EVs</w:t>
+            </w:r>
+          </w:p>
+        </w:tc>
+        <w:tc>
+          <w:tcPr>
+            <w:tcW w:type="dxa" w:w="2900"/>
+            <w:tcBorders>
+              <w:top w:val="single" w:color="BFBFBF" w:sz="4"/>
+              <w:left w:val="single" w:color="BFBFBF" w:sz="4"/>
+              <w:bottom w:val="single" w:color="BFBFBF" w:sz="4"/>
+              <w:right w:val="single" w:color="BFBFBF" w:sz="4"/>
+            </w:tcBorders>
+            <w:tcMar>
+              <w:top w:type="dxa" w:w="60"/>
+              <w:left w:type="dxa" w:w="100"/>
+              <w:bottom w:type="dxa" w:w="60"/>
+              <w:right w:type="dxa" w:w="100"/>
+            </w:tcMar>
+          </w:tcPr>
+          <w:p>
+            <w:r>
+              <w:rPr>
+                <w:b w:val="false"/>
+                <w:bCs w:val="false"/>
+                <w:sz w:val="18"/>
+                <w:szCs w:val="18"/>
+              </w:rPr>
+              <w:t xml:space="preserve">Gaussian-Lorentzian sum</w:t>
+            </w:r>
+          </w:p>
+        </w:tc>
+        <w:tc>
+          <w:tcPr>
+            <w:tcW w:type="dxa" w:w="1700"/>
+            <w:tcBorders>
+              <w:top w:val="single" w:color="BFBFBF" w:sz="4"/>
+              <w:left w:val="single" w:color="BFBFBF" w:sz="4"/>
+              <w:bottom w:val="single" w:color="BFBFBF" w:sz="4"/>
+              <w:right w:val="single" w:color="BFBFBF" w:sz="4"/>
+            </w:tcBorders>
+            <w:tcMar>
+              <w:top w:type="dxa" w:w="60"/>
+              <w:left w:type="dxa" w:w="100"/>
+              <w:bottom w:type="dxa" w:w="60"/>
+              <w:right w:type="dxa" w:w="100"/>
+            </w:tcMar>
+          </w:tcPr>
+          <w:p>
+            <w:r>
+              <w:rPr>
+                <w:b w:val="false"/>
+                <w:bCs w:val="false"/>
+                <w:sz w:val="18"/>
+                <w:szCs w:val="18"/>
+              </w:rPr>
+              <w:t xml:space="preserve">2880.8</w:t>
+            </w:r>
+          </w:p>
+        </w:tc>
+        <w:tc>
+          <w:tcPr>
+            <w:tcW w:type="dxa" w:w="1700"/>
+            <w:tcBorders>
+              <w:top w:val="single" w:color="BFBFBF" w:sz="4"/>
+              <w:left w:val="single" w:color="BFBFBF" w:sz="4"/>
+              <w:bottom w:val="single" w:color="BFBFBF" w:sz="4"/>
+              <w:right w:val="single" w:color="BFBFBF" w:sz="4"/>
+            </w:tcBorders>
+            <w:tcMar>
+              <w:top w:type="dxa" w:w="60"/>
+              <w:left w:type="dxa" w:w="100"/>
+              <w:bottom w:type="dxa" w:w="60"/>
+              <w:right w:type="dxa" w:w="100"/>
+            </w:tcMar>
+          </w:tcPr>
+          <w:p>
+            <w:r>
+              <w:rPr>
+                <w:b w:val="false"/>
+                <w:bCs w:val="false"/>
+                <w:sz w:val="18"/>
+                <w:szCs w:val="18"/>
+              </w:rPr>
+              <w:t xml:space="preserve">60.0 (limit)</w:t>
+            </w:r>
+          </w:p>
+        </w:tc>
+        <w:tc>
+          <w:tcPr>
+            <w:tcW w:type="dxa" w:w="1626"/>
+            <w:tcBorders>
+              <w:top w:val="single" w:color="BFBFBF" w:sz="4"/>
+              <w:left w:val="single" w:color="BFBFBF" w:sz="4"/>
+              <w:bottom w:val="single" w:color="BFBFBF" w:sz="4"/>
+              <w:right w:val="single" w:color="BFBFBF" w:sz="4"/>
+            </w:tcBorders>
+            <w:tcMar>
+              <w:top w:type="dxa" w:w="60"/>
+              <w:left w:type="dxa" w:w="100"/>
+              <w:bottom w:type="dxa" w:w="60"/>
+              <w:right w:type="dxa" w:w="100"/>
+            </w:tcMar>
+          </w:tcPr>
+          <w:p>
+            <w:r>
+              <w:rPr>
+                <w:b w:val="false"/>
+                <w:bCs w:val="false"/>
+                <w:sz w:val="18"/>
+                <w:szCs w:val="18"/>
+              </w:rPr>
+              <w:t xml:space="preserve">15.9</w:t>
+            </w:r>
+          </w:p>
+        </w:tc>
+      </w:tr>
+      <w:tr>
+        <w:tc>
+          <w:tcPr>
+            <w:tcW w:type="dxa" w:w="1100"/>
+            <w:tcBorders>
+              <w:top w:val="single" w:color="BFBFBF" w:sz="4"/>
+              <w:left w:val="single" w:color="BFBFBF" w:sz="4"/>
+              <w:bottom w:val="single" w:color="BFBFBF" w:sz="4"/>
+              <w:right w:val="single" w:color="BFBFBF" w:sz="4"/>
+            </w:tcBorders>
+            <w:tcMar>
+              <w:top w:type="dxa" w:w="60"/>
+              <w:left w:type="dxa" w:w="100"/>
+              <w:bottom w:type="dxa" w:w="60"/>
+              <w:right w:type="dxa" w:w="100"/>
+            </w:tcMar>
+          </w:tcPr>
+          <w:p>
+            <w:r>
+              <w:rPr>
+                <w:b w:val="false"/>
+                <w:bCs w:val="false"/>
+                <w:sz w:val="18"/>
+                <w:szCs w:val="18"/>
+              </w:rPr>
+              <w:t xml:space="preserve">EVs</w:t>
+            </w:r>
+          </w:p>
+        </w:tc>
+        <w:tc>
+          <w:tcPr>
+            <w:tcW w:type="dxa" w:w="2900"/>
+            <w:tcBorders>
+              <w:top w:val="single" w:color="BFBFBF" w:sz="4"/>
+              <w:left w:val="single" w:color="BFBFBF" w:sz="4"/>
+              <w:bottom w:val="single" w:color="BFBFBF" w:sz="4"/>
+              <w:right w:val="single" w:color="BFBFBF" w:sz="4"/>
+            </w:tcBorders>
+            <w:tcMar>
+              <w:top w:type="dxa" w:w="60"/>
+              <w:left w:type="dxa" w:w="100"/>
+              <w:bottom w:type="dxa" w:w="60"/>
+              <w:right w:type="dxa" w:w="100"/>
+            </w:tcMar>
+          </w:tcPr>
+          <w:p>
+            <w:r>
+              <w:rPr>
+                <w:b w:val="false"/>
+                <w:bCs w:val="false"/>
+                <w:sz w:val="18"/>
+                <w:szCs w:val="18"/>
+              </w:rPr>
+              <w:t xml:space="preserve">Lorentzian</w:t>
+            </w:r>
+          </w:p>
+        </w:tc>
+        <w:tc>
+          <w:tcPr>
+            <w:tcW w:type="dxa" w:w="1700"/>
+            <w:tcBorders>
+              <w:top w:val="single" w:color="BFBFBF" w:sz="4"/>
+              <w:left w:val="single" w:color="BFBFBF" w:sz="4"/>
+              <w:bottom w:val="single" w:color="BFBFBF" w:sz="4"/>
+              <w:right w:val="single" w:color="BFBFBF" w:sz="4"/>
+            </w:tcBorders>
+            <w:tcMar>
+              <w:top w:type="dxa" w:w="60"/>
+              <w:left w:type="dxa" w:w="100"/>
+              <w:bottom w:type="dxa" w:w="60"/>
+              <w:right w:type="dxa" w:w="100"/>
+            </w:tcMar>
+          </w:tcPr>
+          <w:p>
+            <w:r>
+              <w:rPr>
+                <w:b w:val="false"/>
+                <w:bCs w:val="false"/>
+                <w:sz w:val="18"/>
+                <w:szCs w:val="18"/>
+              </w:rPr>
+              <w:t xml:space="preserve">2875.2</w:t>
+            </w:r>
+          </w:p>
+        </w:tc>
+        <w:tc>
+          <w:tcPr>
+            <w:tcW w:type="dxa" w:w="1700"/>
+            <w:tcBorders>
+              <w:top w:val="single" w:color="BFBFBF" w:sz="4"/>
+              <w:left w:val="single" w:color="BFBFBF" w:sz="4"/>
+              <w:bottom w:val="single" w:color="BFBFBF" w:sz="4"/>
+              <w:right w:val="single" w:color="BFBFBF" w:sz="4"/>
+            </w:tcBorders>
+            <w:tcMar>
+              <w:top w:type="dxa" w:w="60"/>
+              <w:left w:type="dxa" w:w="100"/>
+              <w:bottom w:type="dxa" w:w="60"/>
+              <w:right w:type="dxa" w:w="100"/>
+            </w:tcMar>
+          </w:tcPr>
+          <w:p>
+            <w:r>
+              <w:rPr>
+                <w:b w:val="false"/>
+                <w:bCs w:val="false"/>
+                <w:sz w:val="18"/>
+                <w:szCs w:val="18"/>
+              </w:rPr>
+              <w:t xml:space="preserve">60.0 (limit)</w:t>
+            </w:r>
+          </w:p>
+        </w:tc>
+        <w:tc>
+          <w:tcPr>
+            <w:tcW w:type="dxa" w:w="1626"/>
+            <w:tcBorders>
+              <w:top w:val="single" w:color="BFBFBF" w:sz="4"/>
+              <w:left w:val="single" w:color="BFBFBF" w:sz="4"/>
+              <w:bottom w:val="single" w:color="BFBFBF" w:sz="4"/>
+              <w:right w:val="single" w:color="BFBFBF" w:sz="4"/>
+            </w:tcBorders>
+            <w:tcMar>
+              <w:top w:type="dxa" w:w="60"/>
+              <w:left w:type="dxa" w:w="100"/>
+              <w:bottom w:type="dxa" w:w="60"/>
+              <w:right w:type="dxa" w:w="100"/>
+            </w:tcMar>
+          </w:tcPr>
+          <w:p>
+            <w:r>
+              <w:rPr>
+                <w:b w:val="false"/>
+                <w:bCs w:val="false"/>
+                <w:sz w:val="18"/>
+                <w:szCs w:val="18"/>
+              </w:rPr>
+              <w:t xml:space="preserve">10.2</w:t>
+            </w:r>
+          </w:p>
+        </w:tc>
+      </w:tr>
+      <w:tr>
+        <w:tc>
+          <w:tcPr>
+            <w:tcW w:type="dxa" w:w="1100"/>
+            <w:tcBorders>
+              <w:top w:val="single" w:color="BFBFBF" w:sz="4"/>
+              <w:left w:val="single" w:color="BFBFBF" w:sz="4"/>
+              <w:bottom w:val="single" w:color="BFBFBF" w:sz="4"/>
+              <w:right w:val="single" w:color="BFBFBF" w:sz="4"/>
+            </w:tcBorders>
+            <w:tcMar>
+              <w:top w:type="dxa" w:w="60"/>
+              <w:left w:type="dxa" w:w="100"/>
+              <w:bottom w:type="dxa" w:w="60"/>
+              <w:right w:type="dxa" w:w="100"/>
+            </w:tcMar>
+          </w:tcPr>
+          <w:p>
+            <w:r>
+              <w:rPr>
+                <w:b w:val="false"/>
+                <w:bCs w:val="false"/>
+                <w:sz w:val="18"/>
+                <w:szCs w:val="18"/>
+              </w:rPr>
+              <w:t xml:space="preserve">NVs</w:t>
+            </w:r>
+          </w:p>
+        </w:tc>
+        <w:tc>
+          <w:tcPr>
+            <w:tcW w:type="dxa" w:w="2900"/>
+            <w:tcBorders>
+              <w:top w:val="single" w:color="BFBFBF" w:sz="4"/>
+              <w:left w:val="single" w:color="BFBFBF" w:sz="4"/>
+              <w:bottom w:val="single" w:color="BFBFBF" w:sz="4"/>
+              <w:right w:val="single" w:color="BFBFBF" w:sz="4"/>
+            </w:tcBorders>
+            <w:tcMar>
+              <w:top w:type="dxa" w:w="60"/>
+              <w:left w:type="dxa" w:w="100"/>
+              <w:bottom w:type="dxa" w:w="60"/>
+              <w:right w:type="dxa" w:w="100"/>
+            </w:tcMar>
+          </w:tcPr>
+          <w:p>
+            <w:r>
+              <w:rPr>
+                <w:b w:val="false"/>
+                <w:bCs w:val="false"/>
+                <w:sz w:val="18"/>
+                <w:szCs w:val="18"/>
+              </w:rPr>
+              <w:t xml:space="preserve">Gaussian</w:t>
+            </w:r>
+          </w:p>
+        </w:tc>
+        <w:tc>
+          <w:tcPr>
+            <w:tcW w:type="dxa" w:w="1700"/>
+            <w:tcBorders>
+              <w:top w:val="single" w:color="BFBFBF" w:sz="4"/>
+              <w:left w:val="single" w:color="BFBFBF" w:sz="4"/>
+              <w:bottom w:val="single" w:color="BFBFBF" w:sz="4"/>
+              <w:right w:val="single" w:color="BFBFBF" w:sz="4"/>
+            </w:tcBorders>
+            <w:tcMar>
+              <w:top w:type="dxa" w:w="60"/>
+              <w:left w:type="dxa" w:w="100"/>
+              <w:bottom w:type="dxa" w:w="60"/>
+              <w:right w:type="dxa" w:w="100"/>
+            </w:tcMar>
+          </w:tcPr>
+          <w:p>
+            <w:r>
+              <w:rPr>
+                <w:b w:val="false"/>
+                <w:bCs w:val="false"/>
+                <w:sz w:val="18"/>
+                <w:szCs w:val="18"/>
+              </w:rPr>
+              <w:t xml:space="preserve">2886.4</w:t>
+            </w:r>
+          </w:p>
+        </w:tc>
+        <w:tc>
+          <w:tcPr>
+            <w:tcW w:type="dxa" w:w="1700"/>
+            <w:tcBorders>
+              <w:top w:val="single" w:color="BFBFBF" w:sz="4"/>
+              <w:left w:val="single" w:color="BFBFBF" w:sz="4"/>
+              <w:bottom w:val="single" w:color="BFBFBF" w:sz="4"/>
+              <w:right w:val="single" w:color="BFBFBF" w:sz="4"/>
+            </w:tcBorders>
+            <w:tcMar>
+              <w:top w:type="dxa" w:w="60"/>
+              <w:left w:type="dxa" w:w="100"/>
+              <w:bottom w:type="dxa" w:w="60"/>
+              <w:right w:type="dxa" w:w="100"/>
+            </w:tcMar>
+          </w:tcPr>
+          <w:p>
+            <w:r>
+              <w:rPr>
+                <w:b w:val="false"/>
+                <w:bCs w:val="false"/>
+                <w:sz w:val="18"/>
+                <w:szCs w:val="18"/>
+              </w:rPr>
+              <w:t xml:space="preserve">43.2</w:t>
+            </w:r>
+          </w:p>
+        </w:tc>
+        <w:tc>
+          <w:tcPr>
+            <w:tcW w:type="dxa" w:w="1626"/>
+            <w:tcBorders>
+              <w:top w:val="single" w:color="BFBFBF" w:sz="4"/>
+              <w:left w:val="single" w:color="BFBFBF" w:sz="4"/>
+              <w:bottom w:val="single" w:color="BFBFBF" w:sz="4"/>
+              <w:right w:val="single" w:color="BFBFBF" w:sz="4"/>
+            </w:tcBorders>
+            <w:tcMar>
+              <w:top w:type="dxa" w:w="60"/>
+              <w:left w:type="dxa" w:w="100"/>
+              <w:bottom w:type="dxa" w:w="60"/>
+              <w:right w:type="dxa" w:w="100"/>
+            </w:tcMar>
+          </w:tcPr>
+          <w:p>
+            <w:r>
+              <w:rPr>
+                <w:b w:val="false"/>
+                <w:bCs w:val="false"/>
+                <w:sz w:val="18"/>
+                <w:szCs w:val="18"/>
+              </w:rPr>
+              <w:t xml:space="preserve">22.5</w:t>
+            </w:r>
+          </w:p>
+        </w:tc>
+      </w:tr>
+      <w:tr>
+        <w:tc>
+          <w:tcPr>
+            <w:tcW w:type="dxa" w:w="1100"/>
+            <w:tcBorders>
+              <w:top w:val="single" w:color="BFBFBF" w:sz="4"/>
+              <w:left w:val="single" w:color="BFBFBF" w:sz="4"/>
+              <w:bottom w:val="single" w:color="BFBFBF" w:sz="4"/>
+              <w:right w:val="single" w:color="BFBFBF" w:sz="4"/>
+            </w:tcBorders>
+            <w:tcMar>
+              <w:top w:type="dxa" w:w="60"/>
+              <w:left w:type="dxa" w:w="100"/>
+              <w:bottom w:type="dxa" w:w="60"/>
+              <w:right w:type="dxa" w:w="100"/>
+            </w:tcMar>
+          </w:tcPr>
+          <w:p>
+            <w:r>
+              <w:rPr>
+                <w:b w:val="false"/>
+                <w:bCs w:val="false"/>
+                <w:sz w:val="18"/>
+                <w:szCs w:val="18"/>
+              </w:rPr>
+              <w:t xml:space="preserve">NVs</w:t>
+            </w:r>
+          </w:p>
+        </w:tc>
+        <w:tc>
+          <w:tcPr>
+            <w:tcW w:type="dxa" w:w="2900"/>
+            <w:tcBorders>
+              <w:top w:val="single" w:color="BFBFBF" w:sz="4"/>
+              <w:left w:val="single" w:color="BFBFBF" w:sz="4"/>
+              <w:bottom w:val="single" w:color="BFBFBF" w:sz="4"/>
+              <w:right w:val="single" w:color="BFBFBF" w:sz="4"/>
+            </w:tcBorders>
+            <w:tcMar>
+              <w:top w:type="dxa" w:w="60"/>
+              <w:left w:type="dxa" w:w="100"/>
+              <w:bottom w:type="dxa" w:w="60"/>
+              <w:right w:type="dxa" w:w="100"/>
+            </w:tcMar>
+          </w:tcPr>
+          <w:p>
+            <w:r>
+              <w:rPr>
+                <w:b w:val="false"/>
+                <w:bCs w:val="false"/>
+                <w:sz w:val="18"/>
+                <w:szCs w:val="18"/>
+              </w:rPr>
+              <w:t xml:space="preserve">Gaussian-Lorentzian sum</w:t>
+            </w:r>
+          </w:p>
+        </w:tc>
+        <w:tc>
+          <w:tcPr>
+            <w:tcW w:type="dxa" w:w="1700"/>
+            <w:tcBorders>
+              <w:top w:val="single" w:color="BFBFBF" w:sz="4"/>
+              <w:left w:val="single" w:color="BFBFBF" w:sz="4"/>
+              <w:bottom w:val="single" w:color="BFBFBF" w:sz="4"/>
+              <w:right w:val="single" w:color="BFBFBF" w:sz="4"/>
+            </w:tcBorders>
+            <w:tcMar>
+              <w:top w:type="dxa" w:w="60"/>
+              <w:left w:type="dxa" w:w="100"/>
+              <w:bottom w:type="dxa" w:w="60"/>
+              <w:right w:type="dxa" w:w="100"/>
+            </w:tcMar>
+          </w:tcPr>
+          <w:p>
+            <w:r>
+              <w:rPr>
+                <w:b w:val="false"/>
+                <w:bCs w:val="false"/>
+                <w:sz w:val="18"/>
+                <w:szCs w:val="18"/>
+              </w:rPr>
+              <w:t xml:space="preserve">2886.4</w:t>
+            </w:r>
+          </w:p>
+        </w:tc>
+        <w:tc>
+          <w:tcPr>
+            <w:tcW w:type="dxa" w:w="1700"/>
+            <w:tcBorders>
+              <w:top w:val="single" w:color="BFBFBF" w:sz="4"/>
+              <w:left w:val="single" w:color="BFBFBF" w:sz="4"/>
+              <w:bottom w:val="single" w:color="BFBFBF" w:sz="4"/>
+              <w:right w:val="single" w:color="BFBFBF" w:sz="4"/>
+            </w:tcBorders>
+            <w:tcMar>
+              <w:top w:type="dxa" w:w="60"/>
+              <w:left w:type="dxa" w:w="100"/>
+              <w:bottom w:type="dxa" w:w="60"/>
+              <w:right w:type="dxa" w:w="100"/>
+            </w:tcMar>
+          </w:tcPr>
+          <w:p>
+            <w:r>
+              <w:rPr>
+                <w:b w:val="false"/>
+                <w:bCs w:val="false"/>
+                <w:sz w:val="18"/>
+                <w:szCs w:val="18"/>
+              </w:rPr>
+              <w:t xml:space="preserve">43.2</w:t>
+            </w:r>
+          </w:p>
+        </w:tc>
+        <w:tc>
+          <w:tcPr>
+            <w:tcW w:type="dxa" w:w="1626"/>
+            <w:tcBorders>
+              <w:top w:val="single" w:color="BFBFBF" w:sz="4"/>
+              <w:left w:val="single" w:color="BFBFBF" w:sz="4"/>
+              <w:bottom w:val="single" w:color="BFBFBF" w:sz="4"/>
+              <w:right w:val="single" w:color="BFBFBF" w:sz="4"/>
+            </w:tcBorders>
+            <w:tcMar>
+              <w:top w:type="dxa" w:w="60"/>
+              <w:left w:type="dxa" w:w="100"/>
+              <w:bottom w:type="dxa" w:w="60"/>
+              <w:right w:type="dxa" w:w="100"/>
+            </w:tcMar>
+          </w:tcPr>
+          <w:p>
+            <w:r>
+              <w:rPr>
+                <w:b w:val="false"/>
+                <w:bCs w:val="false"/>
+                <w:sz w:val="18"/>
+                <w:szCs w:val="18"/>
+              </w:rPr>
+              <w:t xml:space="preserve">22.5</w:t>
+            </w:r>
+          </w:p>
+        </w:tc>
+      </w:tr>
+      <w:tr>
+        <w:tc>
+          <w:tcPr>
+            <w:tcW w:type="dxa" w:w="1100"/>
+            <w:tcBorders>
+              <w:top w:val="single" w:color="BFBFBF" w:sz="4"/>
+              <w:left w:val="single" w:color="BFBFBF" w:sz="4"/>
+              <w:bottom w:val="single" w:color="BFBFBF" w:sz="4"/>
+              <w:right w:val="single" w:color="BFBFBF" w:sz="4"/>
+            </w:tcBorders>
+            <w:tcMar>
+              <w:top w:type="dxa" w:w="60"/>
+              <w:left w:type="dxa" w:w="100"/>
+              <w:bottom w:type="dxa" w:w="60"/>
+              <w:right w:type="dxa" w:w="100"/>
+            </w:tcMar>
+          </w:tcPr>
+          <w:p>
+            <w:r>
+              <w:rPr>
+                <w:b w:val="false"/>
+                <w:bCs w:val="false"/>
+                <w:sz w:val="18"/>
+                <w:szCs w:val="18"/>
+              </w:rPr>
+              <w:t xml:space="preserve">NVs</w:t>
+            </w:r>
+          </w:p>
+        </w:tc>
+        <w:tc>
+          <w:tcPr>
+            <w:tcW w:type="dxa" w:w="2900"/>
+            <w:tcBorders>
+              <w:top w:val="single" w:color="BFBFBF" w:sz="4"/>
+              <w:left w:val="single" w:color="BFBFBF" w:sz="4"/>
+              <w:bottom w:val="single" w:color="BFBFBF" w:sz="4"/>
+              <w:right w:val="single" w:color="BFBFBF" w:sz="4"/>
+            </w:tcBorders>
+            <w:tcMar>
+              <w:top w:type="dxa" w:w="60"/>
+              <w:left w:type="dxa" w:w="100"/>
+              <w:bottom w:type="dxa" w:w="60"/>
+              <w:right w:type="dxa" w:w="100"/>
+            </w:tcMar>
+          </w:tcPr>
+          <w:p>
+            <w:r>
+              <w:rPr>
+                <w:b w:val="false"/>
+                <w:bCs w:val="false"/>
+                <w:sz w:val="18"/>
+                <w:szCs w:val="18"/>
+              </w:rPr>
+              <w:t xml:space="preserve">Lorentzian</w:t>
+            </w:r>
+          </w:p>
+        </w:tc>
+        <w:tc>
+          <w:tcPr>
+            <w:tcW w:type="dxa" w:w="1700"/>
+            <w:tcBorders>
+              <w:top w:val="single" w:color="BFBFBF" w:sz="4"/>
+              <w:left w:val="single" w:color="BFBFBF" w:sz="4"/>
+              <w:bottom w:val="single" w:color="BFBFBF" w:sz="4"/>
+              <w:right w:val="single" w:color="BFBFBF" w:sz="4"/>
+            </w:tcBorders>
+            <w:tcMar>
+              <w:top w:type="dxa" w:w="60"/>
+              <w:left w:type="dxa" w:w="100"/>
+              <w:bottom w:type="dxa" w:w="60"/>
+              <w:right w:type="dxa" w:w="100"/>
+            </w:tcMar>
+          </w:tcPr>
+          <w:p>
+            <w:r>
+              <w:rPr>
+                <w:b w:val="false"/>
+                <w:bCs w:val="false"/>
+                <w:sz w:val="18"/>
+                <w:szCs w:val="18"/>
+              </w:rPr>
+              <w:t xml:space="preserve">2883.7</w:t>
+            </w:r>
+          </w:p>
+        </w:tc>
+        <w:tc>
+          <w:tcPr>
+            <w:tcW w:type="dxa" w:w="1700"/>
+            <w:tcBorders>
+              <w:top w:val="single" w:color="BFBFBF" w:sz="4"/>
+              <w:left w:val="single" w:color="BFBFBF" w:sz="4"/>
+              <w:bottom w:val="single" w:color="BFBFBF" w:sz="4"/>
+              <w:right w:val="single" w:color="BFBFBF" w:sz="4"/>
+            </w:tcBorders>
+            <w:tcMar>
+              <w:top w:type="dxa" w:w="60"/>
+              <w:left w:type="dxa" w:w="100"/>
+              <w:bottom w:type="dxa" w:w="60"/>
+              <w:right w:type="dxa" w:w="100"/>
+            </w:tcMar>
+          </w:tcPr>
+          <w:p>
+            <w:r>
+              <w:rPr>
+                <w:b w:val="false"/>
+                <w:bCs w:val="false"/>
+                <w:sz w:val="18"/>
+                <w:szCs w:val="18"/>
+              </w:rPr>
+              <w:t xml:space="preserve">33.7</w:t>
+            </w:r>
+          </w:p>
+        </w:tc>
+        <w:tc>
+          <w:tcPr>
+            <w:tcW w:type="dxa" w:w="1626"/>
+            <w:tcBorders>
+              <w:top w:val="single" w:color="BFBFBF" w:sz="4"/>
+              <w:left w:val="single" w:color="BFBFBF" w:sz="4"/>
+              <w:bottom w:val="single" w:color="BFBFBF" w:sz="4"/>
+              <w:right w:val="single" w:color="BFBFBF" w:sz="4"/>
+            </w:tcBorders>
+            <w:tcMar>
+              <w:top w:type="dxa" w:w="60"/>
+              <w:left w:type="dxa" w:w="100"/>
+              <w:bottom w:type="dxa" w:w="60"/>
+              <w:right w:type="dxa" w:w="100"/>
+            </w:tcMar>
+          </w:tcPr>
+          <w:p>
+            <w:r>
+              <w:rPr>
+                <w:b w:val="false"/>
+                <w:bCs w:val="false"/>
+                <w:sz w:val="18"/>
+                <w:szCs w:val="18"/>
+              </w:rPr>
+              <w:t xml:space="preserve">10.0</w:t>
+            </w:r>
+          </w:p>
+        </w:tc>
+      </w:tr>
+    </w:tbl>
+    <w:p>
+      <w:pPr>
+        <w:spacing w:after="120"/>
+      </w:pPr>
+    </w:p>
+    <w:p>
+      <w:pPr>
+        <w:spacing w:after="120"/>
+      </w:pPr>
+      <w:r>
         <w:rPr>
           <w:b/>
           <w:bCs/>
@@ -7148,7 +8183,7 @@
         <w:t xml:space="preserve">Result.</w:t>
       </w:r>
       <w:r>
-        <w:t xml:space="preserve"> In NVs, band II is a well-defined band at 2884-2886 cm⁻¹ with a width of 34-43 cm⁻¹ in all three fits, and the fits are excellent (R² ≥ 0.998, residuals ≤ 3.5 %). In EVs, the fit also needs some intensity between 2870 and 2890 cm⁻¹, but only as a very broad component whose width runs to the upper limit (60 cm⁻¹) for every line shape, i.e. a weak, unresolved wing of the main band rather than a distinct band. This supports labelling the 2883 cm⁻¹ band for NVs only; in the text it should be described as “a distinct CH₂ band in NVs, only a weak unresolved shoulder in EVs”, not as completely absent in EVs.</w:t>
+        <w:t xml:space="preserve"> In NVs, band II is a well-defined band at 2884-2886 cm⁻¹ with a width of 34-43 cm⁻¹ in all three fits (GL: 2886 cm⁻¹, 22.5 % of the CH band area). In EVs, the fit also needs some intensity between 2870 and 2890 cm⁻¹, but only as a very broad component whose width runs to the upper limit (60 cm⁻¹) for every line shape, i.e. a weak, unresolved wing of the main band rather than a distinct band. This supports labelling the 2883 cm⁻¹ band for NVs only; in the text it should be described as “a distinct CH₂ band in NVs, only a weak unresolved shoulder in EVs”, not as completely absent in EVs.</w:t>
       </w:r>
     </w:p>
     <w:p>
@@ -7159,9 +8194,9 @@
       <w:r>
         <w:drawing>
           <wp:inline distT="0" distB="0" distL="0" distR="0">
-            <wp:extent cx="5715000" cy="3343275"/>
+            <wp:extent cx="5715000" cy="2905125"/>
             <wp:effectExtent t="0" r="0" b="0" l="0"/>
-            <wp:docPr id="1" name="FigS2_PeakFit_CH" descr="Figure S2. Band fitting of the mean CH-stretching spectra of EV Acacia (a-c) and Nanovesicles Acacia (d-f) with Gaussian, Gaussian-Lorentzian sum and Lorentzian line shapes. Thick black: data; grey: fit; thin: bands I-V; top: residuals in % of the band height." title="FigS2_PeakFit_CH"/>
+            <wp:docPr id="1" name="Fig2c_PeakFit_CH_GL" descr="Figure 2c. Band fitting of the mean CH-stretching spectra with the Gaussian-Lorentzian sum: (a) EV Acacia, (b) Nanovesicles Acacia on Ag/SiNWs. Thick black: mean spectrum; grey: fit; thin: bands I-V with fitted positions (cm⁻¹); top: residuals in % of the band height." title="Fig2c_PeakFit_CH_GL"/>
             <wp:cNvGraphicFramePr>
               <a:graphicFrameLocks xmlns:a="http://schemas.openxmlformats.org/drawingml/2006/main" noChangeAspect="1"/>
             </wp:cNvGraphicFramePr>
@@ -7184,6 +8219,68 @@
                   <pic:spPr bwMode="auto">
                     <a:xfrm>
                       <a:off x="0" y="0"/>
+                      <a:ext cx="5715000" cy="2905125"/>
+                    </a:xfrm>
+                    <a:prstGeom prst="rect">
+                      <a:avLst/>
+                    </a:prstGeom>
+                  </pic:spPr>
+                </pic:pic>
+              </a:graphicData>
+            </a:graphic>
+          </wp:inline>
+        </w:drawing>
+      </w:r>
+    </w:p>
+    <w:p>
+      <w:pPr>
+        <w:pStyle w:val="Caption"/>
+        <w:spacing w:after="240" w:before="60"/>
+      </w:pPr>
+      <w:r>
+        <w:rPr>
+          <w:b/>
+          <w:bCs/>
+        </w:rPr>
+        <w:t xml:space="preserve">Figure 2c.</w:t>
+      </w:r>
+      <w:r>
+        <w:t xml:space="preserve"> Band fitting of the mean CH-stretching spectra with the Gaussian-Lorentzian sum: (a) EV Acacia, (b) Nanovesicles Acacia on Ag/SiNWs. Thick black: mean spectrum; grey: fit; thin: bands I-V with fitted positions (cm⁻¹); top: residuals in % of the band height.</w:t>
+      </w:r>
+    </w:p>
+    <w:p>
+      <w:pPr>
+        <w:spacing w:before="120"/>
+        <w:jc w:val="center"/>
+      </w:pPr>
+      <w:r>
+        <w:drawing>
+          <wp:inline distT="0" distB="0" distL="0" distR="0">
+            <wp:extent cx="5715000" cy="3343275"/>
+            <wp:effectExtent t="0" r="0" b="0" l="0"/>
+            <wp:docPr id="1" name="FigS2_PeakFit_CH" descr="Figure S2. The same band fitting with Gaussian, Gaussian-Lorentzian sum and Lorentzian line shapes for EV Acacia (a-c) and Nanovesicles Acacia (d-f), showing that the conclusion on band II does not depend on the line shape." title="FigS2_PeakFit_CH"/>
+            <wp:cNvGraphicFramePr>
+              <a:graphicFrameLocks xmlns:a="http://schemas.openxmlformats.org/drawingml/2006/main" noChangeAspect="1"/>
+            </wp:cNvGraphicFramePr>
+            <a:graphic xmlns:a="http://schemas.openxmlformats.org/drawingml/2006/main">
+              <a:graphicData uri="http://schemas.openxmlformats.org/drawingml/2006/picture">
+                <pic:pic xmlns:pic="http://schemas.openxmlformats.org/drawingml/2006/picture">
+                  <pic:nvPicPr>
+                    <pic:cNvPr id="0" name="" descr=""/>
+                    <pic:cNvPicPr>
+                      <a:picLocks noChangeAspect="1" noChangeArrowheads="1"/>
+                    </pic:cNvPicPr>
+                  </pic:nvPicPr>
+                  <pic:blipFill>
+                    <a:blip r:embed="rId13" cstate="none"/>
+                    <a:srcRect/>
+                    <a:stretch>
+                      <a:fillRect/>
+                    </a:stretch>
+                  </pic:blipFill>
+                  <pic:spPr bwMode="auto">
+                    <a:xfrm>
+                      <a:off x="0" y="0"/>
                       <a:ext cx="5715000" cy="3343275"/>
                     </a:xfrm>
                     <a:prstGeom prst="rect">
@@ -7210,7 +8307,7 @@
         <w:t xml:space="preserve">Figure S2.</w:t>
       </w:r>
       <w:r>
-        <w:t xml:space="preserve"> Band fitting of the mean CH-stretching spectra of EV Acacia (a-c) and Nanovesicles Acacia (d-f) with Gaussian, Gaussian-Lorentzian sum and Lorentzian line shapes. Thick black: data; grey: fit; thin: bands I-V; top: residuals in % of the band height.</w:t>
+        <w:t xml:space="preserve"> The same band fitting with Gaussian, Gaussian-Lorentzian sum and Lorentzian line shapes for EV Acacia (a-c) and Nanovesicles Acacia (d-f), showing that the conclusion on band II does not depend on the line shape.</w:t>
       </w:r>
     </w:p>
     <w:p>
@@ -10483,7 +11580,7 @@
                     </pic:cNvPicPr>
                   </pic:nvPicPr>
                   <pic:blipFill>
-                    <a:blip r:embed="rId13" cstate="none"/>
+                    <a:blip r:embed="rId14" cstate="none"/>
                     <a:srcRect/>
                     <a:stretch>
                       <a:fillRect/>
@@ -10597,7 +11694,7 @@
                     </pic:cNvPicPr>
                   </pic:nvPicPr>
                   <pic:blipFill>
-                    <a:blip r:embed="rId14" cstate="none"/>
+                    <a:blip r:embed="rId15" cstate="none"/>
                     <a:srcRect/>
                     <a:stretch>
                       <a:fillRect/>
@@ -12531,7 +13628,7 @@
                     </pic:cNvPicPr>
                   </pic:nvPicPr>
                   <pic:blipFill>
-                    <a:blip r:embed="rId15" cstate="none"/>
+                    <a:blip r:embed="rId16" cstate="none"/>
                     <a:srcRect/>
                     <a:stretch>
                       <a:fillRect/>
@@ -12619,7 +13716,7 @@
                     </pic:cNvPicPr>
                   </pic:nvPicPr>
                   <pic:blipFill>
-                    <a:blip r:embed="rId16" cstate="none"/>
+                    <a:blip r:embed="rId17" cstate="none"/>
                     <a:srcRect/>
                     <a:stretch>
                       <a:fillRect/>
@@ -13599,6 +14696,64 @@
                 <w:sz w:val="18"/>
                 <w:szCs w:val="18"/>
               </w:rPr>
+              <w:t xml:space="preserve">Fig2c_PeakFit_CH_GL</w:t>
+            </w:r>
+          </w:p>
+        </w:tc>
+        <w:tc>
+          <w:tcPr>
+            <w:tcW w:type="dxa" w:w="5426"/>
+            <w:tcBorders>
+              <w:top w:val="single" w:color="BFBFBF" w:sz="4"/>
+              <w:left w:val="single" w:color="BFBFBF" w:sz="4"/>
+              <w:bottom w:val="single" w:color="BFBFBF" w:sz="4"/>
+              <w:right w:val="single" w:color="BFBFBF" w:sz="4"/>
+            </w:tcBorders>
+            <w:tcMar>
+              <w:top w:type="dxa" w:w="60"/>
+              <w:left w:type="dxa" w:w="100"/>
+              <w:bottom w:type="dxa" w:w="60"/>
+              <w:right w:type="dxa" w:w="100"/>
+            </w:tcMar>
+          </w:tcPr>
+          <w:p>
+            <w:r>
+              <w:rPr>
+                <w:b w:val="false"/>
+                <w:bCs w:val="false"/>
+                <w:sz w:val="18"/>
+                <w:szCs w:val="18"/>
+              </w:rPr>
+              <w:t xml:space="preserve">CH band fitting, Gaussian-Lorentzian sum (EV, NV)</w:t>
+            </w:r>
+          </w:p>
+        </w:tc>
+      </w:tr>
+      <w:tr>
+        <w:tc>
+          <w:tcPr>
+            <w:tcW w:type="dxa" w:w="3600"/>
+            <w:tcBorders>
+              <w:top w:val="single" w:color="BFBFBF" w:sz="4"/>
+              <w:left w:val="single" w:color="BFBFBF" w:sz="4"/>
+              <w:bottom w:val="single" w:color="BFBFBF" w:sz="4"/>
+              <w:right w:val="single" w:color="BFBFBF" w:sz="4"/>
+            </w:tcBorders>
+            <w:tcMar>
+              <w:top w:type="dxa" w:w="60"/>
+              <w:left w:type="dxa" w:w="100"/>
+              <w:bottom w:type="dxa" w:w="60"/>
+              <w:right w:type="dxa" w:w="100"/>
+            </w:tcMar>
+          </w:tcPr>
+          <w:p>
+            <w:r>
+              <w:rPr>
+                <w:b w:val="false"/>
+                <w:bCs w:val="false"/>
+                <w:sz w:val="18"/>
+                <w:szCs w:val="18"/>
+              </w:rPr>
               <w:t xml:space="preserve">FigS2_PeakFit_CH, TableS6_PeakFit_CH.csv</w:t>
             </w:r>
           </w:p>
@@ -13627,7 +14782,7 @@
                 <w:sz w:val="18"/>
                 <w:szCs w:val="18"/>
               </w:rPr>
-              <w:t xml:space="preserve">CH band fitting (3 line shapes) and fitted parameters</w:t>
+              <w:t xml:space="preserve">CH band fitting with 3 line shapes; fitted parameters, R2, AIC, BIC</w:t>
             </w:r>
           </w:p>
         </w:tc>

</xml_diff>

<commit_message>
Fig 2b: label the CH2 lipid shoulder in both EVs (2874 cm-1, weak) and NVs (2883 cm-1); report text updated
Co-Authored-By: Claude Opus 5.5 <noreply@anthropic.com>
Claude-Session: https://claude.ai/code/session_01L8hQ8e5u5KmaH4dD9snyRw
</commit_message>
<xml_diff>
--- a/Acacia_Analysis_Report.docx
+++ b/Acacia_Analysis_Report.docx
@@ -1045,9 +1045,9 @@
       <w:r>
         <w:drawing>
           <wp:inline distT="0" distB="0" distL="0" distR="0">
-            <wp:extent cx="4381500" cy="4048125"/>
+            <wp:extent cx="5715000" cy="5276850"/>
             <wp:effectExtent t="0" r="0" b="0" l="0"/>
-            <wp:docPr id="1" name="Fig2b_MeanSD_CH" descr="Figure 2b. Mean ± SD spectra in the CH-stretching region, 2760-3095 cm⁻¹. Main CH₃ band: 2933 (EVs) vs 2937 cm⁻¹ (NVs), shift consistent at all sites (grey shadow). The CH₂ lipid band at 2883 cm⁻¹ (shoulder, located by the second derivative) is labelled for NVs only, where it is a distinct band." title="Fig2b_MeanSD_CH"/>
+            <wp:docPr id="1" name="Fig2b_MeanSD_CH" descr="Figure 2b. Mean ± SD spectra in the CH-stretching region, 2760-3095 cm⁻¹. CH₂ lipid shoulder (located by the second derivative): 2874 cm⁻¹ (EVs, weak) and 2883 cm⁻¹ (NVs, stronger); main CH₃ band: 2933 vs 2937 cm⁻¹. Grey shadows: shifts consistent at all sites." title="Fig2b_MeanSD_CH"/>
             <wp:cNvGraphicFramePr>
               <a:graphicFrameLocks xmlns:a="http://schemas.openxmlformats.org/drawingml/2006/main" noChangeAspect="1"/>
             </wp:cNvGraphicFramePr>
@@ -1070,7 +1070,7 @@
                   <pic:spPr bwMode="auto">
                     <a:xfrm>
                       <a:off x="0" y="0"/>
-                      <a:ext cx="4381500" cy="4048125"/>
+                      <a:ext cx="5715000" cy="5276850"/>
                     </a:xfrm>
                     <a:prstGeom prst="rect">
                       <a:avLst/>
@@ -1096,7 +1096,7 @@
         <w:t xml:space="preserve">Figure 2b.</w:t>
       </w:r>
       <w:r>
-        <w:t xml:space="preserve"> Mean ± SD spectra in the CH-stretching region, 2760-3095 cm⁻¹. Main CH₃ band: 2933 (EVs) vs 2937 cm⁻¹ (NVs), shift consistent at all sites (grey shadow). The CH₂ lipid band at 2883 cm⁻¹ (shoulder, located by the second derivative) is labelled for NVs only, where it is a distinct band.</w:t>
+        <w:t xml:space="preserve"> Mean ± SD spectra in the CH-stretching region, 2760-3095 cm⁻¹. CH₂ lipid shoulder (located by the second derivative): 2874 cm⁻¹ (EVs, weak) and 2883 cm⁻¹ (NVs, stronger); main CH₃ band: 2933 vs 2937 cm⁻¹. Grey shadows: shifts consistent at all sites.</w:t>
       </w:r>
     </w:p>
     <w:p>
@@ -1104,7 +1104,7 @@
         <w:spacing w:after="120"/>
       </w:pPr>
       <w:r>
-        <w:t xml:space="preserve">The CH₂ band at about 2883 cm⁻¹ is a distinct shoulder in the NV spectrum and is therefore labelled only for NVs. In EVs this region shows only a weak, unresolved wing (second-derivative inflection at 2874 cm⁻¹); see the band fitting in section 4.4.</w:t>
+        <w:t xml:space="preserve">The CH₂ band (CH₂ asymmetric stretching, lipids) is present in both groups: the second derivative locates it in the mean spectrum and in every one of the 6 sites of each group (EVs 2871-2879, NVs 2880-2885 cm⁻¹). It is a weak shoulder at 2874 cm⁻¹ in EVs and a stronger shoulder at 2883 cm⁻¹ in NVs; the 9 cm⁻¹ shift is consistent at all sites (grey shadow), and the band is significantly stronger in NVs (Table S1, 2880 cm⁻¹ band, corrected p = 3.8 × 10⁻⁶).</w:t>
       </w:r>
     </w:p>
     <w:p>
@@ -8183,7 +8183,7 @@
         <w:t xml:space="preserve">Result.</w:t>
       </w:r>
       <w:r>
-        <w:t xml:space="preserve"> In NVs, band II is a well-defined band at 2884-2886 cm⁻¹ with a width of 34-43 cm⁻¹ in all three fits (GL: 2886 cm⁻¹, 22.5 % of the CH band area). In EVs, the fit also needs some intensity between 2870 and 2890 cm⁻¹, but only as a very broad component whose width runs to the upper limit (60 cm⁻¹) for every line shape, i.e. a weak, unresolved wing of the main band rather than a distinct band. This supports labelling the 2883 cm⁻¹ band for NVs only; in the text it should be described as “a distinct CH₂ band in NVs, only a weak unresolved shoulder in EVs”, not as completely absent in EVs.</w:t>
+        <w:t xml:space="preserve"> In NVs, band II is a well-defined band at 2884-2886 cm⁻¹ with a width of 34-43 cm⁻¹ in all three fits (GL: 2886 cm⁻¹, 22.5 % of the CH band area). In EVs the fit also needs intensity at 2875-2887 cm⁻¹, but the five-band model cannot separate this weak shoulder from the main band, so it is absorbed into a broad component (width at the 60 cm⁻¹ limit). The second-derivative analysis, which is more sensitive to weak shoulders, does resolve it in EVs (2874 cm⁻¹, all 6 sites). Conclusion: the CH₂ band is present in both, weak in EVs and clearly stronger, sharper and shifted to higher wavenumber in NVs.</w:t>
       </w:r>
     </w:p>
     <w:p>

</xml_diff>